<commit_message>
RD v2: retira del texto el antecedente del rechazo de la CAF
Es un asunto aparte, que las contrapartes dominicanas no conocen. La sección
de financiamiento conserva sólo lo que importa para el diseño: qué tipo de
resultados puede acompañar la CAF.

Co-Authored-By: Claude Opus 5 <noreply@anthropic.com>
</commit_message>
<xml_diff>
--- a/republica-dominicana/propuesta-proyecto-AP/Propuesta-v2-piloto-AP-RD-2027-2030.docx
+++ b/republica-dominicana/propuesta-proyecto-AP/Propuesta-v2-piloto-AP-RD-2027-2030.docx
@@ -2010,49 +2010,7 @@
         <w:pStyle w:val="BodyText"/>
       </w:pPr>
       <w:r>
-        <w:t xml:space="preserve">En octubre de 2025 se presentó a la CAF una propuesta regional que no prosperó. Las razones fueron explícitas y siguen siendo la guía: el proyecto era</w:t>
-      </w:r>
-      <w:r>
-        <w:t xml:space="preserve"> </w:t>
-      </w:r>
-      <w:r>
-        <w:rPr>
-          <w:b/>
-          <w:bCs/>
-        </w:rPr>
-        <w:t xml:space="preserve">demasiado abarcativo</w:t>
-      </w:r>
-      <w:r>
-        <w:t xml:space="preserve">, el monto</w:t>
-      </w:r>
-      <w:r>
-        <w:t xml:space="preserve"> </w:t>
-      </w:r>
-      <w:r>
-        <w:rPr>
-          <w:b/>
-          <w:bCs/>
-        </w:rPr>
-        <w:t xml:space="preserve">considerable</w:t>
-      </w:r>
-      <w:r>
-        <w:t xml:space="preserve"> </w:t>
-      </w:r>
-      <w:r>
-        <w:t xml:space="preserve">(USD 938.420), y</w:t>
-      </w:r>
-      <w:r>
-        <w:t xml:space="preserve"> </w:t>
-      </w:r>
-      <w:r>
-        <w:rPr>
-          <w:b/>
-          <w:bCs/>
-        </w:rPr>
-        <w:t xml:space="preserve">mezclaba actividades de naturaleza dispar en varios países</w:t>
-      </w:r>
-      <w:r>
-        <w:t xml:space="preserve">. Además, la CAF financia principalmente a</w:t>
+        <w:t xml:space="preserve">La CAF financia principalmente a</w:t>
       </w:r>
       <w:r>
         <w:t xml:space="preserve"> </w:t>
@@ -2068,7 +2026,7 @@
         <w:t xml:space="preserve"> </w:t>
       </w:r>
       <w:r>
-        <w:t xml:space="preserve">de sus países miembro mediante créditos y cooperaciones técnicas; con sociedad civil hace colaboraciones puntuales, orientadas a</w:t>
+        <w:t xml:space="preserve">de sus países miembro, mediante créditos y cooperaciones técnicas; con organizaciones de la sociedad civil realiza colaboraciones puntuales, orientadas sobre todo a</w:t>
       </w:r>
       <w:r>
         <w:t xml:space="preserve"> </w:t>
@@ -2089,23 +2047,7 @@
         <w:pStyle w:val="BodyText"/>
       </w:pPr>
       <w:r>
-        <w:t xml:space="preserve">Esta versión responde a lo primero:</w:t>
-      </w:r>
-      <w:r>
-        <w:t xml:space="preserve"> </w:t>
-      </w:r>
-      <w:r>
-        <w:rPr>
-          <w:b/>
-          <w:bCs/>
-        </w:rPr>
-        <w:t xml:space="preserve">un país, un ciclo, un periodo acotado.</w:t>
-      </w:r>
-      <w:r>
-        <w:t xml:space="preserve"> </w:t>
-      </w:r>
-      <w:r>
-        <w:t xml:space="preserve">Y para lo segundo, el proyecto tiene contraparte pública (CONADIS, Ministerio de la Mujer) y produce exactamente el tipo de resultado que la CAF sí puede acompañar:</w:t>
+        <w:t xml:space="preserve">Este proyecto encaja bien con eso: tiene contraparte pública (CONADIS, Ministerio de la Mujer) y produce exactamente ese tipo de resultado.</w:t>
       </w:r>
     </w:p>
     <w:p>
@@ -2197,7 +2139,7 @@
         <w:pStyle w:val="FirstParagraph"/>
       </w:pPr>
       <w:r>
-        <w:t xml:space="preserve">La conversación con la CAF se retoma sobre esa base, y sin prisa. Stefan Trömel e Iñaki Regueiro no son destinatarios externos — están dentro del círculo.</w:t>
+        <w:t xml:space="preserve">Sobre esa base se retoma la conversación, y sin prisa. Stefan Trömel e Iñaki Regueiro no son destinatarios externos — están dentro del círculo.</w:t>
       </w:r>
     </w:p>
     <w:p>

</xml_diff>

<commit_message>
RD v2: el arranque es en espacio facilitado por CONADIS; la sede propia es el objetivo a 2030
No se propone prescindir de oficina: el sistema de coordinación es el medio
para arrancar antes de tenerla. El objetivo del piloto es poner en marcha la
formación junto con CONADIS e INFOTEP y ver cómo funciona.

Co-Authored-By: Claude Opus 5 <noreply@anthropic.com>
</commit_message>
<xml_diff>
--- a/republica-dominicana/propuesta-proyecto-AP/Propuesta-v2-piloto-AP-RD-2027-2030.docx
+++ b/republica-dominicana/propuesta-proyecto-AP/Propuesta-v2-piloto-AP-RD-2027-2030.docx
@@ -255,7 +255,23 @@
         <w:t xml:space="preserve">establecida como sistema en la República Dominicana</w:t>
       </w:r>
       <w:r>
-        <w:t xml:space="preserve">.</w:t>
+        <w:t xml:space="preserve">, con</w:t>
+      </w:r>
+      <w:r>
+        <w:t xml:space="preserve"> </w:t>
+      </w:r>
+      <w:r>
+        <w:rPr>
+          <w:b/>
+          <w:bCs/>
+        </w:rPr>
+        <w:t xml:space="preserve">un centro con sede propia</w:t>
+      </w:r>
+      <w:r>
+        <w:t xml:space="preserve"> </w:t>
+      </w:r>
+      <w:r>
+        <w:t xml:space="preserve">en funcionamiento.</w:t>
       </w:r>
     </w:p>
     <w:p>
@@ -440,6 +456,19 @@
       </w:r>
       <w:r>
         <w:t xml:space="preserve">: espacio de encuentro, refugio cuando hace falta, y lugar de cuidado entre pares.</w:t>
+      </w:r>
+      <w:r>
+        <w:t xml:space="preserve"> </w:t>
+      </w:r>
+      <w:r>
+        <w:rPr>
+          <w:b/>
+          <w:bCs/>
+        </w:rPr>
+        <w:t xml:space="preserve">Es el horizonte a 2030</w:t>
+      </w:r>
+      <w:r>
+        <w:t xml:space="preserve">: el proyecto empieza en un espacio facilitado por el CONADIS y avanza hacia una sede propia (§9).</w:t>
       </w:r>
     </w:p>
     <w:p>
@@ -1556,13 +1585,13 @@
       </w:r>
     </w:p>
     <w:bookmarkEnd w:id="16"/>
-    <w:bookmarkStart w:id="17" w:name="Xec487b555f655a3b76edadf2e5c6e4b5af9e9ad"/>
+    <w:bookmarkStart w:id="17" w:name="Xef732971e381e0846133eb8f2d28db8d757f22c"/>
     <w:p>
       <w:pPr>
         <w:pStyle w:val="Heading2"/>
       </w:pPr>
       <w:r>
-        <w:t xml:space="preserve">9. El sistema de coordinación de Morpho</w:t>
+        <w:t xml:space="preserve">9. Dónde empieza — y el sistema de coordinación</w:t>
       </w:r>
     </w:p>
     <w:p>
@@ -1570,20 +1599,27 @@
         <w:pStyle w:val="FirstParagraph"/>
       </w:pPr>
       <w:r>
-        <w:t xml:space="preserve">Se adopta</w:t>
-      </w:r>
-      <w:r>
-        <w:t xml:space="preserve"> </w:t>
-      </w:r>
-      <w:r>
-        <w:rPr>
-          <w:b/>
-          <w:bCs/>
-        </w:rPr>
-        <w:t xml:space="preserve">el sistema de coordinación que Morpho opera por internet</w:t>
-      </w:r>
-      <w:r>
-        <w:t xml:space="preserve">.</w:t>
+        <w:rPr>
+          <w:b/>
+          <w:bCs/>
+        </w:rPr>
+        <w:t xml:space="preserve">El proyecto no arranca abriendo una sede.</w:t>
+      </w:r>
+      <w:r>
+        <w:t xml:space="preserve"> </w:t>
+      </w:r>
+      <w:r>
+        <w:t xml:space="preserve">Lo que se busca primero es</w:t>
+      </w:r>
+      <w:r>
+        <w:t xml:space="preserve"> </w:t>
+      </w:r>
+      <w:r>
+        <w:rPr>
+          <w:b/>
+          <w:bCs/>
+        </w:rPr>
+        <w:t xml:space="preserve">poner en marcha la formación de asistentes personales junto con la organización de personas con discapacidad, el CONADIS y el INFOTEP, y ver cómo funciona.</w:t>
       </w:r>
     </w:p>
     <w:p>
@@ -1599,39 +1635,13 @@
           <w:b/>
           <w:bCs/>
         </w:rPr>
-        <w:t xml:space="preserve">Ya está probado en Costa Rica</w:t>
-      </w:r>
-      <w:r>
-        <w:t xml:space="preserve">, en centros de vida independiente de provincia</w:t>
-      </w:r>
-      <w:r>
-        <w:t xml:space="preserve"> </w:t>
-      </w:r>
-      <w:r>
-        <w:rPr>
-          <w:b/>
-          <w:bCs/>
-        </w:rPr>
-        <w:t xml:space="preserve">que no tienen oficina</w:t>
-      </w:r>
-      <w:r>
-        <w:t xml:space="preserve">: permite coordinar</w:t>
-      </w:r>
-      <w:r>
-        <w:t xml:space="preserve"> </w:t>
-      </w:r>
-      <w:r>
-        <w:rPr>
-          <w:b/>
-          <w:bCs/>
-        </w:rPr>
-        <w:t xml:space="preserve">a distancia</w:t>
-      </w:r>
-      <w:r>
-        <w:t xml:space="preserve"> </w:t>
-      </w:r>
-      <w:r>
-        <w:t xml:space="preserve">entre asistentes personales y personas usuarias dispersos en el territorio.</w:t>
+        <w:t xml:space="preserve">Al inicio, el CONADIS facilita el espacio.</w:t>
+      </w:r>
+      <w:r>
+        <w:t xml:space="preserve"> </w:t>
+      </w:r>
+      <w:r>
+        <w:t xml:space="preserve">Se empieza ahí.</w:t>
       </w:r>
     </w:p>
     <w:p>
@@ -1643,411 +1653,47 @@
         </w:numPr>
       </w:pPr>
       <w:r>
-        <w:t xml:space="preserve">Por eso el piloto</w:t>
-      </w:r>
-      <w:r>
-        <w:t xml:space="preserve"> </w:t>
-      </w:r>
-      <w:r>
-        <w:rPr>
-          <w:b/>
-          <w:bCs/>
-        </w:rPr>
-        <w:t xml:space="preserve">puede llegar a las provincias sin abrir sedes</w:t>
-      </w:r>
-      <w:r>
-        <w:t xml:space="preserve">: el centro es uno, en la capital; la coordinación llega por el sistema.</w:t>
-      </w:r>
-    </w:p>
-    <w:p>
-      <w:pPr>
-        <w:pStyle w:val="Compact"/>
-        <w:numPr>
-          <w:ilvl w:val="0"/>
-          <w:numId w:val="1008"/>
-        </w:numPr>
-      </w:pPr>
-      <w:r>
-        <w:t xml:space="preserve">Los registros de despacho quedan almacenados desde el primer día →</w:t>
-      </w:r>
-      <w:r>
-        <w:t xml:space="preserve"> </w:t>
-      </w:r>
-      <w:r>
-        <w:rPr>
-          <w:b/>
-          <w:bCs/>
-        </w:rPr>
-        <w:t xml:space="preserve">es la base de datos de la evaluación de 2028.</w:t>
-      </w:r>
-    </w:p>
-    <w:p>
-      <w:pPr>
-        <w:pStyle w:val="Compact"/>
-        <w:numPr>
-          <w:ilvl w:val="0"/>
-          <w:numId w:val="1008"/>
-        </w:numPr>
-      </w:pPr>
-      <w:r>
-        <w:rPr>
-          <w:b/>
-          <w:bCs/>
-        </w:rPr>
-        <w:t xml:space="preserve">Y hay un retorno hacia Costa Rica:</w:t>
-      </w:r>
-      <w:r>
-        <w:t xml:space="preserve"> </w:t>
-      </w:r>
-      <w:r>
-        <w:t xml:space="preserve">al adoptarse en la República Dominicana,</w:t>
-      </w:r>
-      <w:r>
-        <w:t xml:space="preserve"> </w:t>
-      </w:r>
-      <w:r>
-        <w:rPr>
-          <w:b/>
-          <w:bCs/>
-        </w:rPr>
-        <w:t xml:space="preserve">Morpho recibe un ingreso</w:t>
-      </w:r>
-      <w:r>
-        <w:t xml:space="preserve">. Es, aunque modesto, actividad económica propia de Morpho y contribuye a su</w:t>
-      </w:r>
-      <w:r>
-        <w:t xml:space="preserve"> </w:t>
-      </w:r>
-      <w:r>
-        <w:rPr>
-          <w:b/>
-          <w:bCs/>
-        </w:rPr>
-        <w:t xml:space="preserve">sostenibilidad</w:t>
+        <w:rPr>
+          <w:b/>
+          <w:bCs/>
+        </w:rPr>
+        <w:t xml:space="preserve">Abrir la sede propia del centro es el objetivo a 2030</w:t>
+      </w:r>
+      <w:r>
+        <w:t xml:space="preserve">, no el punto de partida. Llega cuando el ciclo esté funcionando y haya con qué sostenerla.</w:t>
+      </w:r>
+    </w:p>
+    <w:p>
+      <w:pPr>
+        <w:pStyle w:val="FirstParagraph"/>
+      </w:pPr>
+      <w:r>
+        <w:rPr>
+          <w:b/>
+          <w:bCs/>
+        </w:rPr>
+        <w:t xml:space="preserve">El sistema de coordinación</w:t>
+      </w:r>
+    </w:p>
+    <w:p>
+      <w:pPr>
+        <w:pStyle w:val="BodyText"/>
+      </w:pPr>
+      <w:r>
+        <w:t xml:space="preserve">Para esa etapa inicial se adopta</w:t>
+      </w:r>
+      <w:r>
+        <w:t xml:space="preserve"> </w:t>
+      </w:r>
+      <w:r>
+        <w:rPr>
+          <w:b/>
+          <w:bCs/>
+        </w:rPr>
+        <w:t xml:space="preserve">el sistema que Morpho opera por internet</w:t>
       </w:r>
       <w:r>
         <w:t xml:space="preserve">.</w:t>
-      </w:r>
-    </w:p>
-    <w:p>
-      <w:pPr>
-        <w:pStyle w:val="FirstParagraph"/>
-      </w:pPr>
-      <w:r>
-        <w:rPr>
-          <w:b/>
-          <w:bCs/>
-        </w:rPr>
-        <w:t xml:space="preserve">Costo de uso: [x — por confirmar con Morpho]</w:t>
-      </w:r>
-    </w:p>
-    <w:p>
-      <w:r>
-        <w:pict>
-          <v:rect style="width:0;height:1.5pt" o:hralign="center" o:hrstd="t" o:hr="t"/>
-        </w:pict>
-      </w:r>
-    </w:p>
-    <w:bookmarkEnd w:id="17"/>
-    <w:bookmarkStart w:id="18" w:name="Xe9ed06b37cd8a4e7b1e8dfb60083bf04edc4964"/>
-    <w:p>
-      <w:pPr>
-        <w:pStyle w:val="Heading2"/>
-      </w:pPr>
-      <w:r>
-        <w:t xml:space="preserve">10. Presupuesto — el criterio</w:t>
-      </w:r>
-    </w:p>
-    <w:p>
-      <w:pPr>
-        <w:pStyle w:val="FirstParagraph"/>
-      </w:pPr>
-      <w:r>
-        <w:rPr>
-          <w:b/>
-          <w:bCs/>
-        </w:rPr>
-        <w:t xml:space="preserve">La mayor parte del presupuesto es el pago de la asistencia personal. [x — tarifa y monto por acordar]</w:t>
-      </w:r>
-    </w:p>
-    <w:p>
-      <w:pPr>
-        <w:pStyle w:val="BodyText"/>
-      </w:pPr>
-      <w:r>
-        <w:t xml:space="preserve">El criterio de diseño es uno:</w:t>
-      </w:r>
-      <w:r>
-        <w:t xml:space="preserve"> </w:t>
-      </w:r>
-      <w:r>
-        <w:rPr>
-          <w:b/>
-          <w:bCs/>
-        </w:rPr>
-        <w:t xml:space="preserve">que el dinero empiece a circular en el terreno lo antes posible.</w:t>
-      </w:r>
-      <w:r>
-        <w:t xml:space="preserve"> </w:t>
-      </w:r>
-      <w:r>
-        <w:t xml:space="preserve">No esperar a que el sistema nacional esté listo — pagar y echar a andar, y que la experiencia sirva después para que el Estado lo asuma.</w:t>
-      </w:r>
-    </w:p>
-    <w:p>
-      <w:pPr>
-        <w:pStyle w:val="BodyText"/>
-      </w:pPr>
-      <w:r>
-        <w:t xml:space="preserve">Es el camino que siguió Morpho: en 2013, antes de la Ley 9379, sostenía la vida independiente de 6 personas usuarias con unos 10 asistentes personales — 919 horas en agosto de ese año, con</w:t>
-      </w:r>
-      <w:r>
-        <w:t xml:space="preserve"> </w:t>
-      </w:r>
-      <w:r>
-        <w:rPr>
-          <w:b/>
-          <w:bCs/>
-        </w:rPr>
-        <w:t xml:space="preserve">22% aportado por el Estado y 78% por el proyecto</w:t>
-      </w:r>
-      <w:r>
-        <w:t xml:space="preserve">. Tras la entrada en vigor de la ley en 2019,</w:t>
-      </w:r>
-      <w:r>
-        <w:t xml:space="preserve"> </w:t>
-      </w:r>
-      <w:r>
-        <w:rPr>
-          <w:b/>
-          <w:bCs/>
-        </w:rPr>
-        <w:t xml:space="preserve">el Estado asumió prácticamente el 100% y la carga del proyecto bajó a cero.</w:t>
-      </w:r>
-    </w:p>
-    <w:p>
-      <w:pPr>
-        <w:pStyle w:val="BodyText"/>
-      </w:pPr>
-      <w:r>
-        <w:rPr>
-          <w:b/>
-          <w:bCs/>
-        </w:rPr>
-        <w:t xml:space="preserve">Para que el centro se sostenga</w:t>
-      </w:r>
-      <w:r>
-        <w:t xml:space="preserve">, hace falta además el planteamiento trabajado con la OIT:</w:t>
-      </w:r>
-      <w:r>
-        <w:t xml:space="preserve"> </w:t>
-      </w:r>
-      <w:r>
-        <w:rPr>
-          <w:b/>
-          <w:bCs/>
-        </w:rPr>
-        <w:t xml:space="preserve">el centro como lugar de trabajo para personas con discapacidad</w:t>
-      </w:r>
-      <w:r>
-        <w:t xml:space="preserve">. JICA no puede cubrir esa parte.</w:t>
-      </w:r>
-    </w:p>
-    <w:p>
-      <w:pPr>
-        <w:pStyle w:val="BodyText"/>
-      </w:pPr>
-      <w:r>
-        <w:t xml:space="preserve">Partidas: pago de asistencia personal (mayoritaria) · capacitación en Costa Rica · sistema de coordinación · operación del centro · evaluación y viajes</w:t>
-      </w:r>
-      <w:r>
-        <w:t xml:space="preserve"> </w:t>
-      </w:r>
-      <w:r>
-        <w:rPr>
-          <w:b/>
-          <w:bCs/>
-        </w:rPr>
-        <w:t xml:space="preserve">[x]</w:t>
-      </w:r>
-    </w:p>
-    <w:p>
-      <w:r>
-        <w:pict>
-          <v:rect style="width:0;height:1.5pt" o:hralign="center" o:hrstd="t" o:hr="t"/>
-        </w:pict>
-      </w:r>
-    </w:p>
-    <w:bookmarkEnd w:id="18"/>
-    <w:bookmarkStart w:id="19" w:name="Xe76011752e37cf528c9d59fbd93aa710a8e7fed"/>
-    <w:p>
-      <w:pPr>
-        <w:pStyle w:val="Heading2"/>
-      </w:pPr>
-      <w:r>
-        <w:t xml:space="preserve">11. Financiamiento</w:t>
-      </w:r>
-    </w:p>
-    <w:p>
-      <w:pPr>
-        <w:pStyle w:val="FirstParagraph"/>
-      </w:pPr>
-      <w:r>
-        <w:rPr>
-          <w:b/>
-          <w:bCs/>
-        </w:rPr>
-        <w:t xml:space="preserve">El orden importa: primero el país, después la banca.</w:t>
-      </w:r>
-    </w:p>
-    <w:p>
-      <w:pPr>
-        <w:pStyle w:val="BodyText"/>
-      </w:pPr>
-      <w:r>
-        <w:t xml:space="preserve">Explicar el proyecto como sistema es difícil.</w:t>
-      </w:r>
-      <w:r>
-        <w:t xml:space="preserve"> </w:t>
-      </w:r>
-      <w:r>
-        <w:rPr>
-          <w:b/>
-          <w:bCs/>
-        </w:rPr>
-        <w:t xml:space="preserve">Primero queremos tener claro el conjunto y conversarlo con las contrapartes dominicanas</w:t>
-      </w:r>
-      <w:r>
-        <w:t xml:space="preserve">; la argumentación ante la banca de desarrollo viene después.</w:t>
-      </w:r>
-    </w:p>
-    <w:p>
-      <w:pPr>
-        <w:pStyle w:val="BodyText"/>
-      </w:pPr>
-      <w:r>
-        <w:rPr>
-          <w:b/>
-          <w:bCs/>
-        </w:rPr>
-        <w:t xml:space="preserve">Punto de partida: CONADIS.</w:t>
-      </w:r>
-    </w:p>
-    <w:p>
-      <w:pPr>
-        <w:pStyle w:val="BodyText"/>
-      </w:pPr>
-      <w:r>
-        <w:t xml:space="preserve">La propuesta se plantea desde el CONADIS, y a partir de ahí se conversa</w:t>
-      </w:r>
-      <w:r>
-        <w:t xml:space="preserve"> </w:t>
-      </w:r>
-      <w:r>
-        <w:rPr>
-          <w:b/>
-          <w:bCs/>
-        </w:rPr>
-        <w:t xml:space="preserve">cuánto de esto puede cubrirse con recursos nacionales</w:t>
-      </w:r>
-      <w:r>
-        <w:t xml:space="preserve"> </w:t>
-      </w:r>
-      <w:r>
-        <w:t xml:space="preserve">— FONADIS (fondo designado a vida independiente), Supérate / Comunidades de Cuidado, Ministerio de la Mujer. El presupuesto se presenta completo, y la proporción entre aporte nacional y financiamiento externo se define en esa conversación, no antes.</w:t>
-      </w:r>
-    </w:p>
-    <w:p>
-      <w:pPr>
-        <w:pStyle w:val="BodyText"/>
-      </w:pPr>
-      <w:r>
-        <w:rPr>
-          <w:b/>
-          <w:bCs/>
-        </w:rPr>
-        <w:t xml:space="preserve">JICA (proyecto previsto desde 2027)</w:t>
-      </w:r>
-    </w:p>
-    <w:p>
-      <w:pPr>
-        <w:pStyle w:val="BodyText"/>
-      </w:pPr>
-      <w:r>
-        <w:t xml:space="preserve">No se trata de que un actor apoye al otro:</w:t>
-      </w:r>
-      <w:r>
-        <w:t xml:space="preserve"> </w:t>
-      </w:r>
-      <w:r>
-        <w:rPr>
-          <w:b/>
-          <w:bCs/>
-        </w:rPr>
-        <w:t xml:space="preserve">son de naturaleza distinta y por eso se potencian.</w:t>
-      </w:r>
-      <w:r>
-        <w:t xml:space="preserve"> </w:t>
-      </w:r>
-      <w:r>
-        <w:t xml:space="preserve">Conocemos bien lo que JICA no puede hacer, y la intención es complementarlo. Se irá conversando según avance.</w:t>
-      </w:r>
-    </w:p>
-    <w:p>
-      <w:pPr>
-        <w:pStyle w:val="BodyText"/>
-      </w:pPr>
-      <w:r>
-        <w:rPr>
-          <w:b/>
-          <w:bCs/>
-        </w:rPr>
-        <w:t xml:space="preserve">CAF</w:t>
-      </w:r>
-    </w:p>
-    <w:p>
-      <w:pPr>
-        <w:pStyle w:val="BodyText"/>
-      </w:pPr>
-      <w:r>
-        <w:t xml:space="preserve">La CAF financia principalmente a</w:t>
-      </w:r>
-      <w:r>
-        <w:t xml:space="preserve"> </w:t>
-      </w:r>
-      <w:r>
-        <w:rPr>
-          <w:b/>
-          <w:bCs/>
-        </w:rPr>
-        <w:t xml:space="preserve">gobiernos</w:t>
-      </w:r>
-      <w:r>
-        <w:t xml:space="preserve"> </w:t>
-      </w:r>
-      <w:r>
-        <w:t xml:space="preserve">de sus países miembro, mediante créditos y cooperaciones técnicas; con organizaciones de la sociedad civil realiza colaboraciones puntuales, orientadas sobre todo a</w:t>
-      </w:r>
-      <w:r>
-        <w:t xml:space="preserve"> </w:t>
-      </w:r>
-      <w:r>
-        <w:rPr>
-          <w:b/>
-          <w:bCs/>
-        </w:rPr>
-        <w:t xml:space="preserve">estudios, productos de conocimiento, jornadas y consultas</w:t>
-      </w:r>
-      <w:r>
-        <w:t xml:space="preserve">.</w:t>
-      </w:r>
-    </w:p>
-    <w:p>
-      <w:pPr>
-        <w:pStyle w:val="BodyText"/>
-      </w:pPr>
-      <w:r>
-        <w:t xml:space="preserve">Este proyecto encaja bien con eso: tiene contraparte pública (CONADIS, Ministerio de la Mujer) y produce exactamente ese tipo de resultado.</w:t>
       </w:r>
     </w:p>
     <w:p>
@@ -2059,23 +1705,36 @@
         </w:numPr>
       </w:pPr>
       <w:r>
-        <w:t xml:space="preserve">el</w:t>
-      </w:r>
-      <w:r>
-        <w:t xml:space="preserve"> </w:t>
-      </w:r>
-      <w:r>
-        <w:rPr>
-          <w:b/>
-          <w:bCs/>
-        </w:rPr>
-        <w:t xml:space="preserve">programa de formación de asistentes personales</w:t>
-      </w:r>
-      <w:r>
-        <w:t xml:space="preserve"> </w:t>
-      </w:r>
-      <w:r>
-        <w:t xml:space="preserve">sistematizado a partir de Morpho (§8) — un producto de conocimiento transferible a toda la región;</w:t>
+        <w:t xml:space="preserve">Ya está probado en Costa Rica,</w:t>
+      </w:r>
+      <w:r>
+        <w:t xml:space="preserve"> </w:t>
+      </w:r>
+      <w:r>
+        <w:rPr>
+          <w:b/>
+          <w:bCs/>
+        </w:rPr>
+        <w:t xml:space="preserve">en centros de vida independiente de provincia que aún no tienen oficina</w:t>
+      </w:r>
+      <w:r>
+        <w:t xml:space="preserve">: permite coordinar</w:t>
+      </w:r>
+      <w:r>
+        <w:t xml:space="preserve"> </w:t>
+      </w:r>
+      <w:r>
+        <w:rPr>
+          <w:b/>
+          <w:bCs/>
+        </w:rPr>
+        <w:t xml:space="preserve">a distancia</w:t>
+      </w:r>
+      <w:r>
+        <w:t xml:space="preserve"> </w:t>
+      </w:r>
+      <w:r>
+        <w:t xml:space="preserve">entre asistentes personales y personas usuarias dispersos en el territorio.</w:t>
       </w:r>
     </w:p>
     <w:p>
@@ -2087,23 +1746,20 @@
         </w:numPr>
       </w:pPr>
       <w:r>
-        <w:t xml:space="preserve">la</w:t>
-      </w:r>
-      <w:r>
-        <w:t xml:space="preserve"> </w:t>
-      </w:r>
-      <w:r>
-        <w:rPr>
-          <w:b/>
-          <w:bCs/>
-        </w:rPr>
-        <w:t xml:space="preserve">capacitación en Costa Rica</w:t>
-      </w:r>
-      <w:r>
-        <w:t xml:space="preserve"> </w:t>
-      </w:r>
-      <w:r>
-        <w:t xml:space="preserve">(§7) — jornada y consulta entre instituciones de dos países;</w:t>
+        <w:t xml:space="preserve">Eso hace posible</w:t>
+      </w:r>
+      <w:r>
+        <w:t xml:space="preserve"> </w:t>
+      </w:r>
+      <w:r>
+        <w:rPr>
+          <w:b/>
+          <w:bCs/>
+        </w:rPr>
+        <w:t xml:space="preserve">llegar a las provincias desde el comienzo</w:t>
+      </w:r>
+      <w:r>
+        <w:t xml:space="preserve">, sin esperar a tener infraestructura.</w:t>
       </w:r>
     </w:p>
     <w:p>
@@ -2112,6 +1768,446 @@
         <w:numPr>
           <w:ilvl w:val="0"/>
           <w:numId w:val="1009"/>
+        </w:numPr>
+      </w:pPr>
+      <w:r>
+        <w:t xml:space="preserve">Los registros de despacho quedan almacenados desde el primer día →</w:t>
+      </w:r>
+      <w:r>
+        <w:t xml:space="preserve"> </w:t>
+      </w:r>
+      <w:r>
+        <w:rPr>
+          <w:b/>
+          <w:bCs/>
+        </w:rPr>
+        <w:t xml:space="preserve">es la base de datos de la evaluación de 2028.</w:t>
+      </w:r>
+    </w:p>
+    <w:p>
+      <w:pPr>
+        <w:pStyle w:val="Compact"/>
+        <w:numPr>
+          <w:ilvl w:val="0"/>
+          <w:numId w:val="1009"/>
+        </w:numPr>
+      </w:pPr>
+      <w:r>
+        <w:rPr>
+          <w:b/>
+          <w:bCs/>
+        </w:rPr>
+        <w:t xml:space="preserve">Y hay un retorno hacia Costa Rica:</w:t>
+      </w:r>
+      <w:r>
+        <w:t xml:space="preserve"> </w:t>
+      </w:r>
+      <w:r>
+        <w:t xml:space="preserve">al adoptarse en la República Dominicana,</w:t>
+      </w:r>
+      <w:r>
+        <w:t xml:space="preserve"> </w:t>
+      </w:r>
+      <w:r>
+        <w:rPr>
+          <w:b/>
+          <w:bCs/>
+        </w:rPr>
+        <w:t xml:space="preserve">Morpho recibe un ingreso</w:t>
+      </w:r>
+      <w:r>
+        <w:t xml:space="preserve">. Es, aunque modesto, actividad económica propia de Morpho y contribuye a su</w:t>
+      </w:r>
+      <w:r>
+        <w:t xml:space="preserve"> </w:t>
+      </w:r>
+      <w:r>
+        <w:rPr>
+          <w:b/>
+          <w:bCs/>
+        </w:rPr>
+        <w:t xml:space="preserve">sostenibilidad</w:t>
+      </w:r>
+      <w:r>
+        <w:t xml:space="preserve">.</w:t>
+      </w:r>
+    </w:p>
+    <w:p>
+      <w:pPr>
+        <w:pStyle w:val="FirstParagraph"/>
+      </w:pPr>
+      <w:r>
+        <w:rPr>
+          <w:b/>
+          <w:bCs/>
+        </w:rPr>
+        <w:t xml:space="preserve">Costo de uso: [x — por confirmar con Morpho]</w:t>
+      </w:r>
+    </w:p>
+    <w:bookmarkEnd w:id="17"/>
+    <w:bookmarkStart w:id="18" w:name="Xe9ed06b37cd8a4e7b1e8dfb60083bf04edc4964"/>
+    <w:p>
+      <w:pPr>
+        <w:pStyle w:val="Heading2"/>
+      </w:pPr>
+      <w:r>
+        <w:t xml:space="preserve">10. Presupuesto — el criterio</w:t>
+      </w:r>
+    </w:p>
+    <w:p>
+      <w:pPr>
+        <w:pStyle w:val="FirstParagraph"/>
+      </w:pPr>
+      <w:r>
+        <w:rPr>
+          <w:b/>
+          <w:bCs/>
+        </w:rPr>
+        <w:t xml:space="preserve">La mayor parte del presupuesto es el pago de la asistencia personal. [x — tarifa y monto por acordar]</w:t>
+      </w:r>
+    </w:p>
+    <w:p>
+      <w:pPr>
+        <w:pStyle w:val="BodyText"/>
+      </w:pPr>
+      <w:r>
+        <w:t xml:space="preserve">El criterio de diseño es uno:</w:t>
+      </w:r>
+      <w:r>
+        <w:t xml:space="preserve"> </w:t>
+      </w:r>
+      <w:r>
+        <w:rPr>
+          <w:b/>
+          <w:bCs/>
+        </w:rPr>
+        <w:t xml:space="preserve">que el dinero empiece a circular en el terreno lo antes posible.</w:t>
+      </w:r>
+      <w:r>
+        <w:t xml:space="preserve"> </w:t>
+      </w:r>
+      <w:r>
+        <w:t xml:space="preserve">No esperar a que el sistema nacional esté listo — pagar y echar a andar, y que la experiencia sirva después para que el Estado lo asuma.</w:t>
+      </w:r>
+    </w:p>
+    <w:p>
+      <w:pPr>
+        <w:pStyle w:val="BodyText"/>
+      </w:pPr>
+      <w:r>
+        <w:t xml:space="preserve">Es el camino que siguió Morpho: en 2013, antes de la Ley 9379, sostenía la vida independiente de 6 personas usuarias con unos 10 asistentes personales — 919 horas en agosto de ese año, con</w:t>
+      </w:r>
+      <w:r>
+        <w:t xml:space="preserve"> </w:t>
+      </w:r>
+      <w:r>
+        <w:rPr>
+          <w:b/>
+          <w:bCs/>
+        </w:rPr>
+        <w:t xml:space="preserve">22% aportado por el Estado y 78% por el proyecto</w:t>
+      </w:r>
+      <w:r>
+        <w:t xml:space="preserve">. Tras la entrada en vigor de la ley en 2019,</w:t>
+      </w:r>
+      <w:r>
+        <w:t xml:space="preserve"> </w:t>
+      </w:r>
+      <w:r>
+        <w:rPr>
+          <w:b/>
+          <w:bCs/>
+        </w:rPr>
+        <w:t xml:space="preserve">el Estado asumió prácticamente el 100% y la carga del proyecto bajó a cero.</w:t>
+      </w:r>
+    </w:p>
+    <w:p>
+      <w:pPr>
+        <w:pStyle w:val="BodyText"/>
+      </w:pPr>
+      <w:r>
+        <w:rPr>
+          <w:b/>
+          <w:bCs/>
+        </w:rPr>
+        <w:t xml:space="preserve">Para que el centro se sostenga</w:t>
+      </w:r>
+      <w:r>
+        <w:t xml:space="preserve">, hace falta además el planteamiento trabajado con la OIT:</w:t>
+      </w:r>
+      <w:r>
+        <w:t xml:space="preserve"> </w:t>
+      </w:r>
+      <w:r>
+        <w:rPr>
+          <w:b/>
+          <w:bCs/>
+        </w:rPr>
+        <w:t xml:space="preserve">el centro como lugar de trabajo para personas con discapacidad</w:t>
+      </w:r>
+      <w:r>
+        <w:t xml:space="preserve">. JICA no puede cubrir esa parte.</w:t>
+      </w:r>
+    </w:p>
+    <w:p>
+      <w:pPr>
+        <w:pStyle w:val="BodyText"/>
+      </w:pPr>
+      <w:r>
+        <w:t xml:space="preserve">Partidas: pago de asistencia personal (mayoritaria) · capacitación en Costa Rica · sistema de coordinación · operación del centro · evaluación y viajes</w:t>
+      </w:r>
+      <w:r>
+        <w:t xml:space="preserve"> </w:t>
+      </w:r>
+      <w:r>
+        <w:rPr>
+          <w:b/>
+          <w:bCs/>
+        </w:rPr>
+        <w:t xml:space="preserve">[x]</w:t>
+      </w:r>
+    </w:p>
+    <w:p>
+      <w:r>
+        <w:pict>
+          <v:rect style="width:0;height:1.5pt" o:hralign="center" o:hrstd="t" o:hr="t"/>
+        </w:pict>
+      </w:r>
+    </w:p>
+    <w:bookmarkEnd w:id="18"/>
+    <w:bookmarkStart w:id="19" w:name="Xe76011752e37cf528c9d59fbd93aa710a8e7fed"/>
+    <w:p>
+      <w:pPr>
+        <w:pStyle w:val="Heading2"/>
+      </w:pPr>
+      <w:r>
+        <w:t xml:space="preserve">11. Financiamiento</w:t>
+      </w:r>
+    </w:p>
+    <w:p>
+      <w:pPr>
+        <w:pStyle w:val="FirstParagraph"/>
+      </w:pPr>
+      <w:r>
+        <w:rPr>
+          <w:b/>
+          <w:bCs/>
+        </w:rPr>
+        <w:t xml:space="preserve">El orden importa: primero el país, después la banca.</w:t>
+      </w:r>
+    </w:p>
+    <w:p>
+      <w:pPr>
+        <w:pStyle w:val="BodyText"/>
+      </w:pPr>
+      <w:r>
+        <w:t xml:space="preserve">Explicar el proyecto como sistema es difícil.</w:t>
+      </w:r>
+      <w:r>
+        <w:t xml:space="preserve"> </w:t>
+      </w:r>
+      <w:r>
+        <w:rPr>
+          <w:b/>
+          <w:bCs/>
+        </w:rPr>
+        <w:t xml:space="preserve">Primero queremos tener claro el conjunto y conversarlo con las contrapartes dominicanas</w:t>
+      </w:r>
+      <w:r>
+        <w:t xml:space="preserve">; la argumentación ante la banca de desarrollo viene después.</w:t>
+      </w:r>
+    </w:p>
+    <w:p>
+      <w:pPr>
+        <w:pStyle w:val="BodyText"/>
+      </w:pPr>
+      <w:r>
+        <w:rPr>
+          <w:b/>
+          <w:bCs/>
+        </w:rPr>
+        <w:t xml:space="preserve">Punto de partida: CONADIS.</w:t>
+      </w:r>
+    </w:p>
+    <w:p>
+      <w:pPr>
+        <w:pStyle w:val="BodyText"/>
+      </w:pPr>
+      <w:r>
+        <w:t xml:space="preserve">La propuesta se plantea desde el CONADIS, y a partir de ahí se conversa</w:t>
+      </w:r>
+      <w:r>
+        <w:t xml:space="preserve"> </w:t>
+      </w:r>
+      <w:r>
+        <w:rPr>
+          <w:b/>
+          <w:bCs/>
+        </w:rPr>
+        <w:t xml:space="preserve">cuánto de esto puede cubrirse con recursos nacionales</w:t>
+      </w:r>
+      <w:r>
+        <w:t xml:space="preserve"> </w:t>
+      </w:r>
+      <w:r>
+        <w:t xml:space="preserve">— FONADIS (fondo designado a vida independiente), Supérate / Comunidades de Cuidado, Ministerio de la Mujer. El presupuesto se presenta completo, y la proporción entre aporte nacional y financiamiento externo se define en esa conversación, no antes.</w:t>
+      </w:r>
+    </w:p>
+    <w:p>
+      <w:pPr>
+        <w:pStyle w:val="BodyText"/>
+      </w:pPr>
+      <w:r>
+        <w:rPr>
+          <w:b/>
+          <w:bCs/>
+        </w:rPr>
+        <w:t xml:space="preserve">JICA (proyecto previsto desde 2027)</w:t>
+      </w:r>
+    </w:p>
+    <w:p>
+      <w:pPr>
+        <w:pStyle w:val="BodyText"/>
+      </w:pPr>
+      <w:r>
+        <w:t xml:space="preserve">No se trata de que un actor apoye al otro:</w:t>
+      </w:r>
+      <w:r>
+        <w:t xml:space="preserve"> </w:t>
+      </w:r>
+      <w:r>
+        <w:rPr>
+          <w:b/>
+          <w:bCs/>
+        </w:rPr>
+        <w:t xml:space="preserve">son de naturaleza distinta y por eso se potencian.</w:t>
+      </w:r>
+      <w:r>
+        <w:t xml:space="preserve"> </w:t>
+      </w:r>
+      <w:r>
+        <w:t xml:space="preserve">Conocemos bien lo que JICA no puede hacer, y la intención es complementarlo. Se irá conversando según avance.</w:t>
+      </w:r>
+    </w:p>
+    <w:p>
+      <w:pPr>
+        <w:pStyle w:val="BodyText"/>
+      </w:pPr>
+      <w:r>
+        <w:rPr>
+          <w:b/>
+          <w:bCs/>
+        </w:rPr>
+        <w:t xml:space="preserve">CAF</w:t>
+      </w:r>
+    </w:p>
+    <w:p>
+      <w:pPr>
+        <w:pStyle w:val="BodyText"/>
+      </w:pPr>
+      <w:r>
+        <w:t xml:space="preserve">La CAF financia principalmente a</w:t>
+      </w:r>
+      <w:r>
+        <w:t xml:space="preserve"> </w:t>
+      </w:r>
+      <w:r>
+        <w:rPr>
+          <w:b/>
+          <w:bCs/>
+        </w:rPr>
+        <w:t xml:space="preserve">gobiernos</w:t>
+      </w:r>
+      <w:r>
+        <w:t xml:space="preserve"> </w:t>
+      </w:r>
+      <w:r>
+        <w:t xml:space="preserve">de sus países miembro, mediante créditos y cooperaciones técnicas; con organizaciones de la sociedad civil realiza colaboraciones puntuales, orientadas sobre todo a</w:t>
+      </w:r>
+      <w:r>
+        <w:t xml:space="preserve"> </w:t>
+      </w:r>
+      <w:r>
+        <w:rPr>
+          <w:b/>
+          <w:bCs/>
+        </w:rPr>
+        <w:t xml:space="preserve">estudios, productos de conocimiento, jornadas y consultas</w:t>
+      </w:r>
+      <w:r>
+        <w:t xml:space="preserve">.</w:t>
+      </w:r>
+    </w:p>
+    <w:p>
+      <w:pPr>
+        <w:pStyle w:val="BodyText"/>
+      </w:pPr>
+      <w:r>
+        <w:t xml:space="preserve">Este proyecto encaja bien con eso: tiene contraparte pública (CONADIS, Ministerio de la Mujer) y produce exactamente ese tipo de resultado.</w:t>
+      </w:r>
+    </w:p>
+    <w:p>
+      <w:pPr>
+        <w:pStyle w:val="Compact"/>
+        <w:numPr>
+          <w:ilvl w:val="0"/>
+          <w:numId w:val="1010"/>
+        </w:numPr>
+      </w:pPr>
+      <w:r>
+        <w:t xml:space="preserve">el</w:t>
+      </w:r>
+      <w:r>
+        <w:t xml:space="preserve"> </w:t>
+      </w:r>
+      <w:r>
+        <w:rPr>
+          <w:b/>
+          <w:bCs/>
+        </w:rPr>
+        <w:t xml:space="preserve">programa de formación de asistentes personales</w:t>
+      </w:r>
+      <w:r>
+        <w:t xml:space="preserve"> </w:t>
+      </w:r>
+      <w:r>
+        <w:t xml:space="preserve">sistematizado a partir de Morpho (§8) — un producto de conocimiento transferible a toda la región;</w:t>
+      </w:r>
+    </w:p>
+    <w:p>
+      <w:pPr>
+        <w:pStyle w:val="Compact"/>
+        <w:numPr>
+          <w:ilvl w:val="0"/>
+          <w:numId w:val="1010"/>
+        </w:numPr>
+      </w:pPr>
+      <w:r>
+        <w:t xml:space="preserve">la</w:t>
+      </w:r>
+      <w:r>
+        <w:t xml:space="preserve"> </w:t>
+      </w:r>
+      <w:r>
+        <w:rPr>
+          <w:b/>
+          <w:bCs/>
+        </w:rPr>
+        <w:t xml:space="preserve">capacitación en Costa Rica</w:t>
+      </w:r>
+      <w:r>
+        <w:t xml:space="preserve"> </w:t>
+      </w:r>
+      <w:r>
+        <w:t xml:space="preserve">(§7) — jornada y consulta entre instituciones de dos países;</w:t>
+      </w:r>
+    </w:p>
+    <w:p>
+      <w:pPr>
+        <w:pStyle w:val="Compact"/>
+        <w:numPr>
+          <w:ilvl w:val="0"/>
+          <w:numId w:val="1010"/>
         </w:numPr>
       </w:pPr>
       <w:r>
@@ -2419,7 +2515,7 @@
         <w:pStyle w:val="Compact"/>
         <w:numPr>
           <w:ilvl w:val="0"/>
-          <w:numId w:val="1010"/>
+          <w:numId w:val="1011"/>
         </w:numPr>
       </w:pPr>
       <w:r>
@@ -2444,7 +2540,7 @@
         <w:pStyle w:val="Compact"/>
         <w:numPr>
           <w:ilvl w:val="0"/>
-          <w:numId w:val="1010"/>
+          <w:numId w:val="1011"/>
         </w:numPr>
       </w:pPr>
       <w:r>
@@ -2472,7 +2568,7 @@
         <w:pStyle w:val="Compact"/>
         <w:numPr>
           <w:ilvl w:val="0"/>
-          <w:numId w:val="1010"/>
+          <w:numId w:val="1011"/>
         </w:numPr>
       </w:pPr>
       <w:r>
@@ -2484,7 +2580,7 @@
         <w:pStyle w:val="Compact"/>
         <w:numPr>
           <w:ilvl w:val="0"/>
-          <w:numId w:val="1010"/>
+          <w:numId w:val="1011"/>
         </w:numPr>
       </w:pPr>
       <w:r>
@@ -2868,6 +2964,9 @@
     <w:abstractNumId w:val="991"/>
   </w:num>
   <w:num w:numId="1010">
+    <w:abstractNumId w:val="991"/>
+  </w:num>
+  <w:num w:numId="1011">
     <w:abstractNumId w:val="99411"/>
     <w:lvlOverride w:ilvl="0">
       <w:startOverride w:val="1"/>

</xml_diff>

<commit_message>
RD v2: cita literal del Compromiso de Tlatelolco (década de acción 2025-2035)
Corrige 'década de instalación de los sistemas de cuidados' por el texto
oficial del párrafo 7: 'década de acción 2025-2035 ... para acelerar el logro
de la igualdad sustantiva de género y la sociedad del cuidado'. Se añaden los
párrafos 71 (programa de cooperación multiactor) y 72 (informe voluntario ante
la Mesa Directiva hasta 2035).

Co-Authored-By: Claude Opus 5 <noreply@anthropic.com>
</commit_message>
<xml_diff>
--- a/republica-dominicana/propuesta-proyecto-AP/Propuesta-v2-piloto-AP-RD-2027-2030.docx
+++ b/republica-dominicana/propuesta-proyecto-AP/Propuesta-v2-piloto-AP-RD-2027-2030.docx
@@ -305,23 +305,79 @@
         <w:t xml:space="preserve"> </w:t>
       </w:r>
       <w:r>
-        <w:t xml:space="preserve">ante la XVII Conferencia Regional sobre la Mujer, como una de las propuestas concretas dentro de la</w:t>
-      </w:r>
-      <w:r>
-        <w:t xml:space="preserve"> </w:t>
-      </w:r>
-      <w:r>
-        <w:rPr>
-          <w:b/>
-          <w:bCs/>
-        </w:rPr>
-        <w:t xml:space="preserve">década de instalación de los sistemas de cuidados</w:t>
-      </w:r>
-      <w:r>
-        <w:t xml:space="preserve"> </w:t>
-      </w:r>
-      <w:r>
-        <w:t xml:space="preserve">acordada en la Conferencia de México (2025).</w:t>
+        <w:t xml:space="preserve">ante la XVII Conferencia Regional sobre la Mujer, como una propuesta concreta dentro de la</w:t>
+      </w:r>
+      <w:r>
+        <w:t xml:space="preserve"> </w:t>
+      </w:r>
+      <w:r>
+        <w:rPr>
+          <w:b/>
+          <w:bCs/>
+        </w:rPr>
+        <w:t xml:space="preserve">década de acción 2025-2035</w:t>
+      </w:r>
+      <w:r>
+        <w:t xml:space="preserve">, establecida en el Compromiso de Tlatelolco (Conferencia de México, 2025):</w:t>
+      </w:r>
+    </w:p>
+    <w:p>
+      <w:pPr>
+        <w:pStyle w:val="BlockText"/>
+      </w:pPr>
+      <w:r>
+        <w:rPr>
+          <w:b/>
+          <w:bCs/>
+        </w:rPr>
+        <w:t xml:space="preserve">7.</w:t>
+      </w:r>
+      <w:r>
+        <w:t xml:space="preserve"> </w:t>
+      </w:r>
+      <w:r>
+        <w:rPr>
+          <w:i/>
+          <w:iCs/>
+        </w:rPr>
+        <w:t xml:space="preserve">Establecer una década de acción 2025-2035 en América Latina y el Caribe para acelerar el logro de la igualdad sustantiva de género y la sociedad del cuidado mediante transformaciones en los ámbitos político, económico, social, cultural y ambiental.</w:t>
+      </w:r>
+    </w:p>
+    <w:p>
+      <w:pPr>
+        <w:pStyle w:val="FirstParagraph"/>
+      </w:pPr>
+      <w:r>
+        <w:t xml:space="preserve">El mismo Compromiso prevé, en su párrafo 71,</w:t>
+      </w:r>
+      <w:r>
+        <w:t xml:space="preserve"> </w:t>
+      </w:r>
+      <w:r>
+        <w:rPr>
+          <w:b/>
+          <w:bCs/>
+        </w:rPr>
+        <w:t xml:space="preserve">un programa de cooperación internacional multiactor</w:t>
+      </w:r>
+      <w:r>
+        <w:t xml:space="preserve"> </w:t>
+      </w:r>
+      <w:r>
+        <w:t xml:space="preserve">para apoyar esa década — que es exactamente el marco en el que este proyecto se inscribe — y, en su párrafo 72, que los Estados</w:t>
+      </w:r>
+      <w:r>
+        <w:t xml:space="preserve"> </w:t>
+      </w:r>
+      <w:r>
+        <w:rPr>
+          <w:b/>
+          <w:bCs/>
+        </w:rPr>
+        <w:t xml:space="preserve">informen voluntariamente sobre los avances en las reuniones de la Mesa Directiva de aquí a 2035</w:t>
+      </w:r>
+      <w:r>
+        <w:t xml:space="preserve">.</w:t>
       </w:r>
     </w:p>
     <w:p>

</xml_diff>

<commit_message>
RD v2: quita la referencia interna a un comentario de Paz Arancibia
Co-Authored-By: Claude Opus 5 <noreply@anthropic.com>
</commit_message>
<xml_diff>
--- a/republica-dominicana/propuesta-proyecto-AP/Propuesta-v2-piloto-AP-RD-2027-2030.docx
+++ b/republica-dominicana/propuesta-proyecto-AP/Propuesta-v2-piloto-AP-RD-2027-2030.docx
@@ -565,7 +565,10 @@
         <w:t xml:space="preserve">el centro sea también un lugar de trabajo para personas con discapacidad</w:t>
       </w:r>
       <w:r>
-        <w:t xml:space="preserve">. Paz Arancibia comentó que esa idea hay que desarrollarla más — la respuesta es hacerlo conjuntamente.</w:t>
+        <w:t xml:space="preserve"> </w:t>
+      </w:r>
+      <w:r>
+        <w:t xml:space="preserve">— una línea que se viene trabajando conjuntamente y que conviene desarrollar más.</w:t>
       </w:r>
     </w:p>
     <w:p>

</xml_diff>

<commit_message>
RD v2: sin nombres personales; la propuesta ante la banca la presenta el CONADIS
- Se retiran todos los nombres de personas y las apreciaciones internas
  (relaciones, quién está dentro de qué círculo, qué no puede hacer cada agencia).
- Se explicita el recorrido: CIMUDIS → CONADIS, y es el CONADIS quien presenta
  formalmente la propuesta ante la banca de desarrollo.

Co-Authored-By: Claude Opus 5 <noreply@anthropic.com>
</commit_message>
<xml_diff>
--- a/republica-dominicana/propuesta-proyecto-AP/Propuesta-v2-piloto-AP-RD-2027-2030.docx
+++ b/republica-dominicana/propuesta-proyecto-AP/Propuesta-v2-piloto-AP-RD-2027-2030.docx
@@ -142,7 +142,7 @@
           <w:b/>
           <w:bCs/>
         </w:rPr>
-        <w:t xml:space="preserve">Cristina (CIMUDIS) fue la primera persona de la República Dominicana en cursar la capacitación japonesa de vida independiente</w:t>
+        <w:t xml:space="preserve">La presidenta de CIMUDIS fue la primera persona de la República Dominicana en cursar la capacitación japonesa de vida independiente</w:t>
       </w:r>
       <w:r>
         <w:t xml:space="preserve">, y regresó al país.</w:t>
@@ -189,7 +189,7 @@
           <w:b/>
           <w:bCs/>
         </w:rPr>
-        <w:t xml:space="preserve">Por iniciativa de Cristina, el círculo se amplió a la red de personas egresadas de las capacitaciones de JICA dentro de las instituciones públicas.</w:t>
+        <w:t xml:space="preserve">Por iniciativa de CIMUDIS, el trabajo se amplió a la red de personas egresadas de las capacitaciones de JICA dentro de las instituciones públicas.</w:t>
       </w:r>
       <w:r>
         <w:t xml:space="preserve"> </w:t>
@@ -434,7 +434,7 @@
         <w:t xml:space="preserve"> </w:t>
       </w:r>
       <w:r>
-        <w:t xml:space="preserve">(reunión con la ministra Gloria Reyes y CIMUDIS, 1-ago-2026).</w:t>
+        <w:t xml:space="preserve">(encuentro con CIMUDIS, 1 de agosto de 2026).</w:t>
       </w:r>
     </w:p>
     <w:p>
@@ -462,7 +462,7 @@
         <w:t xml:space="preserve"> </w:t>
       </w:r>
       <w:r>
-        <w:t xml:space="preserve">— Círculo de Mujeres con Discapacidad, presidido por Cristina.</w:t>
+        <w:t xml:space="preserve">— Círculo de Mujeres con Discapacidad.</w:t>
       </w:r>
     </w:p>
     <w:p>
@@ -953,13 +953,13 @@
                 <w:b/>
                 <w:bCs/>
               </w:rPr>
-              <w:t xml:space="preserve">Visita de evaluación de Wendy Barrantes</w:t>
+              <w:t xml:space="preserve">Visita de evaluación desde Costa Rica</w:t>
             </w:r>
             <w:r>
               <w:t xml:space="preserve"> </w:t>
             </w:r>
             <w:r>
-              <w:t xml:space="preserve">— un año después de la capacitación en Costa Rica</w:t>
+              <w:t xml:space="preserve">— un año después de la capacitación</w:t>
             </w:r>
           </w:p>
         </w:tc>
@@ -1113,13 +1113,13 @@
           <w:b/>
           <w:bCs/>
         </w:rPr>
-        <w:t xml:space="preserve">A un año de la capacitación en Costa Rica: Wendy viaja a la República Dominicana.</w:t>
-      </w:r>
-      <w:r>
-        <w:t xml:space="preserve"> </w:t>
-      </w:r>
-      <w:r>
-        <w:t xml:space="preserve">No es una evaluación de escritorio — viene a ver si el ciclo está funcionando y, si hay problemas, se resuelven allí mismo, en persona.</w:t>
+        <w:t xml:space="preserve">A un año de la capacitación: el equipo costarricense viaja a la República Dominicana.</w:t>
+      </w:r>
+      <w:r>
+        <w:t xml:space="preserve"> </w:t>
+      </w:r>
+      <w:r>
+        <w:t xml:space="preserve">No es una evaluación de escritorio — se viene a ver si el ciclo está funcionando y, si hay problemas, se resuelven allí mismo, en persona.</w:t>
       </w:r>
       <w:r>
         <w:t xml:space="preserve"> </w:t>
@@ -1336,13 +1336,10 @@
           <w:b/>
           <w:bCs/>
         </w:rPr>
-        <w:t xml:space="preserve">Takeshi Inoue — coordinación general.</w:t>
-      </w:r>
-      <w:r>
-        <w:t xml:space="preserve"> </w:t>
-      </w:r>
-      <w:r>
-        <w:t xml:space="preserve">Es el punto donde confluyen las cuatro líneas que este proyecto necesita a la vez: la República Dominicana, Costa Rica (Morpho), la OIT y JICA.</w:t>
+        <w:t xml:space="preserve">RELAVIN — coordinación general del proyecto</w:t>
+      </w:r>
+      <w:r>
+        <w:t xml:space="preserve">, articulando las cuatro líneas que se necesitan a la vez: la República Dominicana, Costa Rica (Morpho), la OIT y JICA.</w:t>
       </w:r>
     </w:p>
     <w:p>
@@ -2005,7 +2002,7 @@
         <w:t xml:space="preserve">el centro como lugar de trabajo para personas con discapacidad</w:t>
       </w:r>
       <w:r>
-        <w:t xml:space="preserve">. JICA no puede cubrir esa parte.</w:t>
+        <w:t xml:space="preserve">.</w:t>
       </w:r>
     </w:p>
     <w:p>
@@ -2085,7 +2082,7 @@
           <w:b/>
           <w:bCs/>
         </w:rPr>
-        <w:t xml:space="preserve">Punto de partida: CONADIS.</w:t>
+        <w:t xml:space="preserve">Punto de partida y titularidad de la propuesta</w:t>
       </w:r>
     </w:p>
     <w:p>
@@ -2093,7 +2090,44 @@
         <w:pStyle w:val="BodyText"/>
       </w:pPr>
       <w:r>
-        <w:t xml:space="preserve">La propuesta se plantea desde el CONADIS, y a partir de ahí se conversa</w:t>
+        <w:t xml:space="preserve">El recorrido es:</w:t>
+      </w:r>
+      <w:r>
+        <w:t xml:space="preserve"> </w:t>
+      </w:r>
+      <w:r>
+        <w:rPr>
+          <w:b/>
+          <w:bCs/>
+        </w:rPr>
+        <w:t xml:space="preserve">CIMUDIS → CONADIS</w:t>
+      </w:r>
+      <w:r>
+        <w:t xml:space="preserve">, y</w:t>
+      </w:r>
+      <w:r>
+        <w:t xml:space="preserve"> </w:t>
+      </w:r>
+      <w:r>
+        <w:rPr>
+          <w:b/>
+          <w:bCs/>
+        </w:rPr>
+        <w:t xml:space="preserve">la propuesta ante la banca de desarrollo la presenta oficialmente el CONADIS.</w:t>
+      </w:r>
+      <w:r>
+        <w:t xml:space="preserve"> </w:t>
+      </w:r>
+      <w:r>
+        <w:t xml:space="preserve">El proyecto nace del movimiento y se presenta desde la institución rectora del Estado.</w:t>
+      </w:r>
+    </w:p>
+    <w:p>
+      <w:pPr>
+        <w:pStyle w:val="BodyText"/>
+      </w:pPr>
+      <w:r>
+        <w:t xml:space="preserve">A partir de ahí se conversa</w:t>
       </w:r>
       <w:r>
         <w:t xml:space="preserve"> </w:t>
@@ -2109,7 +2143,20 @@
         <w:t xml:space="preserve"> </w:t>
       </w:r>
       <w:r>
-        <w:t xml:space="preserve">— FONADIS (fondo designado a vida independiente), Supérate / Comunidades de Cuidado, Ministerio de la Mujer. El presupuesto se presenta completo, y la proporción entre aporte nacional y financiamiento externo se define en esa conversación, no antes.</w:t>
+        <w:t xml:space="preserve">— FONADIS (fondo designado a vida independiente), Supérate / Comunidades de Cuidado, Ministerio de la Mujer.</w:t>
+      </w:r>
+      <w:r>
+        <w:t xml:space="preserve"> </w:t>
+      </w:r>
+      <w:r>
+        <w:rPr>
+          <w:b/>
+          <w:bCs/>
+        </w:rPr>
+        <w:t xml:space="preserve">El presupuesto se presenta completo</w:t>
+      </w:r>
+      <w:r>
+        <w:t xml:space="preserve">, y la proporción entre aporte nacional y financiamiento externo se define en esa conversación, no antes.</w:t>
       </w:r>
     </w:p>
     <w:p>
@@ -2139,13 +2186,13 @@
           <w:b/>
           <w:bCs/>
         </w:rPr>
-        <w:t xml:space="preserve">son de naturaleza distinta y por eso se potencian.</w:t>
-      </w:r>
-      <w:r>
-        <w:t xml:space="preserve"> </w:t>
-      </w:r>
-      <w:r>
-        <w:t xml:space="preserve">Conocemos bien lo que JICA no puede hacer, y la intención es complementarlo. Se irá conversando según avance.</w:t>
+        <w:t xml:space="preserve">son iniciativas de naturaleza distinta y por eso se potencian mutuamente.</w:t>
+      </w:r>
+      <w:r>
+        <w:t xml:space="preserve"> </w:t>
+      </w:r>
+      <w:r>
+        <w:t xml:space="preserve">La intención es que se complementen, y se irá conversando según avance.</w:t>
       </w:r>
     </w:p>
     <w:p>
@@ -2202,7 +2249,20 @@
         <w:pStyle w:val="BodyText"/>
       </w:pPr>
       <w:r>
-        <w:t xml:space="preserve">Este proyecto encaja bien con eso: tiene contraparte pública (CONADIS, Ministerio de la Mujer) y produce exactamente ese tipo de resultado.</w:t>
+        <w:t xml:space="preserve">Este proyecto encaja con ese marco:</w:t>
+      </w:r>
+      <w:r>
+        <w:t xml:space="preserve"> </w:t>
+      </w:r>
+      <w:r>
+        <w:rPr>
+          <w:b/>
+          <w:bCs/>
+        </w:rPr>
+        <w:t xml:space="preserve">la propuesta la presenta el CONADIS</w:t>
+      </w:r>
+      <w:r>
+        <w:t xml:space="preserve">, y lo que produce es exactamente ese tipo de resultado.</w:t>
       </w:r>
     </w:p>
     <w:p>
@@ -2294,7 +2354,7 @@
         <w:pStyle w:val="FirstParagraph"/>
       </w:pPr>
       <w:r>
-        <w:t xml:space="preserve">Sobre esa base se retoma la conversación, y sin prisa. Stefan Trömel e Iñaki Regueiro no son destinatarios externos — están dentro del círculo.</w:t>
+        <w:t xml:space="preserve">Sobre esa base se retomará la conversación con la CAF.</w:t>
       </w:r>
     </w:p>
     <w:p>
@@ -2588,7 +2648,7 @@
           <w:b/>
           <w:bCs/>
         </w:rPr>
-        <w:t xml:space="preserve">con Cristina (CIMUDIS)</w:t>
+        <w:t xml:space="preserve">con CIMUDIS</w:t>
       </w:r>
       <w:r>
         <w:t xml:space="preserve">.</w:t>
@@ -2631,7 +2691,14 @@
         </w:numPr>
       </w:pPr>
       <w:r>
-        <w:t xml:space="preserve">Con eso, conversación con las contrapartes dominicanas.</w:t>
+        <w:rPr>
+          <w:b/>
+          <w:bCs/>
+        </w:rPr>
+        <w:t xml:space="preserve">Presentación al CONADIS por medio de CIMUDIS</w:t>
+      </w:r>
+      <w:r>
+        <w:t xml:space="preserve">, y conversación sobre el alcance del aporte nacional.</w:t>
       </w:r>
     </w:p>
     <w:p>
@@ -2643,7 +2710,11 @@
         </w:numPr>
       </w:pPr>
       <w:r>
-        <w:t xml:space="preserve">Después, la argumentación ante la banca de desarrollo.</w:t>
+        <w:rPr>
+          <w:b/>
+          <w:bCs/>
+        </w:rPr>
+        <w:t xml:space="preserve">Presentación ante la banca de desarrollo, formalmente por el CONADIS.</w:t>
       </w:r>
     </w:p>
     <w:p>

</xml_diff>

<commit_message>
RD v2: el proyecto retoma lo que la OIT dejó a mitad de camino (2023-2024)
Se documenta con fuentes oficiales el programa presentado en octubre de 2023
(INFOTEP/OIT/MEPyD, cuatro manuales guía) y la certificación de 29 facilitadores
el 26 de febrero de 2024 — y que la rama de asistencia personal quedó detenida
ahí. Se añade el encuentro con esas 29 personas como actividad del 2.º trimestre
de 2027.

Co-Authored-By: Claude Opus 5 <noreply@anthropic.com>
</commit_message>
<xml_diff>
--- a/republica-dominicana/propuesta-proyecto-AP/Propuesta-v2-piloto-AP-RD-2027-2030.docx
+++ b/republica-dominicana/propuesta-proyecto-AP/Propuesta-v2-piloto-AP-RD-2027-2030.docx
@@ -2,7 +2,7 @@
 <file path=word/document.xml><?xml version="1.0" encoding="utf-8"?>
 <w:document xmlns:w="http://schemas.openxmlformats.org/wordprocessingml/2006/main" xmlns:m="http://schemas.openxmlformats.org/officeDocument/2006/math" xmlns:r="http://schemas.openxmlformats.org/officeDocument/2006/relationships" xmlns:o="urn:schemas-microsoft-com:office:office" xmlns:v="urn:schemas-microsoft-com:vml" xmlns:w10="urn:schemas-microsoft-com:office:word" xmlns:a="http://schemas.openxmlformats.org/drawingml/2006/main" xmlns:pic="http://schemas.openxmlformats.org/drawingml/2006/picture" xmlns:wp="http://schemas.openxmlformats.org/drawingml/2006/wordprocessingDrawing">
   <w:body>
-    <w:bookmarkStart w:id="22" w:name="X49d69b69a2f4792f422d0ff754340b711f90e52"/>
+    <w:bookmarkStart w:id="26" w:name="X49d69b69a2f4792f422d0ff754340b711f90e52"/>
     <w:p>
       <w:pPr>
         <w:pStyle w:val="Heading1"/>
@@ -88,7 +88,7 @@
         </w:pict>
       </w:r>
     </w:p>
-    <w:bookmarkStart w:id="9" w:name="Xf34131f22388d6093dd5914cd6a0098b9e28a72"/>
+    <w:bookmarkStart w:id="13" w:name="Xf34131f22388d6093dd5914cd6a0098b9e28a72"/>
     <w:p>
       <w:pPr>
         <w:pStyle w:val="Heading2"/>
@@ -99,7 +99,6 @@
     </w:p>
     <w:p>
       <w:pPr>
-        <w:pStyle w:val="Compact"/>
         <w:numPr>
           <w:ilvl w:val="0"/>
           <w:numId w:val="1001"/>
@@ -110,28 +109,216 @@
           <w:b/>
           <w:bCs/>
         </w:rPr>
-        <w:t xml:space="preserve">2023 — La formación de asistentes personales ya se introdujo en la República Dominicana</w:t>
-      </w:r>
-      <w:r>
-        <w:t xml:space="preserve"> </w:t>
-      </w:r>
-      <w:r>
-        <w:t xml:space="preserve">con apoyo de la OIT (currículo en INFOTEP).</w:t>
-      </w:r>
-      <w:r>
-        <w:t xml:space="preserve"> </w:t>
-      </w:r>
-      <w:r>
-        <w:rPr>
-          <w:b/>
-          <w:bCs/>
-        </w:rPr>
-        <w:t xml:space="preserve">Pero se hizo sin las personas con discapacidad, y quedó detenida.</w:t>
+        <w:t xml:space="preserve">2023-2024 — La formación de asistentes personales ya se introdujo en la República Dominicana, con apoyo de la OIT.</w:t>
       </w:r>
     </w:p>
     <w:p>
       <w:pPr>
         <w:pStyle w:val="Compact"/>
+        <w:numPr>
+          <w:ilvl w:val="1"/>
+          <w:numId w:val="1002"/>
+        </w:numPr>
+      </w:pPr>
+      <w:r>
+        <w:rPr>
+          <w:b/>
+          <w:bCs/>
+        </w:rPr>
+        <w:t xml:space="preserve">Octubre de 2023:</w:t>
+      </w:r>
+      <w:r>
+        <w:t xml:space="preserve"> </w:t>
+      </w:r>
+      <w:r>
+        <w:t xml:space="preserve">INFOTEP, la OIT y el MEPyD presentan el programa</w:t>
+      </w:r>
+      <w:r>
+        <w:t xml:space="preserve"> </w:t>
+      </w:r>
+      <w:r>
+        <w:rPr>
+          <w:b/>
+          <w:bCs/>
+        </w:rPr>
+        <w:t xml:space="preserve">«Asistencia Personal a Personas con Discapacidad con Demanda de Apoyo»</w:t>
+      </w:r>
+      <w:r>
+        <w:t xml:space="preserve">, con</w:t>
+      </w:r>
+      <w:r>
+        <w:t xml:space="preserve"> </w:t>
+      </w:r>
+      <w:r>
+        <w:rPr>
+          <w:b/>
+          <w:bCs/>
+        </w:rPr>
+        <w:t xml:space="preserve">cuatro Manuales Guía</w:t>
+      </w:r>
+      <w:r>
+        <w:t xml:space="preserve">, dentro del proyecto</w:t>
+      </w:r>
+      <w:r>
+        <w:t xml:space="preserve"> </w:t>
+      </w:r>
+      <w:r>
+        <w:rPr>
+          <w:i/>
+          <w:iCs/>
+        </w:rPr>
+        <w:t xml:space="preserve">Comunidades de Cuidado</w:t>
+      </w:r>
+      <w:r>
+        <w:t xml:space="preserve"> </w:t>
+      </w:r>
+      <w:r>
+        <w:t xml:space="preserve">(Fondo ODS). (</w:t>
+      </w:r>
+      <w:hyperlink r:id="rId9">
+        <w:r>
+          <w:rPr>
+            <w:rStyle w:val="Hyperlink"/>
+          </w:rPr>
+          <w:t xml:space="preserve">OIT</w:t>
+        </w:r>
+      </w:hyperlink>
+      <w:r>
+        <w:t xml:space="preserve"> </w:t>
+      </w:r>
+      <w:r>
+        <w:t xml:space="preserve">·</w:t>
+      </w:r>
+      <w:r>
+        <w:t xml:space="preserve"> </w:t>
+      </w:r>
+      <w:hyperlink r:id="rId10">
+        <w:r>
+          <w:rPr>
+            <w:rStyle w:val="Hyperlink"/>
+          </w:rPr>
+          <w:t xml:space="preserve">INFOTEP</w:t>
+        </w:r>
+      </w:hyperlink>
+      <w:r>
+        <w:t xml:space="preserve"> </w:t>
+      </w:r>
+      <w:r>
+        <w:t xml:space="preserve">·</w:t>
+      </w:r>
+      <w:r>
+        <w:t xml:space="preserve"> </w:t>
+      </w:r>
+      <w:hyperlink r:id="rId11">
+        <w:r>
+          <w:rPr>
+            <w:rStyle w:val="Hyperlink"/>
+          </w:rPr>
+          <w:t xml:space="preserve">Presidencia</w:t>
+        </w:r>
+      </w:hyperlink>
+      <w:r>
+        <w:t xml:space="preserve">)</w:t>
+      </w:r>
+    </w:p>
+    <w:p>
+      <w:pPr>
+        <w:pStyle w:val="Compact"/>
+        <w:numPr>
+          <w:ilvl w:val="1"/>
+          <w:numId w:val="1002"/>
+        </w:numPr>
+      </w:pPr>
+      <w:r>
+        <w:rPr>
+          <w:b/>
+          <w:bCs/>
+        </w:rPr>
+        <w:t xml:space="preserve">26 de febrero de 2024:</w:t>
+      </w:r>
+      <w:r>
+        <w:t xml:space="preserve"> </w:t>
+      </w:r>
+      <w:r>
+        <w:t xml:space="preserve">INFOTEP y la OIT</w:t>
+      </w:r>
+      <w:r>
+        <w:t xml:space="preserve"> </w:t>
+      </w:r>
+      <w:r>
+        <w:rPr>
+          <w:b/>
+          <w:bCs/>
+        </w:rPr>
+        <w:t xml:space="preserve">certifican a 29 facilitadoras y facilitadores técnicos</w:t>
+      </w:r>
+      <w:r>
+        <w:t xml:space="preserve"> </w:t>
+      </w:r>
+      <w:r>
+        <w:t xml:space="preserve">para impartir ese programa — 30 horas, con el enfoque de derechos humanos como eje transversal, a cargo de una experta internacional del movimiento de vida independiente de Costa Rica, consultora de la OIT. (</w:t>
+      </w:r>
+      <w:hyperlink r:id="rId12">
+        <w:r>
+          <w:rPr>
+            <w:rStyle w:val="Hyperlink"/>
+          </w:rPr>
+          <w:t xml:space="preserve">Supérate</w:t>
+        </w:r>
+      </w:hyperlink>
+      <w:r>
+        <w:t xml:space="preserve">)</w:t>
+      </w:r>
+    </w:p>
+    <w:p>
+      <w:pPr>
+        <w:pStyle w:val="Compact"/>
+        <w:numPr>
+          <w:ilvl w:val="1"/>
+          <w:numId w:val="1002"/>
+        </w:numPr>
+      </w:pPr>
+      <w:r>
+        <w:rPr>
+          <w:b/>
+          <w:bCs/>
+        </w:rPr>
+        <w:t xml:space="preserve">Y ahí se detuvo.</w:t>
+      </w:r>
+      <w:r>
+        <w:t xml:space="preserve"> </w:t>
+      </w:r>
+      <w:r>
+        <w:t xml:space="preserve">La formación masiva y los servicios avanzaron para el cuidado de personas mayores, pero</w:t>
+      </w:r>
+      <w:r>
+        <w:t xml:space="preserve"> </w:t>
+      </w:r>
+      <w:r>
+        <w:rPr>
+          <w:b/>
+          <w:bCs/>
+        </w:rPr>
+        <w:t xml:space="preserve">la formación de asistentes personales y la prestación del servicio de AP a personas con discapacidad no arrancaron.</w:t>
+      </w:r>
+    </w:p>
+    <w:p>
+      <w:pPr>
+        <w:numPr>
+          <w:ilvl w:val="0"/>
+          <w:numId w:val="1000"/>
+        </w:numPr>
+      </w:pPr>
+      <w:r>
+        <w:rPr>
+          <w:b/>
+          <w:bCs/>
+        </w:rPr>
+        <w:t xml:space="preserve">Las 29 personas certificadas siguen ahí, sin haber podido ejercer esa formación.</w:t>
+      </w:r>
+    </w:p>
+    <w:p>
+      <w:pPr>
         <w:numPr>
           <w:ilvl w:val="0"/>
           <w:numId w:val="1001"/>
@@ -150,7 +337,6 @@
     </w:p>
     <w:p>
       <w:pPr>
-        <w:pStyle w:val="Compact"/>
         <w:numPr>
           <w:ilvl w:val="0"/>
           <w:numId w:val="1001"/>
@@ -178,7 +364,6 @@
     </w:p>
     <w:p>
       <w:pPr>
-        <w:pStyle w:val="Compact"/>
         <w:numPr>
           <w:ilvl w:val="0"/>
           <w:numId w:val="1001"/>
@@ -207,6 +392,22 @@
           <w:b/>
           <w:bCs/>
         </w:rPr>
+        <w:t xml:space="preserve">Esta propuesta no inicia algo nuevo: retoma lo que la OIT dejó a mitad de camino.</w:t>
+      </w:r>
+      <w:r>
+        <w:t xml:space="preserve"> </w:t>
+      </w:r>
+      <w:r>
+        <w:t xml:space="preserve">El currículo, los manuales y las personas formadoras ya existen — es un activo que en la región sólo tienen la República Dominicana y Costa Rica.</w:t>
+      </w:r>
+      <w:r>
+        <w:t xml:space="preserve"> </w:t>
+      </w:r>
+      <w:r>
+        <w:rPr>
+          <w:b/>
+          <w:bCs/>
+        </w:rPr>
         <w:t xml:space="preserve">Lo que cambia respecto de 2023 no es el currículo: es quién lo conduce.</w:t>
       </w:r>
     </w:p>
@@ -217,8 +418,8 @@
         </w:pict>
       </w:r>
     </w:p>
-    <w:bookmarkEnd w:id="9"/>
-    <w:bookmarkStart w:id="10" w:name="X0e652f04fa4ff486c4b70e217741b0037f5beed"/>
+    <w:bookmarkEnd w:id="13"/>
+    <w:bookmarkStart w:id="14" w:name="X0e652f04fa4ff486c4b70e217741b0037f5beed"/>
     <w:p>
       <w:pPr>
         <w:pStyle w:val="Heading2"/>
@@ -387,8 +588,8 @@
         </w:pict>
       </w:r>
     </w:p>
-    <w:bookmarkEnd w:id="10"/>
-    <w:bookmarkStart w:id="11" w:name="X38b24701393d04290d1a6e1293836c96040893c"/>
+    <w:bookmarkEnd w:id="14"/>
+    <w:bookmarkStart w:id="15" w:name="X38b24701393d04290d1a6e1293836c96040893c"/>
     <w:p>
       <w:pPr>
         <w:pStyle w:val="Heading2"/>
@@ -414,7 +615,7 @@
         <w:pStyle w:val="Compact"/>
         <w:numPr>
           <w:ilvl w:val="0"/>
-          <w:numId w:val="1002"/>
+          <w:numId w:val="1003"/>
         </w:numPr>
       </w:pPr>
       <w:r>
@@ -442,7 +643,7 @@
         <w:pStyle w:val="Compact"/>
         <w:numPr>
           <w:ilvl w:val="0"/>
-          <w:numId w:val="1002"/>
+          <w:numId w:val="1003"/>
         </w:numPr>
       </w:pPr>
       <w:r>
@@ -470,7 +671,7 @@
         <w:pStyle w:val="Compact"/>
         <w:numPr>
           <w:ilvl w:val="0"/>
-          <w:numId w:val="1002"/>
+          <w:numId w:val="1003"/>
         </w:numPr>
       </w:pPr>
       <w:r>
@@ -532,7 +733,7 @@
         <w:pStyle w:val="Compact"/>
         <w:numPr>
           <w:ilvl w:val="0"/>
-          <w:numId w:val="1002"/>
+          <w:numId w:val="1003"/>
         </w:numPr>
       </w:pPr>
       <w:r>
@@ -609,8 +810,8 @@
         </w:pict>
       </w:r>
     </w:p>
-    <w:bookmarkEnd w:id="11"/>
-    <w:bookmarkStart w:id="12" w:name="X7cb408607628cb2420dd10343dd5eaf527b38ff"/>
+    <w:bookmarkEnd w:id="15"/>
+    <w:bookmarkStart w:id="16" w:name="X7cb408607628cb2420dd10343dd5eaf527b38ff"/>
     <w:p>
       <w:pPr>
         <w:pStyle w:val="Heading2"/>
@@ -730,8 +931,8 @@
         </w:pict>
       </w:r>
     </w:p>
-    <w:bookmarkEnd w:id="12"/>
-    <w:bookmarkStart w:id="13" w:name="X8e2fc4bb390eeda68e22252144d9044bcdfe4e2"/>
+    <w:bookmarkEnd w:id="16"/>
+    <w:bookmarkStart w:id="17" w:name="X8e2fc4bb390eeda68e22252144d9044bcdfe4e2"/>
     <w:p>
       <w:pPr>
         <w:pStyle w:val="Heading2"/>
@@ -873,7 +1074,7 @@
               <w:t xml:space="preserve"> </w:t>
             </w:r>
             <w:r>
-              <w:t xml:space="preserve">en el país</w:t>
+              <w:t xml:space="preserve">en el país — incluye el</w:t>
             </w:r>
             <w:r>
               <w:t xml:space="preserve"> </w:t>
@@ -883,7 +1084,23 @@
                 <w:b/>
                 <w:bCs/>
               </w:rPr>
-              <w:t xml:space="preserve">[x — definir contenido]</w:t>
+              <w:t xml:space="preserve">encuentro con las 29 personas facilitadoras certificadas en 2024</w:t>
+            </w:r>
+            <w:r>
+              <w:t xml:space="preserve"> </w:t>
+            </w:r>
+            <w:r>
+              <w:t xml:space="preserve">(§7). Resto del contenido</w:t>
+            </w:r>
+            <w:r>
+              <w:t xml:space="preserve"> </w:t>
+            </w:r>
+            <w:r>
+              <w:rPr>
+                <w:b/>
+                <w:bCs/>
+              </w:rPr>
+              <w:t xml:space="preserve">[x]</w:t>
             </w:r>
           </w:p>
         </w:tc>
@@ -1086,7 +1303,7 @@
         <w:pStyle w:val="Compact"/>
         <w:numPr>
           <w:ilvl w:val="0"/>
-          <w:numId w:val="1003"/>
+          <w:numId w:val="1004"/>
         </w:numPr>
       </w:pPr>
       <w:r>
@@ -1098,79 +1315,6 @@
       </w:r>
       <w:r>
         <w:t xml:space="preserve">, de forma automática desde el inicio: observación de punto fijo.</w:t>
-      </w:r>
-    </w:p>
-    <w:p>
-      <w:pPr>
-        <w:pStyle w:val="Compact"/>
-        <w:numPr>
-          <w:ilvl w:val="0"/>
-          <w:numId w:val="1003"/>
-        </w:numPr>
-      </w:pPr>
-      <w:r>
-        <w:rPr>
-          <w:b/>
-          <w:bCs/>
-        </w:rPr>
-        <w:t xml:space="preserve">A un año de la capacitación: el equipo costarricense viaja a la República Dominicana.</w:t>
-      </w:r>
-      <w:r>
-        <w:t xml:space="preserve"> </w:t>
-      </w:r>
-      <w:r>
-        <w:t xml:space="preserve">No es una evaluación de escritorio — se viene a ver si el ciclo está funcionando y, si hay problemas, se resuelven allí mismo, en persona.</w:t>
-      </w:r>
-      <w:r>
-        <w:t xml:space="preserve"> </w:t>
-      </w:r>
-      <w:r>
-        <w:rPr>
-          <w:b/>
-          <w:bCs/>
-        </w:rPr>
-        <w:t xml:space="preserve">Quien enseñó va a ver el resultado.</w:t>
-      </w:r>
-    </w:p>
-    <w:p>
-      <w:pPr>
-        <w:pStyle w:val="FirstParagraph"/>
-      </w:pPr>
-      <w:r>
-        <w:rPr>
-          <w:i/>
-          <w:iCs/>
-        </w:rPr>
-        <w:t xml:space="preserve">Sobre la Conferencia: la sede y la fecha aún no están definidas; la conversación con el gobierno acaba de comenzar. La de 2025 fue en agosto, y sobre ese supuesto se organiza el calendario. Como la evaluación queda cerrada en el primer trimestre, el proyecto puede responder cualquiera que sea la fecha final.</w:t>
-      </w:r>
-    </w:p>
-    <w:p>
-      <w:r>
-        <w:pict>
-          <v:rect style="width:0;height:1.5pt" o:hralign="center" o:hrstd="t" o:hr="t"/>
-        </w:pict>
-      </w:r>
-    </w:p>
-    <w:bookmarkEnd w:id="13"/>
-    <w:bookmarkStart w:id="14" w:name="Xc95e791bdaf904c07c11b681b7057bc02ebf13f"/>
-    <w:p>
-      <w:pPr>
-        <w:pStyle w:val="Heading2"/>
-      </w:pPr>
-      <w:r>
-        <w:t xml:space="preserve">6. Quiénes participan</w:t>
-      </w:r>
-    </w:p>
-    <w:p>
-      <w:pPr>
-        <w:pStyle w:val="FirstParagraph"/>
-      </w:pPr>
-      <w:r>
-        <w:rPr>
-          <w:b/>
-          <w:bCs/>
-        </w:rPr>
-        <w:t xml:space="preserve">Personas usuarias del piloto — unas 10 [x — por acordar]</w:t>
       </w:r>
     </w:p>
     <w:p>
@@ -1186,85 +1330,52 @@
           <w:b/>
           <w:bCs/>
         </w:rPr>
-        <w:t xml:space="preserve">Sin concentrarse en la capital:</w:t>
-      </w:r>
-      <w:r>
-        <w:t xml:space="preserve"> </w:t>
-      </w:r>
-      <w:r>
-        <w:t xml:space="preserve">el piloto debe alcanzar también a las provincias.</w:t>
-      </w:r>
-    </w:p>
-    <w:p>
-      <w:pPr>
-        <w:pStyle w:val="Compact"/>
-        <w:numPr>
-          <w:ilvl w:val="0"/>
-          <w:numId w:val="1004"/>
-        </w:numPr>
-      </w:pPr>
-      <w:r>
-        <w:rPr>
-          <w:b/>
-          <w:bCs/>
-        </w:rPr>
-        <w:t xml:space="preserve">Sin sesgo de sexo ni de tipo de discapacidad.</w:t>
-      </w:r>
-      <w:r>
-        <w:t xml:space="preserve"> </w:t>
-      </w:r>
-      <w:r>
-        <w:t xml:space="preserve">El marco del proyecto es de género, pero para que los datos sirvan, el conjunto de personas usuarias no puede estar sesgado.</w:t>
-      </w:r>
-    </w:p>
-    <w:p>
-      <w:pPr>
-        <w:pStyle w:val="BlockText"/>
-      </w:pPr>
-      <w:r>
-        <w:t xml:space="preserve">Es decir: la agenda de género define</w:t>
-      </w:r>
-      <w:r>
-        <w:t xml:space="preserve"> </w:t>
-      </w:r>
-      <w:r>
-        <w:rPr>
-          <w:b/>
-          <w:bCs/>
-        </w:rPr>
-        <w:t xml:space="preserve">el marco y la conducción</w:t>
-      </w:r>
-      <w:r>
-        <w:t xml:space="preserve">; no restringe</w:t>
-      </w:r>
-      <w:r>
-        <w:t xml:space="preserve"> </w:t>
-      </w:r>
-      <w:r>
-        <w:rPr>
-          <w:b/>
-          <w:bCs/>
-        </w:rPr>
-        <w:t xml:space="preserve">a quién llega el servicio</w:t>
-      </w:r>
-      <w:r>
-        <w:t xml:space="preserve">. Eso permite sostener después que</w:t>
-      </w:r>
-      <w:r>
-        <w:t xml:space="preserve"> </w:t>
-      </w:r>
+        <w:t xml:space="preserve">A un año de la capacitación: el equipo costarricense viaja a la República Dominicana.</w:t>
+      </w:r>
+      <w:r>
+        <w:t xml:space="preserve"> </w:t>
+      </w:r>
+      <w:r>
+        <w:t xml:space="preserve">No es una evaluación de escritorio — se viene a ver si el ciclo está funcionando y, si hay problemas, se resuelven allí mismo, en persona.</w:t>
+      </w:r>
+      <w:r>
+        <w:t xml:space="preserve"> </w:t>
+      </w:r>
+      <w:r>
+        <w:rPr>
+          <w:b/>
+          <w:bCs/>
+        </w:rPr>
+        <w:t xml:space="preserve">Quien enseñó va a ver el resultado.</w:t>
+      </w:r>
+    </w:p>
+    <w:p>
+      <w:pPr>
+        <w:pStyle w:val="FirstParagraph"/>
+      </w:pPr>
       <w:r>
         <w:rPr>
           <w:i/>
           <w:iCs/>
         </w:rPr>
-        <w:t xml:space="preserve">la asistencia personal funciona, y su diseño se hizo desde una mirada de género</w:t>
-      </w:r>
-      <w:r>
-        <w:t xml:space="preserve"> </w:t>
-      </w:r>
-      <w:r>
-        <w:t xml:space="preserve">— un argumento más amplio que el de un servicio para un grupo.</w:t>
+        <w:t xml:space="preserve">Sobre la Conferencia: la sede y la fecha aún no están definidas; la conversación con el gobierno acaba de comenzar. La de 2025 fue en agosto, y sobre ese supuesto se organiza el calendario. Como la evaluación queda cerrada en el primer trimestre, el proyecto puede responder cualquiera que sea la fecha final.</w:t>
+      </w:r>
+    </w:p>
+    <w:p>
+      <w:r>
+        <w:pict>
+          <v:rect style="width:0;height:1.5pt" o:hralign="center" o:hrstd="t" o:hr="t"/>
+        </w:pict>
+      </w:r>
+    </w:p>
+    <w:bookmarkEnd w:id="17"/>
+    <w:bookmarkStart w:id="18" w:name="Xc95e791bdaf904c07c11b681b7057bc02ebf13f"/>
+    <w:p>
+      <w:pPr>
+        <w:pStyle w:val="Heading2"/>
+      </w:pPr>
+      <w:r>
+        <w:t xml:space="preserve">6. Quiénes participan</w:t>
       </w:r>
     </w:p>
     <w:p>
@@ -1276,7 +1387,7 @@
           <w:b/>
           <w:bCs/>
         </w:rPr>
-        <w:t xml:space="preserve">Conducción y ejecución</w:t>
+        <w:t xml:space="preserve">Personas usuarias del piloto — unas 10 [x — por acordar]</w:t>
       </w:r>
     </w:p>
     <w:p>
@@ -1292,13 +1403,13 @@
           <w:b/>
           <w:bCs/>
         </w:rPr>
-        <w:t xml:space="preserve">CIMUDIS</w:t>
-      </w:r>
-      <w:r>
-        <w:t xml:space="preserve"> </w:t>
-      </w:r>
-      <w:r>
-        <w:t xml:space="preserve">— sujeto del proyecto e interlocutor político ante el Ministerio de la Mujer.</w:t>
+        <w:t xml:space="preserve">Sin concentrarse en la capital:</w:t>
+      </w:r>
+      <w:r>
+        <w:t xml:space="preserve"> </w:t>
+      </w:r>
+      <w:r>
+        <w:t xml:space="preserve">el piloto debe alcanzar también a las provincias.</w:t>
       </w:r>
     </w:p>
     <w:p>
@@ -1314,32 +1425,63 @@
           <w:b/>
           <w:bCs/>
         </w:rPr>
-        <w:t xml:space="preserve">RELAVIN</w:t>
-      </w:r>
-      <w:r>
-        <w:t xml:space="preserve"> </w:t>
-      </w:r>
-      <w:r>
-        <w:t xml:space="preserve">— acompañamiento técnico regional.</w:t>
-      </w:r>
-    </w:p>
-    <w:p>
-      <w:pPr>
-        <w:pStyle w:val="Compact"/>
-        <w:numPr>
-          <w:ilvl w:val="0"/>
-          <w:numId w:val="1005"/>
-        </w:numPr>
-      </w:pPr>
-      <w:r>
-        <w:rPr>
-          <w:b/>
-          <w:bCs/>
-        </w:rPr>
-        <w:t xml:space="preserve">RELAVIN — coordinación general del proyecto</w:t>
-      </w:r>
-      <w:r>
-        <w:t xml:space="preserve">, articulando las cuatro líneas que se necesitan a la vez: la República Dominicana, Costa Rica (Morpho), la OIT y JICA.</w:t>
+        <w:t xml:space="preserve">Sin sesgo de sexo ni de tipo de discapacidad.</w:t>
+      </w:r>
+      <w:r>
+        <w:t xml:space="preserve"> </w:t>
+      </w:r>
+      <w:r>
+        <w:t xml:space="preserve">El marco del proyecto es de género, pero para que los datos sirvan, el conjunto de personas usuarias no puede estar sesgado.</w:t>
+      </w:r>
+    </w:p>
+    <w:p>
+      <w:pPr>
+        <w:pStyle w:val="BlockText"/>
+      </w:pPr>
+      <w:r>
+        <w:t xml:space="preserve">Es decir: la agenda de género define</w:t>
+      </w:r>
+      <w:r>
+        <w:t xml:space="preserve"> </w:t>
+      </w:r>
+      <w:r>
+        <w:rPr>
+          <w:b/>
+          <w:bCs/>
+        </w:rPr>
+        <w:t xml:space="preserve">el marco y la conducción</w:t>
+      </w:r>
+      <w:r>
+        <w:t xml:space="preserve">; no restringe</w:t>
+      </w:r>
+      <w:r>
+        <w:t xml:space="preserve"> </w:t>
+      </w:r>
+      <w:r>
+        <w:rPr>
+          <w:b/>
+          <w:bCs/>
+        </w:rPr>
+        <w:t xml:space="preserve">a quién llega el servicio</w:t>
+      </w:r>
+      <w:r>
+        <w:t xml:space="preserve">. Eso permite sostener después que</w:t>
+      </w:r>
+      <w:r>
+        <w:t xml:space="preserve"> </w:t>
+      </w:r>
+      <w:r>
+        <w:rPr>
+          <w:i/>
+          <w:iCs/>
+        </w:rPr>
+        <w:t xml:space="preserve">la asistencia personal funciona, y su diseño se hizo desde una mirada de género</w:t>
+      </w:r>
+      <w:r>
+        <w:t xml:space="preserve"> </w:t>
+      </w:r>
+      <w:r>
+        <w:t xml:space="preserve">— un argumento más amplio que el de un servicio para un grupo.</w:t>
       </w:r>
     </w:p>
     <w:p>
@@ -1351,56 +1493,7 @@
           <w:b/>
           <w:bCs/>
         </w:rPr>
-        <w:t xml:space="preserve">Contrapartes institucionales</w:t>
-      </w:r>
-    </w:p>
-    <w:p>
-      <w:pPr>
-        <w:pStyle w:val="BodyText"/>
-      </w:pPr>
-      <w:r>
-        <w:t xml:space="preserve">Ministerio de la Mujer · CONADIS · FONADIS · Supérate · INFOTEP · asociación de rehabilitación</w:t>
-      </w:r>
-    </w:p>
-    <w:p>
-      <w:r>
-        <w:pict>
-          <v:rect style="width:0;height:1.5pt" o:hralign="center" o:hrstd="t" o:hr="t"/>
-        </w:pict>
-      </w:r>
-    </w:p>
-    <w:bookmarkEnd w:id="14"/>
-    <w:bookmarkStart w:id="15" w:name="X36cc086c8b2aab8c110e89926ddf57fb857eff4"/>
-    <w:p>
-      <w:pPr>
-        <w:pStyle w:val="Heading2"/>
-      </w:pPr>
-      <w:r>
-        <w:t xml:space="preserve">7. La capacitación en Costa Rica (2027, 1.er trimestre)</w:t>
-      </w:r>
-    </w:p>
-    <w:p>
-      <w:pPr>
-        <w:pStyle w:val="FirstParagraph"/>
-      </w:pPr>
-      <w:r>
-        <w:rPr>
-          <w:b/>
-          <w:bCs/>
-        </w:rPr>
-        <w:t xml:space="preserve">Unas 10 personas · dos semanas aproximadamente</w:t>
-      </w:r>
-    </w:p>
-    <w:p>
-      <w:pPr>
-        <w:pStyle w:val="BodyText"/>
-      </w:pPr>
-      <w:r>
-        <w:rPr>
-          <w:b/>
-          <w:bCs/>
-        </w:rPr>
-        <w:t xml:space="preserve">Composición</w:t>
+        <w:t xml:space="preserve">Conducción y ejecución</w:t>
       </w:r>
     </w:p>
     <w:p>
@@ -1412,17 +1505,17 @@
         </w:numPr>
       </w:pPr>
       <w:r>
-        <w:t xml:space="preserve">Núcleo:</w:t>
-      </w:r>
-      <w:r>
-        <w:t xml:space="preserve"> </w:t>
-      </w:r>
-      <w:r>
-        <w:rPr>
-          <w:b/>
-          <w:bCs/>
-        </w:rPr>
-        <w:t xml:space="preserve">personas con discapacidad de CIMUDIS</w:t>
+        <w:rPr>
+          <w:b/>
+          <w:bCs/>
+        </w:rPr>
+        <w:t xml:space="preserve">CIMUDIS</w:t>
+      </w:r>
+      <w:r>
+        <w:t xml:space="preserve"> </w:t>
+      </w:r>
+      <w:r>
+        <w:t xml:space="preserve">— sujeto del proyecto e interlocutor político ante el Ministerio de la Mujer.</w:t>
       </w:r>
     </w:p>
     <w:p>
@@ -1434,23 +1527,36 @@
         </w:numPr>
       </w:pPr>
       <w:r>
-        <w:t xml:space="preserve">Además:</w:t>
-      </w:r>
-      <w:r>
-        <w:t xml:space="preserve"> </w:t>
-      </w:r>
-      <w:r>
-        <w:rPr>
-          <w:b/>
-          <w:bCs/>
-        </w:rPr>
-        <w:t xml:space="preserve">CONADIS, la asociación de rehabilitación, Supérate, INFOTEP</w:t>
-      </w:r>
-      <w:r>
-        <w:t xml:space="preserve"> </w:t>
-      </w:r>
-      <w:r>
-        <w:t xml:space="preserve">y demás instituciones concernidas</w:t>
+        <w:rPr>
+          <w:b/>
+          <w:bCs/>
+        </w:rPr>
+        <w:t xml:space="preserve">RELAVIN</w:t>
+      </w:r>
+      <w:r>
+        <w:t xml:space="preserve"> </w:t>
+      </w:r>
+      <w:r>
+        <w:t xml:space="preserve">— acompañamiento técnico regional.</w:t>
+      </w:r>
+    </w:p>
+    <w:p>
+      <w:pPr>
+        <w:pStyle w:val="Compact"/>
+        <w:numPr>
+          <w:ilvl w:val="0"/>
+          <w:numId w:val="1006"/>
+        </w:numPr>
+      </w:pPr>
+      <w:r>
+        <w:rPr>
+          <w:b/>
+          <w:bCs/>
+        </w:rPr>
+        <w:t xml:space="preserve">RELAVIN — coordinación general del proyecto</w:t>
+      </w:r>
+      <w:r>
+        <w:t xml:space="preserve">, articulando las cuatro líneas que se necesitan a la vez: la República Dominicana, Costa Rica (Morpho), la OIT y JICA.</w:t>
       </w:r>
     </w:p>
     <w:p>
@@ -1462,7 +1568,56 @@
           <w:b/>
           <w:bCs/>
         </w:rPr>
-        <w:t xml:space="preserve">Contenido</w:t>
+        <w:t xml:space="preserve">Contrapartes institucionales</w:t>
+      </w:r>
+    </w:p>
+    <w:p>
+      <w:pPr>
+        <w:pStyle w:val="BodyText"/>
+      </w:pPr>
+      <w:r>
+        <w:t xml:space="preserve">Ministerio de la Mujer · CONADIS · FONADIS · Supérate · INFOTEP · asociación de rehabilitación</w:t>
+      </w:r>
+    </w:p>
+    <w:p>
+      <w:r>
+        <w:pict>
+          <v:rect style="width:0;height:1.5pt" o:hralign="center" o:hrstd="t" o:hr="t"/>
+        </w:pict>
+      </w:r>
+    </w:p>
+    <w:bookmarkEnd w:id="18"/>
+    <w:bookmarkStart w:id="19" w:name="X36cc086c8b2aab8c110e89926ddf57fb857eff4"/>
+    <w:p>
+      <w:pPr>
+        <w:pStyle w:val="Heading2"/>
+      </w:pPr>
+      <w:r>
+        <w:t xml:space="preserve">7. La capacitación en Costa Rica (2027, 1.er trimestre)</w:t>
+      </w:r>
+    </w:p>
+    <w:p>
+      <w:pPr>
+        <w:pStyle w:val="FirstParagraph"/>
+      </w:pPr>
+      <w:r>
+        <w:rPr>
+          <w:b/>
+          <w:bCs/>
+        </w:rPr>
+        <w:t xml:space="preserve">Unas 10 personas · dos semanas aproximadamente</w:t>
+      </w:r>
+    </w:p>
+    <w:p>
+      <w:pPr>
+        <w:pStyle w:val="BodyText"/>
+      </w:pPr>
+      <w:r>
+        <w:rPr>
+          <w:b/>
+          <w:bCs/>
+        </w:rPr>
+        <w:t xml:space="preserve">Composición</w:t>
       </w:r>
     </w:p>
     <w:p>
@@ -1474,23 +1629,17 @@
         </w:numPr>
       </w:pPr>
       <w:r>
-        <w:t xml:space="preserve">Eje central:</w:t>
-      </w:r>
-      <w:r>
-        <w:t xml:space="preserve"> </w:t>
-      </w:r>
-      <w:r>
-        <w:rPr>
-          <w:b/>
-          <w:bCs/>
-        </w:rPr>
-        <w:t xml:space="preserve">aprender cómo trabaja un centro de vida independiente</w:t>
-      </w:r>
-      <w:r>
-        <w:t xml:space="preserve"> </w:t>
-      </w:r>
-      <w:r>
-        <w:t xml:space="preserve">— la operación real, no la teoría</w:t>
+        <w:t xml:space="preserve">Núcleo:</w:t>
+      </w:r>
+      <w:r>
+        <w:t xml:space="preserve"> </w:t>
+      </w:r>
+      <w:r>
+        <w:rPr>
+          <w:b/>
+          <w:bCs/>
+        </w:rPr>
+        <w:t xml:space="preserve">personas con discapacidad de CIMUDIS</w:t>
       </w:r>
     </w:p>
     <w:p>
@@ -1502,46 +1651,23 @@
         </w:numPr>
       </w:pPr>
       <w:r>
-        <w:rPr>
-          <w:b/>
-          <w:bCs/>
-        </w:rPr>
-        <w:t xml:space="preserve">Tres días de taller de consejería de pares</w:t>
-      </w:r>
-      <w:r>
-        <w:t xml:space="preserve"> </w:t>
-      </w:r>
-      <w:r>
-        <w:t xml:space="preserve">para las personas con discapacidad</w:t>
-      </w:r>
-    </w:p>
-    <w:p>
-      <w:pPr>
-        <w:pStyle w:val="Compact"/>
-        <w:numPr>
-          <w:ilvl w:val="0"/>
-          <w:numId w:val="1007"/>
-        </w:numPr>
-      </w:pPr>
-      <w:r>
-        <w:rPr>
-          <w:b/>
-          <w:bCs/>
-        </w:rPr>
-        <w:t xml:space="preserve">Visitas al CONAPDIS</w:t>
-      </w:r>
-      <w:r>
-        <w:t xml:space="preserve">: sede central y</w:t>
-      </w:r>
-      <w:r>
-        <w:t xml:space="preserve"> </w:t>
-      </w:r>
-      <w:r>
-        <w:rPr>
-          <w:b/>
-          <w:bCs/>
-        </w:rPr>
-        <w:t xml:space="preserve">oficina regional de Brunca</w:t>
+        <w:t xml:space="preserve">Además:</w:t>
+      </w:r>
+      <w:r>
+        <w:t xml:space="preserve"> </w:t>
+      </w:r>
+      <w:r>
+        <w:rPr>
+          <w:b/>
+          <w:bCs/>
+        </w:rPr>
+        <w:t xml:space="preserve">CONADIS, la asociación de rehabilitación, Supérate, INFOTEP</w:t>
+      </w:r>
+      <w:r>
+        <w:t xml:space="preserve"> </w:t>
+      </w:r>
+      <w:r>
+        <w:t xml:space="preserve">y demás instituciones concernidas</w:t>
       </w:r>
     </w:p>
     <w:p>
@@ -1553,129 +1679,7 @@
           <w:b/>
           <w:bCs/>
         </w:rPr>
-        <w:t xml:space="preserve">Por qué llevar a las instituciones públicas junto con el movimiento:</w:t>
-      </w:r>
-      <w:r>
-        <w:t xml:space="preserve"> </w:t>
-      </w:r>
-      <w:r>
-        <w:t xml:space="preserve">explicar un sistema con palabras es difícil.</w:t>
-      </w:r>
-      <w:r>
-        <w:t xml:space="preserve"> </w:t>
-      </w:r>
-      <w:r>
-        <w:rPr>
-          <w:b/>
-          <w:bCs/>
-        </w:rPr>
-        <w:t xml:space="preserve">Se ve funcionando en Costa Rica, y a partir de ahí la conversación pasa a ser «¿y cómo hacemos esto nosotros?».</w:t>
-      </w:r>
-      <w:r>
-        <w:t xml:space="preserve"> </w:t>
-      </w:r>
-      <w:r>
-        <w:t xml:space="preserve">Es una discusión distinta a la de una mesa técnica.</w:t>
-      </w:r>
-    </w:p>
-    <w:p>
-      <w:r>
-        <w:pict>
-          <v:rect style="width:0;height:1.5pt" o:hralign="center" o:hrstd="t" o:hr="t"/>
-        </w:pict>
-      </w:r>
-    </w:p>
-    <w:bookmarkEnd w:id="15"/>
-    <w:bookmarkStart w:id="16" w:name="X98b4899c1985497138b84a377d48cbecf0a84ee"/>
-    <w:p>
-      <w:pPr>
-        <w:pStyle w:val="Heading2"/>
-      </w:pPr>
-      <w:r>
-        <w:t xml:space="preserve">8. El programa de formación de asistentes personales — condición previa</w:t>
-      </w:r>
-    </w:p>
-    <w:p>
-      <w:pPr>
-        <w:pStyle w:val="FirstParagraph"/>
-      </w:pPr>
-      <w:r>
-        <w:rPr>
-          <w:b/>
-          <w:bCs/>
-        </w:rPr>
-        <w:t xml:space="preserve">Sistematizar la experiencia de Morpho en un programa de formación de asistentes personales, y terminarlo.</w:t>
-      </w:r>
-    </w:p>
-    <w:p>
-      <w:pPr>
-        <w:pStyle w:val="BodyText"/>
-      </w:pPr>
-      <w:r>
-        <w:t xml:space="preserve">Sin eso, el movimiento de RELAVIN no puede expandirse en la región: cada país tendría que reinventar la formación desde cero.</w:t>
-      </w:r>
-      <w:r>
-        <w:t xml:space="preserve"> </w:t>
-      </w:r>
-      <w:r>
-        <w:rPr>
-          <w:b/>
-          <w:bCs/>
-        </w:rPr>
-        <w:t xml:space="preserve">Quedan dos años.</w:t>
-      </w:r>
-    </w:p>
-    <w:p>
-      <w:pPr>
-        <w:pStyle w:val="BodyText"/>
-      </w:pPr>
-      <w:r>
-        <w:t xml:space="preserve">Este proyecto es a la vez el primer caso de aplicación de ese programa y la ocasión de terminarlo.</w:t>
-      </w:r>
-    </w:p>
-    <w:p>
-      <w:r>
-        <w:pict>
-          <v:rect style="width:0;height:1.5pt" o:hralign="center" o:hrstd="t" o:hr="t"/>
-        </w:pict>
-      </w:r>
-    </w:p>
-    <w:bookmarkEnd w:id="16"/>
-    <w:bookmarkStart w:id="17" w:name="Xef732971e381e0846133eb8f2d28db8d757f22c"/>
-    <w:p>
-      <w:pPr>
-        <w:pStyle w:val="Heading2"/>
-      </w:pPr>
-      <w:r>
-        <w:t xml:space="preserve">9. Dónde empieza — y el sistema de coordinación</w:t>
-      </w:r>
-    </w:p>
-    <w:p>
-      <w:pPr>
-        <w:pStyle w:val="FirstParagraph"/>
-      </w:pPr>
-      <w:r>
-        <w:rPr>
-          <w:b/>
-          <w:bCs/>
-        </w:rPr>
-        <w:t xml:space="preserve">El proyecto no arranca abriendo una sede.</w:t>
-      </w:r>
-      <w:r>
-        <w:t xml:space="preserve"> </w:t>
-      </w:r>
-      <w:r>
-        <w:t xml:space="preserve">Lo que se busca primero es</w:t>
-      </w:r>
-      <w:r>
-        <w:t xml:space="preserve"> </w:t>
-      </w:r>
-      <w:r>
-        <w:rPr>
-          <w:b/>
-          <w:bCs/>
-        </w:rPr>
-        <w:t xml:space="preserve">poner en marcha la formación de asistentes personales junto con la organización de personas con discapacidad, el CONADIS y el INFOTEP, y ver cómo funciona.</w:t>
+        <w:t xml:space="preserve">Contenido</w:t>
       </w:r>
     </w:p>
     <w:p>
@@ -1687,17 +1691,23 @@
         </w:numPr>
       </w:pPr>
       <w:r>
-        <w:rPr>
-          <w:b/>
-          <w:bCs/>
-        </w:rPr>
-        <w:t xml:space="preserve">Al inicio, el CONADIS facilita el espacio.</w:t>
-      </w:r>
-      <w:r>
-        <w:t xml:space="preserve"> </w:t>
-      </w:r>
-      <w:r>
-        <w:t xml:space="preserve">Se empieza ahí.</w:t>
+        <w:t xml:space="preserve">Eje central:</w:t>
+      </w:r>
+      <w:r>
+        <w:t xml:space="preserve"> </w:t>
+      </w:r>
+      <w:r>
+        <w:rPr>
+          <w:b/>
+          <w:bCs/>
+        </w:rPr>
+        <w:t xml:space="preserve">aprender cómo trabaja un centro de vida independiente</w:t>
+      </w:r>
+      <w:r>
+        <w:t xml:space="preserve"> </w:t>
+      </w:r>
+      <w:r>
+        <w:t xml:space="preserve">— la operación real, no la teoría</w:t>
       </w:r>
     </w:p>
     <w:p>
@@ -1713,10 +1723,42 @@
           <w:b/>
           <w:bCs/>
         </w:rPr>
-        <w:t xml:space="preserve">Abrir la sede propia del centro es el objetivo a 2030</w:t>
-      </w:r>
-      <w:r>
-        <w:t xml:space="preserve">, no el punto de partida. Llega cuando el ciclo esté funcionando y haya con qué sostenerla.</w:t>
+        <w:t xml:space="preserve">Tres días de taller de consejería de pares</w:t>
+      </w:r>
+      <w:r>
+        <w:t xml:space="preserve"> </w:t>
+      </w:r>
+      <w:r>
+        <w:t xml:space="preserve">para las personas con discapacidad</w:t>
+      </w:r>
+    </w:p>
+    <w:p>
+      <w:pPr>
+        <w:pStyle w:val="Compact"/>
+        <w:numPr>
+          <w:ilvl w:val="0"/>
+          <w:numId w:val="1008"/>
+        </w:numPr>
+      </w:pPr>
+      <w:r>
+        <w:rPr>
+          <w:b/>
+          <w:bCs/>
+        </w:rPr>
+        <w:t xml:space="preserve">Visitas al CONAPDIS</w:t>
+      </w:r>
+      <w:r>
+        <w:t xml:space="preserve">: sede central y</w:t>
+      </w:r>
+      <w:r>
+        <w:t xml:space="preserve"> </w:t>
+      </w:r>
+      <w:r>
+        <w:rPr>
+          <w:b/>
+          <w:bCs/>
+        </w:rPr>
+        <w:t xml:space="preserve">oficina regional de Brunca</w:t>
       </w:r>
     </w:p>
     <w:p>
@@ -1728,7 +1770,7 @@
           <w:b/>
           <w:bCs/>
         </w:rPr>
-        <w:t xml:space="preserve">El sistema de coordinación</w:t>
+        <w:t xml:space="preserve">A la vuelta: encuentro con las personas facilitadoras certificadas en 2024</w:t>
       </w:r>
     </w:p>
     <w:p>
@@ -1736,20 +1778,170 @@
         <w:pStyle w:val="BodyText"/>
       </w:pPr>
       <w:r>
-        <w:t xml:space="preserve">Para esa etapa inicial se adopta</w:t>
-      </w:r>
-      <w:r>
-        <w:t xml:space="preserve"> </w:t>
-      </w:r>
-      <w:r>
-        <w:rPr>
-          <w:b/>
-          <w:bCs/>
-        </w:rPr>
-        <w:t xml:space="preserve">el sistema que Morpho opera por internet</w:t>
-      </w:r>
-      <w:r>
-        <w:t xml:space="preserve">.</w:t>
+        <w:t xml:space="preserve">Una de las primeras actividades después de la capacitación es</w:t>
+      </w:r>
+      <w:r>
+        <w:t xml:space="preserve"> </w:t>
+      </w:r>
+      <w:r>
+        <w:rPr>
+          <w:b/>
+          <w:bCs/>
+        </w:rPr>
+        <w:t xml:space="preserve">convocar a las 29 personas certificadas en febrero de 2024</w:t>
+      </w:r>
+      <w:r>
+        <w:t xml:space="preserve"> </w:t>
+      </w:r>
+      <w:r>
+        <w:t xml:space="preserve">y sentarse con ellas: qué se preparó entonces, por qué quedó detenido, y</w:t>
+      </w:r>
+      <w:r>
+        <w:t xml:space="preserve"> </w:t>
+      </w:r>
+      <w:r>
+        <w:rPr>
+          <w:b/>
+          <w:bCs/>
+        </w:rPr>
+        <w:t xml:space="preserve">en qué puede cada quien colaborar ahora</w:t>
+      </w:r>
+      <w:r>
+        <w:t xml:space="preserve">. Son quienes ya recibieron esta formación en el país; el piloto no puede armarse sin ellas.</w:t>
+      </w:r>
+    </w:p>
+    <w:p>
+      <w:pPr>
+        <w:pStyle w:val="BodyText"/>
+      </w:pPr>
+      <w:r>
+        <w:rPr>
+          <w:b/>
+          <w:bCs/>
+        </w:rPr>
+        <w:t xml:space="preserve">Por qué llevar a las instituciones públicas junto con el movimiento:</w:t>
+      </w:r>
+      <w:r>
+        <w:t xml:space="preserve"> </w:t>
+      </w:r>
+      <w:r>
+        <w:t xml:space="preserve">explicar un sistema con palabras es difícil.</w:t>
+      </w:r>
+      <w:r>
+        <w:t xml:space="preserve"> </w:t>
+      </w:r>
+      <w:r>
+        <w:rPr>
+          <w:b/>
+          <w:bCs/>
+        </w:rPr>
+        <w:t xml:space="preserve">Se ve funcionando en Costa Rica, y a partir de ahí la conversación pasa a ser «¿y cómo hacemos esto nosotros?».</w:t>
+      </w:r>
+      <w:r>
+        <w:t xml:space="preserve"> </w:t>
+      </w:r>
+      <w:r>
+        <w:t xml:space="preserve">Es una discusión distinta a la de una mesa técnica.</w:t>
+      </w:r>
+    </w:p>
+    <w:p>
+      <w:r>
+        <w:pict>
+          <v:rect style="width:0;height:1.5pt" o:hralign="center" o:hrstd="t" o:hr="t"/>
+        </w:pict>
+      </w:r>
+    </w:p>
+    <w:bookmarkEnd w:id="19"/>
+    <w:bookmarkStart w:id="20" w:name="X98b4899c1985497138b84a377d48cbecf0a84ee"/>
+    <w:p>
+      <w:pPr>
+        <w:pStyle w:val="Heading2"/>
+      </w:pPr>
+      <w:r>
+        <w:t xml:space="preserve">8. El programa de formación de asistentes personales — condición previa</w:t>
+      </w:r>
+    </w:p>
+    <w:p>
+      <w:pPr>
+        <w:pStyle w:val="FirstParagraph"/>
+      </w:pPr>
+      <w:r>
+        <w:rPr>
+          <w:b/>
+          <w:bCs/>
+        </w:rPr>
+        <w:t xml:space="preserve">Sistematizar la experiencia de Morpho en un programa de formación de asistentes personales, y terminarlo.</w:t>
+      </w:r>
+    </w:p>
+    <w:p>
+      <w:pPr>
+        <w:pStyle w:val="BodyText"/>
+      </w:pPr>
+      <w:r>
+        <w:t xml:space="preserve">Sin eso, el movimiento de RELAVIN no puede expandirse en la región: cada país tendría que reinventar la formación desde cero.</w:t>
+      </w:r>
+      <w:r>
+        <w:t xml:space="preserve"> </w:t>
+      </w:r>
+      <w:r>
+        <w:rPr>
+          <w:b/>
+          <w:bCs/>
+        </w:rPr>
+        <w:t xml:space="preserve">Quedan dos años.</w:t>
+      </w:r>
+    </w:p>
+    <w:p>
+      <w:pPr>
+        <w:pStyle w:val="BodyText"/>
+      </w:pPr>
+      <w:r>
+        <w:t xml:space="preserve">Este proyecto es a la vez el primer caso de aplicación de ese programa y la ocasión de terminarlo.</w:t>
+      </w:r>
+    </w:p>
+    <w:p>
+      <w:r>
+        <w:pict>
+          <v:rect style="width:0;height:1.5pt" o:hralign="center" o:hrstd="t" o:hr="t"/>
+        </w:pict>
+      </w:r>
+    </w:p>
+    <w:bookmarkEnd w:id="20"/>
+    <w:bookmarkStart w:id="21" w:name="Xef732971e381e0846133eb8f2d28db8d757f22c"/>
+    <w:p>
+      <w:pPr>
+        <w:pStyle w:val="Heading2"/>
+      </w:pPr>
+      <w:r>
+        <w:t xml:space="preserve">9. Dónde empieza — y el sistema de coordinación</w:t>
+      </w:r>
+    </w:p>
+    <w:p>
+      <w:pPr>
+        <w:pStyle w:val="FirstParagraph"/>
+      </w:pPr>
+      <w:r>
+        <w:rPr>
+          <w:b/>
+          <w:bCs/>
+        </w:rPr>
+        <w:t xml:space="preserve">El proyecto no arranca abriendo una sede.</w:t>
+      </w:r>
+      <w:r>
+        <w:t xml:space="preserve"> </w:t>
+      </w:r>
+      <w:r>
+        <w:t xml:space="preserve">Lo que se busca primero es</w:t>
+      </w:r>
+      <w:r>
+        <w:t xml:space="preserve"> </w:t>
+      </w:r>
+      <w:r>
+        <w:rPr>
+          <w:b/>
+          <w:bCs/>
+        </w:rPr>
+        <w:t xml:space="preserve">poner en marcha la formación de asistentes personales junto con la organización de personas con discapacidad, el CONADIS y el INFOTEP, y ver cómo funciona.</w:t>
       </w:r>
     </w:p>
     <w:p>
@@ -1761,36 +1953,17 @@
         </w:numPr>
       </w:pPr>
       <w:r>
-        <w:t xml:space="preserve">Ya está probado en Costa Rica,</w:t>
-      </w:r>
-      <w:r>
-        <w:t xml:space="preserve"> </w:t>
-      </w:r>
-      <w:r>
-        <w:rPr>
-          <w:b/>
-          <w:bCs/>
-        </w:rPr>
-        <w:t xml:space="preserve">en centros de vida independiente de provincia que aún no tienen oficina</w:t>
-      </w:r>
-      <w:r>
-        <w:t xml:space="preserve">: permite coordinar</w:t>
-      </w:r>
-      <w:r>
-        <w:t xml:space="preserve"> </w:t>
-      </w:r>
-      <w:r>
-        <w:rPr>
-          <w:b/>
-          <w:bCs/>
-        </w:rPr>
-        <w:t xml:space="preserve">a distancia</w:t>
-      </w:r>
-      <w:r>
-        <w:t xml:space="preserve"> </w:t>
-      </w:r>
-      <w:r>
-        <w:t xml:space="preserve">entre asistentes personales y personas usuarias dispersos en el territorio.</w:t>
+        <w:rPr>
+          <w:b/>
+          <w:bCs/>
+        </w:rPr>
+        <w:t xml:space="preserve">Al inicio, el CONADIS facilita el espacio.</w:t>
+      </w:r>
+      <w:r>
+        <w:t xml:space="preserve"> </w:t>
+      </w:r>
+      <w:r>
+        <w:t xml:space="preserve">Se empieza ahí.</w:t>
       </w:r>
     </w:p>
     <w:p>
@@ -1802,467 +1975,47 @@
         </w:numPr>
       </w:pPr>
       <w:r>
-        <w:t xml:space="preserve">Eso hace posible</w:t>
-      </w:r>
-      <w:r>
-        <w:t xml:space="preserve"> </w:t>
-      </w:r>
-      <w:r>
-        <w:rPr>
-          <w:b/>
-          <w:bCs/>
-        </w:rPr>
-        <w:t xml:space="preserve">llegar a las provincias desde el comienzo</w:t>
-      </w:r>
-      <w:r>
-        <w:t xml:space="preserve">, sin esperar a tener infraestructura.</w:t>
-      </w:r>
-    </w:p>
-    <w:p>
-      <w:pPr>
-        <w:pStyle w:val="Compact"/>
-        <w:numPr>
-          <w:ilvl w:val="0"/>
-          <w:numId w:val="1009"/>
-        </w:numPr>
-      </w:pPr>
-      <w:r>
-        <w:t xml:space="preserve">Los registros de despacho quedan almacenados desde el primer día →</w:t>
-      </w:r>
-      <w:r>
-        <w:t xml:space="preserve"> </w:t>
-      </w:r>
-      <w:r>
-        <w:rPr>
-          <w:b/>
-          <w:bCs/>
-        </w:rPr>
-        <w:t xml:space="preserve">es la base de datos de la evaluación de 2028.</w:t>
-      </w:r>
-    </w:p>
-    <w:p>
-      <w:pPr>
-        <w:pStyle w:val="Compact"/>
-        <w:numPr>
-          <w:ilvl w:val="0"/>
-          <w:numId w:val="1009"/>
-        </w:numPr>
-      </w:pPr>
-      <w:r>
-        <w:rPr>
-          <w:b/>
-          <w:bCs/>
-        </w:rPr>
-        <w:t xml:space="preserve">Y hay un retorno hacia Costa Rica:</w:t>
-      </w:r>
-      <w:r>
-        <w:t xml:space="preserve"> </w:t>
-      </w:r>
-      <w:r>
-        <w:t xml:space="preserve">al adoptarse en la República Dominicana,</w:t>
-      </w:r>
-      <w:r>
-        <w:t xml:space="preserve"> </w:t>
-      </w:r>
-      <w:r>
-        <w:rPr>
-          <w:b/>
-          <w:bCs/>
-        </w:rPr>
-        <w:t xml:space="preserve">Morpho recibe un ingreso</w:t>
-      </w:r>
-      <w:r>
-        <w:t xml:space="preserve">. Es, aunque modesto, actividad económica propia de Morpho y contribuye a su</w:t>
-      </w:r>
-      <w:r>
-        <w:t xml:space="preserve"> </w:t>
-      </w:r>
-      <w:r>
-        <w:rPr>
-          <w:b/>
-          <w:bCs/>
-        </w:rPr>
-        <w:t xml:space="preserve">sostenibilidad</w:t>
+        <w:rPr>
+          <w:b/>
+          <w:bCs/>
+        </w:rPr>
+        <w:t xml:space="preserve">Abrir la sede propia del centro es el objetivo a 2030</w:t>
+      </w:r>
+      <w:r>
+        <w:t xml:space="preserve">, no el punto de partida. Llega cuando el ciclo esté funcionando y haya con qué sostenerla.</w:t>
+      </w:r>
+    </w:p>
+    <w:p>
+      <w:pPr>
+        <w:pStyle w:val="FirstParagraph"/>
+      </w:pPr>
+      <w:r>
+        <w:rPr>
+          <w:b/>
+          <w:bCs/>
+        </w:rPr>
+        <w:t xml:space="preserve">El sistema de coordinación</w:t>
+      </w:r>
+    </w:p>
+    <w:p>
+      <w:pPr>
+        <w:pStyle w:val="BodyText"/>
+      </w:pPr>
+      <w:r>
+        <w:t xml:space="preserve">Para esa etapa inicial se adopta</w:t>
+      </w:r>
+      <w:r>
+        <w:t xml:space="preserve"> </w:t>
+      </w:r>
+      <w:r>
+        <w:rPr>
+          <w:b/>
+          <w:bCs/>
+        </w:rPr>
+        <w:t xml:space="preserve">el sistema que Morpho opera por internet</w:t>
       </w:r>
       <w:r>
         <w:t xml:space="preserve">.</w:t>
-      </w:r>
-    </w:p>
-    <w:p>
-      <w:pPr>
-        <w:pStyle w:val="FirstParagraph"/>
-      </w:pPr>
-      <w:r>
-        <w:rPr>
-          <w:b/>
-          <w:bCs/>
-        </w:rPr>
-        <w:t xml:space="preserve">Costo de uso: [x — por confirmar con Morpho]</w:t>
-      </w:r>
-    </w:p>
-    <w:bookmarkEnd w:id="17"/>
-    <w:bookmarkStart w:id="18" w:name="Xe9ed06b37cd8a4e7b1e8dfb60083bf04edc4964"/>
-    <w:p>
-      <w:pPr>
-        <w:pStyle w:val="Heading2"/>
-      </w:pPr>
-      <w:r>
-        <w:t xml:space="preserve">10. Presupuesto — el criterio</w:t>
-      </w:r>
-    </w:p>
-    <w:p>
-      <w:pPr>
-        <w:pStyle w:val="FirstParagraph"/>
-      </w:pPr>
-      <w:r>
-        <w:rPr>
-          <w:b/>
-          <w:bCs/>
-        </w:rPr>
-        <w:t xml:space="preserve">La mayor parte del presupuesto es el pago de la asistencia personal. [x — tarifa y monto por acordar]</w:t>
-      </w:r>
-    </w:p>
-    <w:p>
-      <w:pPr>
-        <w:pStyle w:val="BodyText"/>
-      </w:pPr>
-      <w:r>
-        <w:t xml:space="preserve">El criterio de diseño es uno:</w:t>
-      </w:r>
-      <w:r>
-        <w:t xml:space="preserve"> </w:t>
-      </w:r>
-      <w:r>
-        <w:rPr>
-          <w:b/>
-          <w:bCs/>
-        </w:rPr>
-        <w:t xml:space="preserve">que el dinero empiece a circular en el terreno lo antes posible.</w:t>
-      </w:r>
-      <w:r>
-        <w:t xml:space="preserve"> </w:t>
-      </w:r>
-      <w:r>
-        <w:t xml:space="preserve">No esperar a que el sistema nacional esté listo — pagar y echar a andar, y que la experiencia sirva después para que el Estado lo asuma.</w:t>
-      </w:r>
-    </w:p>
-    <w:p>
-      <w:pPr>
-        <w:pStyle w:val="BodyText"/>
-      </w:pPr>
-      <w:r>
-        <w:t xml:space="preserve">Es el camino que siguió Morpho: en 2013, antes de la Ley 9379, sostenía la vida independiente de 6 personas usuarias con unos 10 asistentes personales — 919 horas en agosto de ese año, con</w:t>
-      </w:r>
-      <w:r>
-        <w:t xml:space="preserve"> </w:t>
-      </w:r>
-      <w:r>
-        <w:rPr>
-          <w:b/>
-          <w:bCs/>
-        </w:rPr>
-        <w:t xml:space="preserve">22% aportado por el Estado y 78% por el proyecto</w:t>
-      </w:r>
-      <w:r>
-        <w:t xml:space="preserve">. Tras la entrada en vigor de la ley en 2019,</w:t>
-      </w:r>
-      <w:r>
-        <w:t xml:space="preserve"> </w:t>
-      </w:r>
-      <w:r>
-        <w:rPr>
-          <w:b/>
-          <w:bCs/>
-        </w:rPr>
-        <w:t xml:space="preserve">el Estado asumió prácticamente el 100% y la carga del proyecto bajó a cero.</w:t>
-      </w:r>
-    </w:p>
-    <w:p>
-      <w:pPr>
-        <w:pStyle w:val="BodyText"/>
-      </w:pPr>
-      <w:r>
-        <w:rPr>
-          <w:b/>
-          <w:bCs/>
-        </w:rPr>
-        <w:t xml:space="preserve">Para que el centro se sostenga</w:t>
-      </w:r>
-      <w:r>
-        <w:t xml:space="preserve">, hace falta además el planteamiento trabajado con la OIT:</w:t>
-      </w:r>
-      <w:r>
-        <w:t xml:space="preserve"> </w:t>
-      </w:r>
-      <w:r>
-        <w:rPr>
-          <w:b/>
-          <w:bCs/>
-        </w:rPr>
-        <w:t xml:space="preserve">el centro como lugar de trabajo para personas con discapacidad</w:t>
-      </w:r>
-      <w:r>
-        <w:t xml:space="preserve">.</w:t>
-      </w:r>
-    </w:p>
-    <w:p>
-      <w:pPr>
-        <w:pStyle w:val="BodyText"/>
-      </w:pPr>
-      <w:r>
-        <w:t xml:space="preserve">Partidas: pago de asistencia personal (mayoritaria) · capacitación en Costa Rica · sistema de coordinación · operación del centro · evaluación y viajes</w:t>
-      </w:r>
-      <w:r>
-        <w:t xml:space="preserve"> </w:t>
-      </w:r>
-      <w:r>
-        <w:rPr>
-          <w:b/>
-          <w:bCs/>
-        </w:rPr>
-        <w:t xml:space="preserve">[x]</w:t>
-      </w:r>
-    </w:p>
-    <w:p>
-      <w:r>
-        <w:pict>
-          <v:rect style="width:0;height:1.5pt" o:hralign="center" o:hrstd="t" o:hr="t"/>
-        </w:pict>
-      </w:r>
-    </w:p>
-    <w:bookmarkEnd w:id="18"/>
-    <w:bookmarkStart w:id="19" w:name="Xe76011752e37cf528c9d59fbd93aa710a8e7fed"/>
-    <w:p>
-      <w:pPr>
-        <w:pStyle w:val="Heading2"/>
-      </w:pPr>
-      <w:r>
-        <w:t xml:space="preserve">11. Financiamiento</w:t>
-      </w:r>
-    </w:p>
-    <w:p>
-      <w:pPr>
-        <w:pStyle w:val="FirstParagraph"/>
-      </w:pPr>
-      <w:r>
-        <w:rPr>
-          <w:b/>
-          <w:bCs/>
-        </w:rPr>
-        <w:t xml:space="preserve">El orden importa: primero el país, después la banca.</w:t>
-      </w:r>
-    </w:p>
-    <w:p>
-      <w:pPr>
-        <w:pStyle w:val="BodyText"/>
-      </w:pPr>
-      <w:r>
-        <w:t xml:space="preserve">Explicar el proyecto como sistema es difícil.</w:t>
-      </w:r>
-      <w:r>
-        <w:t xml:space="preserve"> </w:t>
-      </w:r>
-      <w:r>
-        <w:rPr>
-          <w:b/>
-          <w:bCs/>
-        </w:rPr>
-        <w:t xml:space="preserve">Primero queremos tener claro el conjunto y conversarlo con las contrapartes dominicanas</w:t>
-      </w:r>
-      <w:r>
-        <w:t xml:space="preserve">; la argumentación ante la banca de desarrollo viene después.</w:t>
-      </w:r>
-    </w:p>
-    <w:p>
-      <w:pPr>
-        <w:pStyle w:val="BodyText"/>
-      </w:pPr>
-      <w:r>
-        <w:rPr>
-          <w:b/>
-          <w:bCs/>
-        </w:rPr>
-        <w:t xml:space="preserve">Punto de partida y titularidad de la propuesta</w:t>
-      </w:r>
-    </w:p>
-    <w:p>
-      <w:pPr>
-        <w:pStyle w:val="BodyText"/>
-      </w:pPr>
-      <w:r>
-        <w:t xml:space="preserve">El recorrido es:</w:t>
-      </w:r>
-      <w:r>
-        <w:t xml:space="preserve"> </w:t>
-      </w:r>
-      <w:r>
-        <w:rPr>
-          <w:b/>
-          <w:bCs/>
-        </w:rPr>
-        <w:t xml:space="preserve">CIMUDIS → CONADIS</w:t>
-      </w:r>
-      <w:r>
-        <w:t xml:space="preserve">, y</w:t>
-      </w:r>
-      <w:r>
-        <w:t xml:space="preserve"> </w:t>
-      </w:r>
-      <w:r>
-        <w:rPr>
-          <w:b/>
-          <w:bCs/>
-        </w:rPr>
-        <w:t xml:space="preserve">la propuesta ante la banca de desarrollo la presenta oficialmente el CONADIS.</w:t>
-      </w:r>
-      <w:r>
-        <w:t xml:space="preserve"> </w:t>
-      </w:r>
-      <w:r>
-        <w:t xml:space="preserve">El proyecto nace del movimiento y se presenta desde la institución rectora del Estado.</w:t>
-      </w:r>
-    </w:p>
-    <w:p>
-      <w:pPr>
-        <w:pStyle w:val="BodyText"/>
-      </w:pPr>
-      <w:r>
-        <w:t xml:space="preserve">A partir de ahí se conversa</w:t>
-      </w:r>
-      <w:r>
-        <w:t xml:space="preserve"> </w:t>
-      </w:r>
-      <w:r>
-        <w:rPr>
-          <w:b/>
-          <w:bCs/>
-        </w:rPr>
-        <w:t xml:space="preserve">cuánto de esto puede cubrirse con recursos nacionales</w:t>
-      </w:r>
-      <w:r>
-        <w:t xml:space="preserve"> </w:t>
-      </w:r>
-      <w:r>
-        <w:t xml:space="preserve">— FONADIS (fondo designado a vida independiente), Supérate / Comunidades de Cuidado, Ministerio de la Mujer.</w:t>
-      </w:r>
-      <w:r>
-        <w:t xml:space="preserve"> </w:t>
-      </w:r>
-      <w:r>
-        <w:rPr>
-          <w:b/>
-          <w:bCs/>
-        </w:rPr>
-        <w:t xml:space="preserve">El presupuesto se presenta completo</w:t>
-      </w:r>
-      <w:r>
-        <w:t xml:space="preserve">, y la proporción entre aporte nacional y financiamiento externo se define en esa conversación, no antes.</w:t>
-      </w:r>
-    </w:p>
-    <w:p>
-      <w:pPr>
-        <w:pStyle w:val="BodyText"/>
-      </w:pPr>
-      <w:r>
-        <w:rPr>
-          <w:b/>
-          <w:bCs/>
-        </w:rPr>
-        <w:t xml:space="preserve">JICA (proyecto previsto desde 2027)</w:t>
-      </w:r>
-    </w:p>
-    <w:p>
-      <w:pPr>
-        <w:pStyle w:val="BodyText"/>
-      </w:pPr>
-      <w:r>
-        <w:t xml:space="preserve">No se trata de que un actor apoye al otro:</w:t>
-      </w:r>
-      <w:r>
-        <w:t xml:space="preserve"> </w:t>
-      </w:r>
-      <w:r>
-        <w:rPr>
-          <w:b/>
-          <w:bCs/>
-        </w:rPr>
-        <w:t xml:space="preserve">son iniciativas de naturaleza distinta y por eso se potencian mutuamente.</w:t>
-      </w:r>
-      <w:r>
-        <w:t xml:space="preserve"> </w:t>
-      </w:r>
-      <w:r>
-        <w:t xml:space="preserve">La intención es que se complementen, y se irá conversando según avance.</w:t>
-      </w:r>
-    </w:p>
-    <w:p>
-      <w:pPr>
-        <w:pStyle w:val="BodyText"/>
-      </w:pPr>
-      <w:r>
-        <w:rPr>
-          <w:b/>
-          <w:bCs/>
-        </w:rPr>
-        <w:t xml:space="preserve">CAF</w:t>
-      </w:r>
-    </w:p>
-    <w:p>
-      <w:pPr>
-        <w:pStyle w:val="BodyText"/>
-      </w:pPr>
-      <w:r>
-        <w:t xml:space="preserve">La CAF financia principalmente a</w:t>
-      </w:r>
-      <w:r>
-        <w:t xml:space="preserve"> </w:t>
-      </w:r>
-      <w:r>
-        <w:rPr>
-          <w:b/>
-          <w:bCs/>
-        </w:rPr>
-        <w:t xml:space="preserve">gobiernos</w:t>
-      </w:r>
-      <w:r>
-        <w:t xml:space="preserve"> </w:t>
-      </w:r>
-      <w:r>
-        <w:t xml:space="preserve">de sus países miembro, mediante créditos y cooperaciones técnicas; con organizaciones de la sociedad civil realiza colaboraciones puntuales, orientadas sobre todo a</w:t>
-      </w:r>
-      <w:r>
-        <w:t xml:space="preserve"> </w:t>
-      </w:r>
-      <w:r>
-        <w:rPr>
-          <w:b/>
-          <w:bCs/>
-        </w:rPr>
-        <w:t xml:space="preserve">estudios, productos de conocimiento, jornadas y consultas</w:t>
-      </w:r>
-      <w:r>
-        <w:t xml:space="preserve">.</w:t>
-      </w:r>
-    </w:p>
-    <w:p>
-      <w:pPr>
-        <w:pStyle w:val="BodyText"/>
-      </w:pPr>
-      <w:r>
-        <w:t xml:space="preserve">Este proyecto encaja con ese marco:</w:t>
-      </w:r>
-      <w:r>
-        <w:t xml:space="preserve"> </w:t>
-      </w:r>
-      <w:r>
-        <w:rPr>
-          <w:b/>
-          <w:bCs/>
-        </w:rPr>
-        <w:t xml:space="preserve">la propuesta la presenta el CONADIS</w:t>
-      </w:r>
-      <w:r>
-        <w:t xml:space="preserve">, y lo que produce es exactamente ese tipo de resultado.</w:t>
       </w:r>
     </w:p>
     <w:p>
@@ -2274,23 +2027,36 @@
         </w:numPr>
       </w:pPr>
       <w:r>
-        <w:t xml:space="preserve">el</w:t>
-      </w:r>
-      <w:r>
-        <w:t xml:space="preserve"> </w:t>
-      </w:r>
-      <w:r>
-        <w:rPr>
-          <w:b/>
-          <w:bCs/>
-        </w:rPr>
-        <w:t xml:space="preserve">programa de formación de asistentes personales</w:t>
-      </w:r>
-      <w:r>
-        <w:t xml:space="preserve"> </w:t>
-      </w:r>
-      <w:r>
-        <w:t xml:space="preserve">sistematizado a partir de Morpho (§8) — un producto de conocimiento transferible a toda la región;</w:t>
+        <w:t xml:space="preserve">Ya está probado en Costa Rica,</w:t>
+      </w:r>
+      <w:r>
+        <w:t xml:space="preserve"> </w:t>
+      </w:r>
+      <w:r>
+        <w:rPr>
+          <w:b/>
+          <w:bCs/>
+        </w:rPr>
+        <w:t xml:space="preserve">en centros de vida independiente de provincia que aún no tienen oficina</w:t>
+      </w:r>
+      <w:r>
+        <w:t xml:space="preserve">: permite coordinar</w:t>
+      </w:r>
+      <w:r>
+        <w:t xml:space="preserve"> </w:t>
+      </w:r>
+      <w:r>
+        <w:rPr>
+          <w:b/>
+          <w:bCs/>
+        </w:rPr>
+        <w:t xml:space="preserve">a distancia</w:t>
+      </w:r>
+      <w:r>
+        <w:t xml:space="preserve"> </w:t>
+      </w:r>
+      <w:r>
+        <w:t xml:space="preserve">entre asistentes personales y personas usuarias dispersos en el territorio.</w:t>
       </w:r>
     </w:p>
     <w:p>
@@ -2302,23 +2068,20 @@
         </w:numPr>
       </w:pPr>
       <w:r>
-        <w:t xml:space="preserve">la</w:t>
-      </w:r>
-      <w:r>
-        <w:t xml:space="preserve"> </w:t>
-      </w:r>
-      <w:r>
-        <w:rPr>
-          <w:b/>
-          <w:bCs/>
-        </w:rPr>
-        <w:t xml:space="preserve">capacitación en Costa Rica</w:t>
-      </w:r>
-      <w:r>
-        <w:t xml:space="preserve"> </w:t>
-      </w:r>
-      <w:r>
-        <w:t xml:space="preserve">(§7) — jornada y consulta entre instituciones de dos países;</w:t>
+        <w:t xml:space="preserve">Eso hace posible</w:t>
+      </w:r>
+      <w:r>
+        <w:t xml:space="preserve"> </w:t>
+      </w:r>
+      <w:r>
+        <w:rPr>
+          <w:b/>
+          <w:bCs/>
+        </w:rPr>
+        <w:t xml:space="preserve">llegar a las provincias desde el comienzo</w:t>
+      </w:r>
+      <w:r>
+        <w:t xml:space="preserve">, sin esperar a tener infraestructura.</w:t>
       </w:r>
     </w:p>
     <w:p>
@@ -2330,6 +2093,481 @@
         </w:numPr>
       </w:pPr>
       <w:r>
+        <w:t xml:space="preserve">Los registros de despacho quedan almacenados desde el primer día →</w:t>
+      </w:r>
+      <w:r>
+        <w:t xml:space="preserve"> </w:t>
+      </w:r>
+      <w:r>
+        <w:rPr>
+          <w:b/>
+          <w:bCs/>
+        </w:rPr>
+        <w:t xml:space="preserve">es la base de datos de la evaluación de 2028.</w:t>
+      </w:r>
+    </w:p>
+    <w:p>
+      <w:pPr>
+        <w:pStyle w:val="Compact"/>
+        <w:numPr>
+          <w:ilvl w:val="0"/>
+          <w:numId w:val="1010"/>
+        </w:numPr>
+      </w:pPr>
+      <w:r>
+        <w:rPr>
+          <w:b/>
+          <w:bCs/>
+        </w:rPr>
+        <w:t xml:space="preserve">Y hay un retorno hacia Costa Rica:</w:t>
+      </w:r>
+      <w:r>
+        <w:t xml:space="preserve"> </w:t>
+      </w:r>
+      <w:r>
+        <w:t xml:space="preserve">al adoptarse en la República Dominicana,</w:t>
+      </w:r>
+      <w:r>
+        <w:t xml:space="preserve"> </w:t>
+      </w:r>
+      <w:r>
+        <w:rPr>
+          <w:b/>
+          <w:bCs/>
+        </w:rPr>
+        <w:t xml:space="preserve">Morpho recibe un ingreso</w:t>
+      </w:r>
+      <w:r>
+        <w:t xml:space="preserve">. Es, aunque modesto, actividad económica propia de Morpho y contribuye a su</w:t>
+      </w:r>
+      <w:r>
+        <w:t xml:space="preserve"> </w:t>
+      </w:r>
+      <w:r>
+        <w:rPr>
+          <w:b/>
+          <w:bCs/>
+        </w:rPr>
+        <w:t xml:space="preserve">sostenibilidad</w:t>
+      </w:r>
+      <w:r>
+        <w:t xml:space="preserve">.</w:t>
+      </w:r>
+    </w:p>
+    <w:p>
+      <w:pPr>
+        <w:pStyle w:val="FirstParagraph"/>
+      </w:pPr>
+      <w:r>
+        <w:rPr>
+          <w:b/>
+          <w:bCs/>
+        </w:rPr>
+        <w:t xml:space="preserve">Costo de uso: [x — por confirmar con Morpho]</w:t>
+      </w:r>
+    </w:p>
+    <w:bookmarkEnd w:id="21"/>
+    <w:bookmarkStart w:id="22" w:name="Xe9ed06b37cd8a4e7b1e8dfb60083bf04edc4964"/>
+    <w:p>
+      <w:pPr>
+        <w:pStyle w:val="Heading2"/>
+      </w:pPr>
+      <w:r>
+        <w:t xml:space="preserve">10. Presupuesto — el criterio</w:t>
+      </w:r>
+    </w:p>
+    <w:p>
+      <w:pPr>
+        <w:pStyle w:val="FirstParagraph"/>
+      </w:pPr>
+      <w:r>
+        <w:rPr>
+          <w:b/>
+          <w:bCs/>
+        </w:rPr>
+        <w:t xml:space="preserve">La mayor parte del presupuesto es el pago de la asistencia personal. [x — tarifa y monto por acordar]</w:t>
+      </w:r>
+    </w:p>
+    <w:p>
+      <w:pPr>
+        <w:pStyle w:val="BodyText"/>
+      </w:pPr>
+      <w:r>
+        <w:t xml:space="preserve">El criterio de diseño es uno:</w:t>
+      </w:r>
+      <w:r>
+        <w:t xml:space="preserve"> </w:t>
+      </w:r>
+      <w:r>
+        <w:rPr>
+          <w:b/>
+          <w:bCs/>
+        </w:rPr>
+        <w:t xml:space="preserve">que el dinero empiece a circular en el terreno lo antes posible.</w:t>
+      </w:r>
+      <w:r>
+        <w:t xml:space="preserve"> </w:t>
+      </w:r>
+      <w:r>
+        <w:t xml:space="preserve">No esperar a que el sistema nacional esté listo — pagar y echar a andar, y que la experiencia sirva después para que el Estado lo asuma.</w:t>
+      </w:r>
+    </w:p>
+    <w:p>
+      <w:pPr>
+        <w:pStyle w:val="BodyText"/>
+      </w:pPr>
+      <w:r>
+        <w:t xml:space="preserve">Es el camino que siguió Morpho: en 2013, antes de la Ley 9379, sostenía la vida independiente de 6 personas usuarias con unos 10 asistentes personales — 919 horas en agosto de ese año, con</w:t>
+      </w:r>
+      <w:r>
+        <w:t xml:space="preserve"> </w:t>
+      </w:r>
+      <w:r>
+        <w:rPr>
+          <w:b/>
+          <w:bCs/>
+        </w:rPr>
+        <w:t xml:space="preserve">22% aportado por el Estado y 78% por el proyecto</w:t>
+      </w:r>
+      <w:r>
+        <w:t xml:space="preserve">. Tras la entrada en vigor de la ley en 2019,</w:t>
+      </w:r>
+      <w:r>
+        <w:t xml:space="preserve"> </w:t>
+      </w:r>
+      <w:r>
+        <w:rPr>
+          <w:b/>
+          <w:bCs/>
+        </w:rPr>
+        <w:t xml:space="preserve">el Estado asumió prácticamente el 100% y la carga del proyecto bajó a cero.</w:t>
+      </w:r>
+    </w:p>
+    <w:p>
+      <w:pPr>
+        <w:pStyle w:val="BodyText"/>
+      </w:pPr>
+      <w:r>
+        <w:rPr>
+          <w:b/>
+          <w:bCs/>
+        </w:rPr>
+        <w:t xml:space="preserve">Para que el centro se sostenga</w:t>
+      </w:r>
+      <w:r>
+        <w:t xml:space="preserve">, hace falta además el planteamiento trabajado con la OIT:</w:t>
+      </w:r>
+      <w:r>
+        <w:t xml:space="preserve"> </w:t>
+      </w:r>
+      <w:r>
+        <w:rPr>
+          <w:b/>
+          <w:bCs/>
+        </w:rPr>
+        <w:t xml:space="preserve">el centro como lugar de trabajo para personas con discapacidad</w:t>
+      </w:r>
+      <w:r>
+        <w:t xml:space="preserve">.</w:t>
+      </w:r>
+    </w:p>
+    <w:p>
+      <w:pPr>
+        <w:pStyle w:val="BodyText"/>
+      </w:pPr>
+      <w:r>
+        <w:t xml:space="preserve">Partidas: pago de asistencia personal (mayoritaria) · capacitación en Costa Rica · sistema de coordinación · operación del centro · evaluación y viajes</w:t>
+      </w:r>
+      <w:r>
+        <w:t xml:space="preserve"> </w:t>
+      </w:r>
+      <w:r>
+        <w:rPr>
+          <w:b/>
+          <w:bCs/>
+        </w:rPr>
+        <w:t xml:space="preserve">[x]</w:t>
+      </w:r>
+    </w:p>
+    <w:p>
+      <w:r>
+        <w:pict>
+          <v:rect style="width:0;height:1.5pt" o:hralign="center" o:hrstd="t" o:hr="t"/>
+        </w:pict>
+      </w:r>
+    </w:p>
+    <w:bookmarkEnd w:id="22"/>
+    <w:bookmarkStart w:id="23" w:name="Xe76011752e37cf528c9d59fbd93aa710a8e7fed"/>
+    <w:p>
+      <w:pPr>
+        <w:pStyle w:val="Heading2"/>
+      </w:pPr>
+      <w:r>
+        <w:t xml:space="preserve">11. Financiamiento</w:t>
+      </w:r>
+    </w:p>
+    <w:p>
+      <w:pPr>
+        <w:pStyle w:val="FirstParagraph"/>
+      </w:pPr>
+      <w:r>
+        <w:rPr>
+          <w:b/>
+          <w:bCs/>
+        </w:rPr>
+        <w:t xml:space="preserve">El orden importa: primero el país, después la banca.</w:t>
+      </w:r>
+    </w:p>
+    <w:p>
+      <w:pPr>
+        <w:pStyle w:val="BodyText"/>
+      </w:pPr>
+      <w:r>
+        <w:t xml:space="preserve">Explicar el proyecto como sistema es difícil.</w:t>
+      </w:r>
+      <w:r>
+        <w:t xml:space="preserve"> </w:t>
+      </w:r>
+      <w:r>
+        <w:rPr>
+          <w:b/>
+          <w:bCs/>
+        </w:rPr>
+        <w:t xml:space="preserve">Primero queremos tener claro el conjunto y conversarlo con las contrapartes dominicanas</w:t>
+      </w:r>
+      <w:r>
+        <w:t xml:space="preserve">; la argumentación ante la banca de desarrollo viene después.</w:t>
+      </w:r>
+    </w:p>
+    <w:p>
+      <w:pPr>
+        <w:pStyle w:val="BodyText"/>
+      </w:pPr>
+      <w:r>
+        <w:rPr>
+          <w:b/>
+          <w:bCs/>
+        </w:rPr>
+        <w:t xml:space="preserve">Punto de partida y titularidad de la propuesta</w:t>
+      </w:r>
+    </w:p>
+    <w:p>
+      <w:pPr>
+        <w:pStyle w:val="BodyText"/>
+      </w:pPr>
+      <w:r>
+        <w:t xml:space="preserve">El recorrido es:</w:t>
+      </w:r>
+      <w:r>
+        <w:t xml:space="preserve"> </w:t>
+      </w:r>
+      <w:r>
+        <w:rPr>
+          <w:b/>
+          <w:bCs/>
+        </w:rPr>
+        <w:t xml:space="preserve">CIMUDIS → CONADIS</w:t>
+      </w:r>
+      <w:r>
+        <w:t xml:space="preserve">, y</w:t>
+      </w:r>
+      <w:r>
+        <w:t xml:space="preserve"> </w:t>
+      </w:r>
+      <w:r>
+        <w:rPr>
+          <w:b/>
+          <w:bCs/>
+        </w:rPr>
+        <w:t xml:space="preserve">la propuesta ante la banca de desarrollo la presenta oficialmente el CONADIS.</w:t>
+      </w:r>
+      <w:r>
+        <w:t xml:space="preserve"> </w:t>
+      </w:r>
+      <w:r>
+        <w:t xml:space="preserve">El proyecto nace del movimiento y se presenta desde la institución rectora del Estado.</w:t>
+      </w:r>
+    </w:p>
+    <w:p>
+      <w:pPr>
+        <w:pStyle w:val="BodyText"/>
+      </w:pPr>
+      <w:r>
+        <w:t xml:space="preserve">A partir de ahí se conversa</w:t>
+      </w:r>
+      <w:r>
+        <w:t xml:space="preserve"> </w:t>
+      </w:r>
+      <w:r>
+        <w:rPr>
+          <w:b/>
+          <w:bCs/>
+        </w:rPr>
+        <w:t xml:space="preserve">cuánto de esto puede cubrirse con recursos nacionales</w:t>
+      </w:r>
+      <w:r>
+        <w:t xml:space="preserve"> </w:t>
+      </w:r>
+      <w:r>
+        <w:t xml:space="preserve">— FONADIS (fondo designado a vida independiente), Supérate / Comunidades de Cuidado, Ministerio de la Mujer.</w:t>
+      </w:r>
+      <w:r>
+        <w:t xml:space="preserve"> </w:t>
+      </w:r>
+      <w:r>
+        <w:rPr>
+          <w:b/>
+          <w:bCs/>
+        </w:rPr>
+        <w:t xml:space="preserve">El presupuesto se presenta completo</w:t>
+      </w:r>
+      <w:r>
+        <w:t xml:space="preserve">, y la proporción entre aporte nacional y financiamiento externo se define en esa conversación, no antes.</w:t>
+      </w:r>
+    </w:p>
+    <w:p>
+      <w:pPr>
+        <w:pStyle w:val="BodyText"/>
+      </w:pPr>
+      <w:r>
+        <w:rPr>
+          <w:b/>
+          <w:bCs/>
+        </w:rPr>
+        <w:t xml:space="preserve">JICA (proyecto previsto desde 2027)</w:t>
+      </w:r>
+    </w:p>
+    <w:p>
+      <w:pPr>
+        <w:pStyle w:val="BodyText"/>
+      </w:pPr>
+      <w:r>
+        <w:t xml:space="preserve">No se trata de que un actor apoye al otro:</w:t>
+      </w:r>
+      <w:r>
+        <w:t xml:space="preserve"> </w:t>
+      </w:r>
+      <w:r>
+        <w:rPr>
+          <w:b/>
+          <w:bCs/>
+        </w:rPr>
+        <w:t xml:space="preserve">son iniciativas de naturaleza distinta y por eso se potencian mutuamente.</w:t>
+      </w:r>
+      <w:r>
+        <w:t xml:space="preserve"> </w:t>
+      </w:r>
+      <w:r>
+        <w:t xml:space="preserve">La intención es que se complementen, y se irá conversando según avance.</w:t>
+      </w:r>
+    </w:p>
+    <w:p>
+      <w:pPr>
+        <w:pStyle w:val="BodyText"/>
+      </w:pPr>
+      <w:r>
+        <w:rPr>
+          <w:b/>
+          <w:bCs/>
+        </w:rPr>
+        <w:t xml:space="preserve">CAF</w:t>
+      </w:r>
+    </w:p>
+    <w:p>
+      <w:pPr>
+        <w:pStyle w:val="BodyText"/>
+      </w:pPr>
+      <w:r>
+        <w:t xml:space="preserve">La CAF financia principalmente a</w:t>
+      </w:r>
+      <w:r>
+        <w:t xml:space="preserve"> </w:t>
+      </w:r>
+      <w:r>
+        <w:rPr>
+          <w:b/>
+          <w:bCs/>
+        </w:rPr>
+        <w:t xml:space="preserve">gobiernos</w:t>
+      </w:r>
+      <w:r>
+        <w:t xml:space="preserve"> </w:t>
+      </w:r>
+      <w:r>
+        <w:t xml:space="preserve">de sus países miembro, mediante créditos y cooperaciones técnicas; con organizaciones de la sociedad civil realiza colaboraciones puntuales, orientadas sobre todo a</w:t>
+      </w:r>
+      <w:r>
+        <w:t xml:space="preserve"> </w:t>
+      </w:r>
+      <w:r>
+        <w:rPr>
+          <w:b/>
+          <w:bCs/>
+        </w:rPr>
+        <w:t xml:space="preserve">estudios, productos de conocimiento, jornadas y consultas</w:t>
+      </w:r>
+      <w:r>
+        <w:t xml:space="preserve">.</w:t>
+      </w:r>
+    </w:p>
+    <w:p>
+      <w:pPr>
+        <w:pStyle w:val="BodyText"/>
+      </w:pPr>
+      <w:r>
+        <w:t xml:space="preserve">Este proyecto encaja con ese marco:</w:t>
+      </w:r>
+      <w:r>
+        <w:t xml:space="preserve"> </w:t>
+      </w:r>
+      <w:r>
+        <w:rPr>
+          <w:b/>
+          <w:bCs/>
+        </w:rPr>
+        <w:t xml:space="preserve">la propuesta la presenta el CONADIS</w:t>
+      </w:r>
+      <w:r>
+        <w:t xml:space="preserve">, y lo que produce es exactamente ese tipo de resultado.</w:t>
+      </w:r>
+    </w:p>
+    <w:p>
+      <w:pPr>
+        <w:pStyle w:val="Compact"/>
+        <w:numPr>
+          <w:ilvl w:val="0"/>
+          <w:numId w:val="1011"/>
+        </w:numPr>
+      </w:pPr>
+      <w:r>
+        <w:t xml:space="preserve">el</w:t>
+      </w:r>
+      <w:r>
+        <w:t xml:space="preserve"> </w:t>
+      </w:r>
+      <w:r>
+        <w:rPr>
+          <w:b/>
+          <w:bCs/>
+        </w:rPr>
+        <w:t xml:space="preserve">programa de formación de asistentes personales</w:t>
+      </w:r>
+      <w:r>
+        <w:t xml:space="preserve"> </w:t>
+      </w:r>
+      <w:r>
+        <w:t xml:space="preserve">sistematizado a partir de Morpho (§8) — un producto de conocimiento transferible a toda la región;</w:t>
+      </w:r>
+    </w:p>
+    <w:p>
+      <w:pPr>
+        <w:pStyle w:val="Compact"/>
+        <w:numPr>
+          <w:ilvl w:val="0"/>
+          <w:numId w:val="1011"/>
+        </w:numPr>
+      </w:pPr>
+      <w:r>
         <w:t xml:space="preserve">la</w:t>
       </w:r>
       <w:r>
@@ -2340,6 +2578,34 @@
           <w:b/>
           <w:bCs/>
         </w:rPr>
+        <w:t xml:space="preserve">capacitación en Costa Rica</w:t>
+      </w:r>
+      <w:r>
+        <w:t xml:space="preserve"> </w:t>
+      </w:r>
+      <w:r>
+        <w:t xml:space="preserve">(§7) — jornada y consulta entre instituciones de dos países;</w:t>
+      </w:r>
+    </w:p>
+    <w:p>
+      <w:pPr>
+        <w:pStyle w:val="Compact"/>
+        <w:numPr>
+          <w:ilvl w:val="0"/>
+          <w:numId w:val="1011"/>
+        </w:numPr>
+      </w:pPr>
+      <w:r>
+        <w:t xml:space="preserve">la</w:t>
+      </w:r>
+      <w:r>
+        <w:t xml:space="preserve"> </w:t>
+      </w:r>
+      <w:r>
+        <w:rPr>
+          <w:b/>
+          <w:bCs/>
+        </w:rPr>
         <w:t xml:space="preserve">evaluación con datos</w:t>
       </w:r>
       <w:r>
@@ -2405,8 +2671,8 @@
         <w:t xml:space="preserve">CONADIS / FONADIS / Supérate / Ministerio de la Mujer (nacional) · OIT · JICA · CAF · BID · Banco Mundial</w:t>
       </w:r>
     </w:p>
-    <w:bookmarkEnd w:id="19"/>
-    <w:bookmarkStart w:id="20" w:name="X1f1df990115bae087baba3e3a7933e834838422"/>
+    <w:bookmarkEnd w:id="23"/>
+    <w:bookmarkStart w:id="24" w:name="X1f1df990115bae087baba3e3a7933e834838422"/>
     <w:p>
       <w:pPr>
         <w:pStyle w:val="Heading2"/>
@@ -2619,8 +2885,8 @@
         </w:pict>
       </w:r>
     </w:p>
-    <w:bookmarkEnd w:id="20"/>
-    <w:bookmarkStart w:id="21" w:name="X69bc83733ec6dbcf87719dcf1ab89ce6770c9cc"/>
+    <w:bookmarkEnd w:id="24"/>
+    <w:bookmarkStart w:id="25" w:name="X69bc83733ec6dbcf87719dcf1ab89ce6770c9cc"/>
     <w:p>
       <w:pPr>
         <w:pStyle w:val="Heading2"/>
@@ -2634,7 +2900,7 @@
         <w:pStyle w:val="Compact"/>
         <w:numPr>
           <w:ilvl w:val="0"/>
-          <w:numId w:val="1011"/>
+          <w:numId w:val="1012"/>
         </w:numPr>
       </w:pPr>
       <w:r>
@@ -2659,7 +2925,7 @@
         <w:pStyle w:val="Compact"/>
         <w:numPr>
           <w:ilvl w:val="0"/>
-          <w:numId w:val="1011"/>
+          <w:numId w:val="1012"/>
         </w:numPr>
       </w:pPr>
       <w:r>
@@ -2687,7 +2953,7 @@
         <w:pStyle w:val="Compact"/>
         <w:numPr>
           <w:ilvl w:val="0"/>
-          <w:numId w:val="1011"/>
+          <w:numId w:val="1012"/>
         </w:numPr>
       </w:pPr>
       <w:r>
@@ -2706,7 +2972,7 @@
         <w:pStyle w:val="Compact"/>
         <w:numPr>
           <w:ilvl w:val="0"/>
-          <w:numId w:val="1011"/>
+          <w:numId w:val="1012"/>
         </w:numPr>
       </w:pPr>
       <w:r>
@@ -2736,8 +3002,8 @@
         <w:t xml:space="preserve">Borrador de trabajo de RELAVIN — septiembre de 2026.</w:t>
       </w:r>
     </w:p>
-    <w:bookmarkEnd w:id="21"/>
-    <w:bookmarkEnd w:id="22"/>
+    <w:bookmarkEnd w:id="25"/>
+    <w:bookmarkEnd w:id="26"/>
     <w:sectPr>
       <w:footnotePr>
         <w:numRestart w:val="eachSect"/>
@@ -3097,6 +3363,9 @@
     <w:abstractNumId w:val="991"/>
   </w:num>
   <w:num w:numId="1011">
+    <w:abstractNumId w:val="991"/>
+  </w:num>
+  <w:num w:numId="1012">
     <w:abstractNumId w:val="99411"/>
     <w:lvlOverride w:ilvl="0">
       <w:startOverride w:val="1"/>

</xml_diff>

<commit_message>
RD v2: la evaluación trimestral incluye asesoría en línea con Morpho
Co-Authored-By: Claude Opus 5 <noreply@anthropic.com>
</commit_message>
<xml_diff>
--- a/republica-dominicana/propuesta-proyecto-AP/Propuesta-v2-piloto-AP-RD-2027-2030.docx
+++ b/republica-dominicana/propuesta-proyecto-AP/Propuesta-v2-piloto-AP-RD-2027-2030.docx
@@ -1315,6 +1315,22 @@
       </w:r>
       <w:r>
         <w:t xml:space="preserve">, de forma automática desde el inicio: observación de punto fijo.</w:t>
+      </w:r>
+      <w:r>
+        <w:t xml:space="preserve"> </w:t>
+      </w:r>
+      <w:r>
+        <w:rPr>
+          <w:b/>
+          <w:bCs/>
+        </w:rPr>
+        <w:t xml:space="preserve">Cada una de esas instancias incluye una sesión de asesoría en línea con Morpho</w:t>
+      </w:r>
+      <w:r>
+        <w:t xml:space="preserve"> </w:t>
+      </w:r>
+      <w:r>
+        <w:t xml:space="preserve">— no sólo se registra cómo va el ciclo, sino que se resuelven allí mismo las dudas de la operación con quienes ya lo tienen andando.</w:t>
       </w:r>
     </w:p>
     <w:p>

</xml_diff>

<commit_message>
RD v2: la periodicidad trimestral es de partida y se revisará en marcha
Se revisará considerando la carga para el lado costarricense y la necesidad
real del lado dominicano.

Co-Authored-By: Claude Opus 5 <noreply@anthropic.com>
</commit_message>
<xml_diff>
--- a/republica-dominicana/propuesta-proyecto-AP/Propuesta-v2-piloto-AP-RD-2027-2030.docx
+++ b/republica-dominicana/propuesta-proyecto-AP/Propuesta-v2-piloto-AP-RD-2027-2030.docx
@@ -1331,6 +1331,16 @@
       </w:r>
       <w:r>
         <w:t xml:space="preserve">— no sólo se registra cómo va el ciclo, sino que se resuelven allí mismo las dudas de la operación con quienes ya lo tienen andando.</w:t>
+      </w:r>
+      <w:r>
+        <w:t xml:space="preserve"> </w:t>
+      </w:r>
+      <w:r>
+        <w:rPr>
+          <w:i/>
+          <w:iCs/>
+        </w:rPr>
+        <w:t xml:space="preserve">La frecuencia trimestral es la de partida. Una vez en marcha se revisará, considerando tanto la carga que supone para el lado costarricense como la necesidad real del lado dominicano.</w:t>
       </w:r>
     </w:p>
     <w:p>
@@ -2867,7 +2877,17 @@
               <w:pStyle w:val="Compact"/>
             </w:pPr>
             <w:r>
-              <w:t xml:space="preserve">Morpho o Mainstream</w:t>
+              <w:t xml:space="preserve">asesoría en línea a cargo de Morpho;</w:t>
+            </w:r>
+            <w:r>
+              <w:t xml:space="preserve"> </w:t>
+            </w:r>
+            <w:r>
+              <w:rPr>
+                <w:b/>
+                <w:bCs/>
+              </w:rPr>
+              <w:t xml:space="preserve">la frecuencia (trimestral de partida) se revisa una vez en marcha</w:t>
             </w:r>
           </w:p>
         </w:tc>

</xml_diff>

<commit_message>
RD v2: presupuesto por partidas, con honorarios de Morpho por la capacitación
La capacitación en Costa Rica, el sistema de coordinación y la asesoría en
línea son contraprestación por el conocimiento acumulado — e ingreso que
sostiene a quien enseña. Un esquema sur-sur donde quien transfiere trabaja
sin remuneración no se sostiene.

Co-Authored-By: Claude Opus 5 <noreply@anthropic.com>
</commit_message>
<xml_diff>
--- a/republica-dominicana/propuesta-proyecto-AP/Propuesta-v2-piloto-AP-RD-2027-2030.docx
+++ b/republica-dominicana/propuesta-proyecto-AP/Propuesta-v2-piloto-AP-RD-2027-2030.docx
@@ -1631,7 +1631,7 @@
           <w:b/>
           <w:bCs/>
         </w:rPr>
-        <w:t xml:space="preserve">Unas 10 personas · dos semanas aproximadamente</w:t>
+        <w:t xml:space="preserve">Unas 10 personas · dos semanas aproximadamente · capacitación a cargo de Morpho (con honorarios, §10)</w:t>
       </w:r>
     </w:p>
     <w:p>
@@ -2302,409 +2302,11 @@
         <w:pStyle w:val="BodyText"/>
       </w:pPr>
       <w:r>
-        <w:t xml:space="preserve">Partidas: pago de asistencia personal (mayoritaria) · capacitación en Costa Rica · sistema de coordinación · operación del centro · evaluación y viajes</w:t>
-      </w:r>
-      <w:r>
-        <w:t xml:space="preserve"> </w:t>
-      </w:r>
-      <w:r>
-        <w:rPr>
-          <w:b/>
-          <w:bCs/>
-        </w:rPr>
-        <w:t xml:space="preserve">[x]</w:t>
-      </w:r>
-    </w:p>
-    <w:p>
-      <w:r>
-        <w:pict>
-          <v:rect style="width:0;height:1.5pt" o:hralign="center" o:hrstd="t" o:hr="t"/>
-        </w:pict>
-      </w:r>
-    </w:p>
-    <w:bookmarkEnd w:id="22"/>
-    <w:bookmarkStart w:id="23" w:name="Xe76011752e37cf528c9d59fbd93aa710a8e7fed"/>
-    <w:p>
-      <w:pPr>
-        <w:pStyle w:val="Heading2"/>
-      </w:pPr>
-      <w:r>
-        <w:t xml:space="preserve">11. Financiamiento</w:t>
-      </w:r>
-    </w:p>
-    <w:p>
-      <w:pPr>
-        <w:pStyle w:val="FirstParagraph"/>
-      </w:pPr>
-      <w:r>
-        <w:rPr>
-          <w:b/>
-          <w:bCs/>
-        </w:rPr>
-        <w:t xml:space="preserve">El orden importa: primero el país, después la banca.</w:t>
-      </w:r>
-    </w:p>
-    <w:p>
-      <w:pPr>
-        <w:pStyle w:val="BodyText"/>
-      </w:pPr>
-      <w:r>
-        <w:t xml:space="preserve">Explicar el proyecto como sistema es difícil.</w:t>
-      </w:r>
-      <w:r>
-        <w:t xml:space="preserve"> </w:t>
-      </w:r>
-      <w:r>
-        <w:rPr>
-          <w:b/>
-          <w:bCs/>
-        </w:rPr>
-        <w:t xml:space="preserve">Primero queremos tener claro el conjunto y conversarlo con las contrapartes dominicanas</w:t>
-      </w:r>
-      <w:r>
-        <w:t xml:space="preserve">; la argumentación ante la banca de desarrollo viene después.</w:t>
-      </w:r>
-    </w:p>
-    <w:p>
-      <w:pPr>
-        <w:pStyle w:val="BodyText"/>
-      </w:pPr>
-      <w:r>
-        <w:rPr>
-          <w:b/>
-          <w:bCs/>
-        </w:rPr>
-        <w:t xml:space="preserve">Punto de partida y titularidad de la propuesta</w:t>
-      </w:r>
-    </w:p>
-    <w:p>
-      <w:pPr>
-        <w:pStyle w:val="BodyText"/>
-      </w:pPr>
-      <w:r>
-        <w:t xml:space="preserve">El recorrido es:</w:t>
-      </w:r>
-      <w:r>
-        <w:t xml:space="preserve"> </w:t>
-      </w:r>
-      <w:r>
-        <w:rPr>
-          <w:b/>
-          <w:bCs/>
-        </w:rPr>
-        <w:t xml:space="preserve">CIMUDIS → CONADIS</w:t>
-      </w:r>
-      <w:r>
-        <w:t xml:space="preserve">, y</w:t>
-      </w:r>
-      <w:r>
-        <w:t xml:space="preserve"> </w:t>
-      </w:r>
-      <w:r>
-        <w:rPr>
-          <w:b/>
-          <w:bCs/>
-        </w:rPr>
-        <w:t xml:space="preserve">la propuesta ante la banca de desarrollo la presenta oficialmente el CONADIS.</w:t>
-      </w:r>
-      <w:r>
-        <w:t xml:space="preserve"> </w:t>
-      </w:r>
-      <w:r>
-        <w:t xml:space="preserve">El proyecto nace del movimiento y se presenta desde la institución rectora del Estado.</w:t>
-      </w:r>
-    </w:p>
-    <w:p>
-      <w:pPr>
-        <w:pStyle w:val="BodyText"/>
-      </w:pPr>
-      <w:r>
-        <w:t xml:space="preserve">A partir de ahí se conversa</w:t>
-      </w:r>
-      <w:r>
-        <w:t xml:space="preserve"> </w:t>
-      </w:r>
-      <w:r>
-        <w:rPr>
-          <w:b/>
-          <w:bCs/>
-        </w:rPr>
-        <w:t xml:space="preserve">cuánto de esto puede cubrirse con recursos nacionales</w:t>
-      </w:r>
-      <w:r>
-        <w:t xml:space="preserve"> </w:t>
-      </w:r>
-      <w:r>
-        <w:t xml:space="preserve">— FONADIS (fondo designado a vida independiente), Supérate / Comunidades de Cuidado, Ministerio de la Mujer.</w:t>
-      </w:r>
-      <w:r>
-        <w:t xml:space="preserve"> </w:t>
-      </w:r>
-      <w:r>
-        <w:rPr>
-          <w:b/>
-          <w:bCs/>
-        </w:rPr>
-        <w:t xml:space="preserve">El presupuesto se presenta completo</w:t>
-      </w:r>
-      <w:r>
-        <w:t xml:space="preserve">, y la proporción entre aporte nacional y financiamiento externo se define en esa conversación, no antes.</w:t>
-      </w:r>
-    </w:p>
-    <w:p>
-      <w:pPr>
-        <w:pStyle w:val="BodyText"/>
-      </w:pPr>
-      <w:r>
-        <w:rPr>
-          <w:b/>
-          <w:bCs/>
-        </w:rPr>
-        <w:t xml:space="preserve">JICA (proyecto previsto desde 2027)</w:t>
-      </w:r>
-    </w:p>
-    <w:p>
-      <w:pPr>
-        <w:pStyle w:val="BodyText"/>
-      </w:pPr>
-      <w:r>
-        <w:t xml:space="preserve">No se trata de que un actor apoye al otro:</w:t>
-      </w:r>
-      <w:r>
-        <w:t xml:space="preserve"> </w:t>
-      </w:r>
-      <w:r>
-        <w:rPr>
-          <w:b/>
-          <w:bCs/>
-        </w:rPr>
-        <w:t xml:space="preserve">son iniciativas de naturaleza distinta y por eso se potencian mutuamente.</w:t>
-      </w:r>
-      <w:r>
-        <w:t xml:space="preserve"> </w:t>
-      </w:r>
-      <w:r>
-        <w:t xml:space="preserve">La intención es que se complementen, y se irá conversando según avance.</w:t>
-      </w:r>
-    </w:p>
-    <w:p>
-      <w:pPr>
-        <w:pStyle w:val="BodyText"/>
-      </w:pPr>
-      <w:r>
-        <w:rPr>
-          <w:b/>
-          <w:bCs/>
-        </w:rPr>
-        <w:t xml:space="preserve">CAF</w:t>
-      </w:r>
-    </w:p>
-    <w:p>
-      <w:pPr>
-        <w:pStyle w:val="BodyText"/>
-      </w:pPr>
-      <w:r>
-        <w:t xml:space="preserve">La CAF financia principalmente a</w:t>
-      </w:r>
-      <w:r>
-        <w:t xml:space="preserve"> </w:t>
-      </w:r>
-      <w:r>
-        <w:rPr>
-          <w:b/>
-          <w:bCs/>
-        </w:rPr>
-        <w:t xml:space="preserve">gobiernos</w:t>
-      </w:r>
-      <w:r>
-        <w:t xml:space="preserve"> </w:t>
-      </w:r>
-      <w:r>
-        <w:t xml:space="preserve">de sus países miembro, mediante créditos y cooperaciones técnicas; con organizaciones de la sociedad civil realiza colaboraciones puntuales, orientadas sobre todo a</w:t>
-      </w:r>
-      <w:r>
-        <w:t xml:space="preserve"> </w:t>
-      </w:r>
-      <w:r>
-        <w:rPr>
-          <w:b/>
-          <w:bCs/>
-        </w:rPr>
-        <w:t xml:space="preserve">estudios, productos de conocimiento, jornadas y consultas</w:t>
-      </w:r>
-      <w:r>
-        <w:t xml:space="preserve">.</w:t>
-      </w:r>
-    </w:p>
-    <w:p>
-      <w:pPr>
-        <w:pStyle w:val="BodyText"/>
-      </w:pPr>
-      <w:r>
-        <w:t xml:space="preserve">Este proyecto encaja con ese marco:</w:t>
-      </w:r>
-      <w:r>
-        <w:t xml:space="preserve"> </w:t>
-      </w:r>
-      <w:r>
-        <w:rPr>
-          <w:b/>
-          <w:bCs/>
-        </w:rPr>
-        <w:t xml:space="preserve">la propuesta la presenta el CONADIS</w:t>
-      </w:r>
-      <w:r>
-        <w:t xml:space="preserve">, y lo que produce es exactamente ese tipo de resultado.</w:t>
-      </w:r>
-    </w:p>
-    <w:p>
-      <w:pPr>
-        <w:pStyle w:val="Compact"/>
-        <w:numPr>
-          <w:ilvl w:val="0"/>
-          <w:numId w:val="1011"/>
-        </w:numPr>
-      </w:pPr>
-      <w:r>
-        <w:t xml:space="preserve">el</w:t>
-      </w:r>
-      <w:r>
-        <w:t xml:space="preserve"> </w:t>
-      </w:r>
-      <w:r>
-        <w:rPr>
-          <w:b/>
-          <w:bCs/>
-        </w:rPr>
-        <w:t xml:space="preserve">programa de formación de asistentes personales</w:t>
-      </w:r>
-      <w:r>
-        <w:t xml:space="preserve"> </w:t>
-      </w:r>
-      <w:r>
-        <w:t xml:space="preserve">sistematizado a partir de Morpho (§8) — un producto de conocimiento transferible a toda la región;</w:t>
-      </w:r>
-    </w:p>
-    <w:p>
-      <w:pPr>
-        <w:pStyle w:val="Compact"/>
-        <w:numPr>
-          <w:ilvl w:val="0"/>
-          <w:numId w:val="1011"/>
-        </w:numPr>
-      </w:pPr>
-      <w:r>
-        <w:t xml:space="preserve">la</w:t>
-      </w:r>
-      <w:r>
-        <w:t xml:space="preserve"> </w:t>
-      </w:r>
-      <w:r>
-        <w:rPr>
-          <w:b/>
-          <w:bCs/>
-        </w:rPr>
-        <w:t xml:space="preserve">capacitación en Costa Rica</w:t>
-      </w:r>
-      <w:r>
-        <w:t xml:space="preserve"> </w:t>
-      </w:r>
-      <w:r>
-        <w:t xml:space="preserve">(§7) — jornada y consulta entre instituciones de dos países;</w:t>
-      </w:r>
-    </w:p>
-    <w:p>
-      <w:pPr>
-        <w:pStyle w:val="Compact"/>
-        <w:numPr>
-          <w:ilvl w:val="0"/>
-          <w:numId w:val="1011"/>
-        </w:numPr>
-      </w:pPr>
-      <w:r>
-        <w:t xml:space="preserve">la</w:t>
-      </w:r>
-      <w:r>
-        <w:t xml:space="preserve"> </w:t>
-      </w:r>
-      <w:r>
-        <w:rPr>
-          <w:b/>
-          <w:bCs/>
-        </w:rPr>
-        <w:t xml:space="preserve">evaluación con datos</w:t>
-      </w:r>
-      <w:r>
-        <w:t xml:space="preserve"> </w:t>
-      </w:r>
-      <w:r>
-        <w:t xml:space="preserve">de 2028 (§5) — estudio.</w:t>
-      </w:r>
-    </w:p>
-    <w:p>
-      <w:pPr>
-        <w:pStyle w:val="FirstParagraph"/>
-      </w:pPr>
-      <w:r>
-        <w:t xml:space="preserve">Sobre esa base se retomará la conversación con la CAF.</w:t>
-      </w:r>
-    </w:p>
-    <w:p>
-      <w:pPr>
-        <w:pStyle w:val="BodyText"/>
-      </w:pPr>
-      <w:r>
-        <w:rPr>
-          <w:b/>
-          <w:bCs/>
-        </w:rPr>
-        <w:t xml:space="preserve">Camino hacia 2028</w:t>
-      </w:r>
-    </w:p>
-    <w:p>
-      <w:pPr>
-        <w:pStyle w:val="BodyText"/>
-      </w:pPr>
-      <w:r>
-        <w:t xml:space="preserve">Para la presentación conjunta en la Conferencia:</w:t>
-      </w:r>
-      <w:r>
-        <w:t xml:space="preserve"> </w:t>
-      </w:r>
-      <w:r>
-        <w:rPr>
-          <w:b/>
-          <w:bCs/>
-        </w:rPr>
-        <w:t xml:space="preserve">primero se trabaja con la OIT, y en paralelo se escribe a la CAF.</w:t>
-      </w:r>
-    </w:p>
-    <w:p>
-      <w:pPr>
-        <w:pStyle w:val="BodyText"/>
-      </w:pPr>
-      <w:r>
-        <w:rPr>
-          <w:b/>
-          <w:bCs/>
-        </w:rPr>
-        <w:t xml:space="preserve">Fuentes por explorar:</w:t>
-      </w:r>
-      <w:r>
-        <w:t xml:space="preserve"> </w:t>
-      </w:r>
-      <w:r>
-        <w:t xml:space="preserve">CONADIS / FONADIS / Supérate / Ministerio de la Mujer (nacional) · OIT · JICA · CAF · BID · Banco Mundial</w:t>
-      </w:r>
-    </w:p>
-    <w:bookmarkEnd w:id="23"/>
-    <w:bookmarkStart w:id="24" w:name="X1f1df990115bae087baba3e3a7933e834838422"/>
-    <w:p>
-      <w:pPr>
-        <w:pStyle w:val="Heading2"/>
-      </w:pPr>
-      <w:r>
-        <w:t xml:space="preserve">12. Puntos por definir</w:t>
+        <w:rPr>
+          <w:b/>
+          <w:bCs/>
+        </w:rPr>
+        <w:t xml:space="preserve">Partidas</w:t>
       </w:r>
     </w:p>
     <w:tbl>
@@ -2746,7 +2348,11 @@
               <w:pStyle w:val="Compact"/>
             </w:pPr>
             <w:r>
-              <w:t xml:space="preserve">Personas usuarias</w:t>
+              <w:rPr>
+                <w:b/>
+                <w:bCs/>
+              </w:rPr>
+              <w:t xml:space="preserve">Pago de asistencia personal</w:t>
             </w:r>
           </w:p>
         </w:tc>
@@ -2757,7 +2363,17 @@
               <w:pStyle w:val="Compact"/>
             </w:pPr>
             <w:r>
-              <w:t xml:space="preserve">número final y criterio de selección territorial</w:t>
+              <w:t xml:space="preserve">la partida mayoritaria</w:t>
+            </w:r>
+            <w:r>
+              <w:t xml:space="preserve"> </w:t>
+            </w:r>
+            <w:r>
+              <w:rPr>
+                <w:b/>
+                <w:bCs/>
+              </w:rPr>
+              <w:t xml:space="preserve">[x]</w:t>
             </w:r>
           </w:p>
         </w:tc>
@@ -2770,7 +2386,11 @@
               <w:pStyle w:val="Compact"/>
             </w:pPr>
             <w:r>
-              <w:t xml:space="preserve">Contenido del 2.º trimestre de 2027</w:t>
+              <w:rPr>
+                <w:b/>
+                <w:bCs/>
+              </w:rPr>
+              <w:t xml:space="preserve">Capacitación en Costa Rica</w:t>
             </w:r>
           </w:p>
         </w:tc>
@@ -2781,7 +2401,17 @@
               <w:pStyle w:val="Compact"/>
             </w:pPr>
             <w:r>
-              <w:t xml:space="preserve">qué se prepara entre la vuelta de Costa Rica y el arranque</w:t>
+              <w:rPr>
+                <w:b/>
+                <w:bCs/>
+              </w:rPr>
+              <w:t xml:space="preserve">honorarios de Morpho por la capacitación [x]</w:t>
+            </w:r>
+            <w:r>
+              <w:t xml:space="preserve"> </w:t>
+            </w:r>
+            <w:r>
+              <w:t xml:space="preserve">· viajes y estadía de unas 10 personas · consejería de pares · visitas al CONAPDIS</w:t>
             </w:r>
           </w:p>
         </w:tc>
@@ -2794,7 +2424,11 @@
               <w:pStyle w:val="Compact"/>
             </w:pPr>
             <w:r>
-              <w:t xml:space="preserve">Tarifa de asistencia personal</w:t>
+              <w:rPr>
+                <w:b/>
+                <w:bCs/>
+              </w:rPr>
+              <w:t xml:space="preserve">Sistema de coordinación</w:t>
             </w:r>
           </w:p>
         </w:tc>
@@ -2805,7 +2439,685 @@
               <w:pStyle w:val="Compact"/>
             </w:pPr>
             <w:r>
+              <w:t xml:space="preserve">costo de uso</w:t>
+            </w:r>
+            <w:r>
+              <w:t xml:space="preserve"> </w:t>
+            </w:r>
+            <w:r>
+              <w:rPr>
+                <w:b/>
+                <w:bCs/>
+              </w:rPr>
+              <w:t xml:space="preserve">[x]</w:t>
+            </w:r>
+          </w:p>
+        </w:tc>
+      </w:tr>
+      <w:tr>
+        <w:tc>
+          <w:tcPr/>
+          <w:p>
+            <w:pPr>
+              <w:pStyle w:val="Compact"/>
+            </w:pPr>
+            <w:r>
+              <w:rPr>
+                <w:b/>
+                <w:bCs/>
+              </w:rPr>
+              <w:t xml:space="preserve">Asesoría en línea de Morpho</w:t>
+            </w:r>
+          </w:p>
+        </w:tc>
+        <w:tc>
+          <w:tcPr/>
+          <w:p>
+            <w:pPr>
+              <w:pStyle w:val="Compact"/>
+            </w:pPr>
+            <w:r>
+              <w:t xml:space="preserve">seguimiento periódico</w:t>
+            </w:r>
+            <w:r>
+              <w:t xml:space="preserve"> </w:t>
+            </w:r>
+            <w:r>
+              <w:rPr>
+                <w:b/>
+                <w:bCs/>
+              </w:rPr>
+              <w:t xml:space="preserve">[x]</w:t>
+            </w:r>
+          </w:p>
+        </w:tc>
+      </w:tr>
+      <w:tr>
+        <w:tc>
+          <w:tcPr/>
+          <w:p>
+            <w:pPr>
+              <w:pStyle w:val="Compact"/>
+            </w:pPr>
+            <w:r>
+              <w:rPr>
+                <w:b/>
+                <w:bCs/>
+              </w:rPr>
+              <w:t xml:space="preserve">Visita de evaluación desde Costa Rica (2028)</w:t>
+            </w:r>
+          </w:p>
+        </w:tc>
+        <w:tc>
+          <w:tcPr/>
+          <w:p>
+            <w:pPr>
+              <w:pStyle w:val="Compact"/>
+            </w:pPr>
+            <w:r>
+              <w:t xml:space="preserve">viajes y estadía</w:t>
+            </w:r>
+            <w:r>
+              <w:t xml:space="preserve"> </w:t>
+            </w:r>
+            <w:r>
+              <w:rPr>
+                <w:b/>
+                <w:bCs/>
+              </w:rPr>
+              <w:t xml:space="preserve">[x]</w:t>
+            </w:r>
+          </w:p>
+        </w:tc>
+      </w:tr>
+      <w:tr>
+        <w:tc>
+          <w:tcPr/>
+          <w:p>
+            <w:pPr>
+              <w:pStyle w:val="Compact"/>
+            </w:pPr>
+            <w:r>
+              <w:rPr>
+                <w:b/>
+                <w:bCs/>
+              </w:rPr>
+              <w:t xml:space="preserve">Operación</w:t>
+            </w:r>
+          </w:p>
+        </w:tc>
+        <w:tc>
+          <w:tcPr/>
+          <w:p>
+            <w:pPr>
+              <w:pStyle w:val="Compact"/>
+            </w:pPr>
+            <w:r>
+              <w:t xml:space="preserve">espacio (facilitado inicialmente por el CONADIS), coordinación, materiales</w:t>
+            </w:r>
+            <w:r>
+              <w:t xml:space="preserve"> </w:t>
+            </w:r>
+            <w:r>
+              <w:rPr>
+                <w:b/>
+                <w:bCs/>
+              </w:rPr>
+              <w:t xml:space="preserve">[x]</w:t>
+            </w:r>
+          </w:p>
+        </w:tc>
+      </w:tr>
+    </w:tbl>
+    <w:p>
+      <w:pPr>
+        <w:pStyle w:val="BodyText"/>
+      </w:pPr>
+      <w:r>
+        <w:rPr>
+          <w:b/>
+          <w:bCs/>
+        </w:rPr>
+        <w:t xml:space="preserve">Nota:</w:t>
+      </w:r>
+      <w:r>
+        <w:t xml:space="preserve"> </w:t>
+      </w:r>
+      <w:r>
+        <w:t xml:space="preserve">las partidas que corresponden a Morpho —capacitación, sistema, asesoría— no son un gasto administrativo:</w:t>
+      </w:r>
+      <w:r>
+        <w:t xml:space="preserve"> </w:t>
+      </w:r>
+      <w:r>
+        <w:rPr>
+          <w:b/>
+          <w:bCs/>
+        </w:rPr>
+        <w:t xml:space="preserve">son la contraprestación por el conocimiento acumulado</w:t>
+      </w:r>
+      <w:r>
+        <w:t xml:space="preserve"> </w:t>
+      </w:r>
+      <w:r>
+        <w:t xml:space="preserve">y, a la vez, ingreso que sostiene a quien enseña (§9). Un esquema de cooperación sur-sur en el que la parte que transfiere la experiencia trabaja sin remuneración no se sostiene en el tiempo.</w:t>
+      </w:r>
+    </w:p>
+    <w:p>
+      <w:r>
+        <w:pict>
+          <v:rect style="width:0;height:1.5pt" o:hralign="center" o:hrstd="t" o:hr="t"/>
+        </w:pict>
+      </w:r>
+    </w:p>
+    <w:bookmarkEnd w:id="22"/>
+    <w:bookmarkStart w:id="23" w:name="Xe76011752e37cf528c9d59fbd93aa710a8e7fed"/>
+    <w:p>
+      <w:pPr>
+        <w:pStyle w:val="Heading2"/>
+      </w:pPr>
+      <w:r>
+        <w:t xml:space="preserve">11. Financiamiento</w:t>
+      </w:r>
+    </w:p>
+    <w:p>
+      <w:pPr>
+        <w:pStyle w:val="FirstParagraph"/>
+      </w:pPr>
+      <w:r>
+        <w:rPr>
+          <w:b/>
+          <w:bCs/>
+        </w:rPr>
+        <w:t xml:space="preserve">El orden importa: primero el país, después la banca.</w:t>
+      </w:r>
+    </w:p>
+    <w:p>
+      <w:pPr>
+        <w:pStyle w:val="BodyText"/>
+      </w:pPr>
+      <w:r>
+        <w:t xml:space="preserve">Explicar el proyecto como sistema es difícil.</w:t>
+      </w:r>
+      <w:r>
+        <w:t xml:space="preserve"> </w:t>
+      </w:r>
+      <w:r>
+        <w:rPr>
+          <w:b/>
+          <w:bCs/>
+        </w:rPr>
+        <w:t xml:space="preserve">Primero queremos tener claro el conjunto y conversarlo con las contrapartes dominicanas</w:t>
+      </w:r>
+      <w:r>
+        <w:t xml:space="preserve">; la argumentación ante la banca de desarrollo viene después.</w:t>
+      </w:r>
+    </w:p>
+    <w:p>
+      <w:pPr>
+        <w:pStyle w:val="BodyText"/>
+      </w:pPr>
+      <w:r>
+        <w:rPr>
+          <w:b/>
+          <w:bCs/>
+        </w:rPr>
+        <w:t xml:space="preserve">Punto de partida y titularidad de la propuesta</w:t>
+      </w:r>
+    </w:p>
+    <w:p>
+      <w:pPr>
+        <w:pStyle w:val="BodyText"/>
+      </w:pPr>
+      <w:r>
+        <w:t xml:space="preserve">El recorrido es:</w:t>
+      </w:r>
+      <w:r>
+        <w:t xml:space="preserve"> </w:t>
+      </w:r>
+      <w:r>
+        <w:rPr>
+          <w:b/>
+          <w:bCs/>
+        </w:rPr>
+        <w:t xml:space="preserve">CIMUDIS → CONADIS</w:t>
+      </w:r>
+      <w:r>
+        <w:t xml:space="preserve">, y</w:t>
+      </w:r>
+      <w:r>
+        <w:t xml:space="preserve"> </w:t>
+      </w:r>
+      <w:r>
+        <w:rPr>
+          <w:b/>
+          <w:bCs/>
+        </w:rPr>
+        <w:t xml:space="preserve">la propuesta ante la banca de desarrollo la presenta oficialmente el CONADIS.</w:t>
+      </w:r>
+      <w:r>
+        <w:t xml:space="preserve"> </w:t>
+      </w:r>
+      <w:r>
+        <w:t xml:space="preserve">El proyecto nace del movimiento y se presenta desde la institución rectora del Estado.</w:t>
+      </w:r>
+    </w:p>
+    <w:p>
+      <w:pPr>
+        <w:pStyle w:val="BodyText"/>
+      </w:pPr>
+      <w:r>
+        <w:t xml:space="preserve">A partir de ahí se conversa</w:t>
+      </w:r>
+      <w:r>
+        <w:t xml:space="preserve"> </w:t>
+      </w:r>
+      <w:r>
+        <w:rPr>
+          <w:b/>
+          <w:bCs/>
+        </w:rPr>
+        <w:t xml:space="preserve">cuánto de esto puede cubrirse con recursos nacionales</w:t>
+      </w:r>
+      <w:r>
+        <w:t xml:space="preserve"> </w:t>
+      </w:r>
+      <w:r>
+        <w:t xml:space="preserve">— FONADIS (fondo designado a vida independiente), Supérate / Comunidades de Cuidado, Ministerio de la Mujer.</w:t>
+      </w:r>
+      <w:r>
+        <w:t xml:space="preserve"> </w:t>
+      </w:r>
+      <w:r>
+        <w:rPr>
+          <w:b/>
+          <w:bCs/>
+        </w:rPr>
+        <w:t xml:space="preserve">El presupuesto se presenta completo</w:t>
+      </w:r>
+      <w:r>
+        <w:t xml:space="preserve">, y la proporción entre aporte nacional y financiamiento externo se define en esa conversación, no antes.</w:t>
+      </w:r>
+    </w:p>
+    <w:p>
+      <w:pPr>
+        <w:pStyle w:val="BodyText"/>
+      </w:pPr>
+      <w:r>
+        <w:rPr>
+          <w:b/>
+          <w:bCs/>
+        </w:rPr>
+        <w:t xml:space="preserve">JICA (proyecto previsto desde 2027)</w:t>
+      </w:r>
+    </w:p>
+    <w:p>
+      <w:pPr>
+        <w:pStyle w:val="BodyText"/>
+      </w:pPr>
+      <w:r>
+        <w:t xml:space="preserve">No se trata de que un actor apoye al otro:</w:t>
+      </w:r>
+      <w:r>
+        <w:t xml:space="preserve"> </w:t>
+      </w:r>
+      <w:r>
+        <w:rPr>
+          <w:b/>
+          <w:bCs/>
+        </w:rPr>
+        <w:t xml:space="preserve">son iniciativas de naturaleza distinta y por eso se potencian mutuamente.</w:t>
+      </w:r>
+      <w:r>
+        <w:t xml:space="preserve"> </w:t>
+      </w:r>
+      <w:r>
+        <w:t xml:space="preserve">La intención es que se complementen, y se irá conversando según avance.</w:t>
+      </w:r>
+    </w:p>
+    <w:p>
+      <w:pPr>
+        <w:pStyle w:val="BodyText"/>
+      </w:pPr>
+      <w:r>
+        <w:rPr>
+          <w:b/>
+          <w:bCs/>
+        </w:rPr>
+        <w:t xml:space="preserve">CAF</w:t>
+      </w:r>
+    </w:p>
+    <w:p>
+      <w:pPr>
+        <w:pStyle w:val="BodyText"/>
+      </w:pPr>
+      <w:r>
+        <w:t xml:space="preserve">La CAF financia principalmente a</w:t>
+      </w:r>
+      <w:r>
+        <w:t xml:space="preserve"> </w:t>
+      </w:r>
+      <w:r>
+        <w:rPr>
+          <w:b/>
+          <w:bCs/>
+        </w:rPr>
+        <w:t xml:space="preserve">gobiernos</w:t>
+      </w:r>
+      <w:r>
+        <w:t xml:space="preserve"> </w:t>
+      </w:r>
+      <w:r>
+        <w:t xml:space="preserve">de sus países miembro, mediante créditos y cooperaciones técnicas; con organizaciones de la sociedad civil realiza colaboraciones puntuales, orientadas sobre todo a</w:t>
+      </w:r>
+      <w:r>
+        <w:t xml:space="preserve"> </w:t>
+      </w:r>
+      <w:r>
+        <w:rPr>
+          <w:b/>
+          <w:bCs/>
+        </w:rPr>
+        <w:t xml:space="preserve">estudios, productos de conocimiento, jornadas y consultas</w:t>
+      </w:r>
+      <w:r>
+        <w:t xml:space="preserve">.</w:t>
+      </w:r>
+    </w:p>
+    <w:p>
+      <w:pPr>
+        <w:pStyle w:val="BodyText"/>
+      </w:pPr>
+      <w:r>
+        <w:t xml:space="preserve">Este proyecto encaja con ese marco:</w:t>
+      </w:r>
+      <w:r>
+        <w:t xml:space="preserve"> </w:t>
+      </w:r>
+      <w:r>
+        <w:rPr>
+          <w:b/>
+          <w:bCs/>
+        </w:rPr>
+        <w:t xml:space="preserve">la propuesta la presenta el CONADIS</w:t>
+      </w:r>
+      <w:r>
+        <w:t xml:space="preserve">, y lo que produce es exactamente ese tipo de resultado.</w:t>
+      </w:r>
+    </w:p>
+    <w:p>
+      <w:pPr>
+        <w:pStyle w:val="Compact"/>
+        <w:numPr>
+          <w:ilvl w:val="0"/>
+          <w:numId w:val="1011"/>
+        </w:numPr>
+      </w:pPr>
+      <w:r>
+        <w:t xml:space="preserve">el</w:t>
+      </w:r>
+      <w:r>
+        <w:t xml:space="preserve"> </w:t>
+      </w:r>
+      <w:r>
+        <w:rPr>
+          <w:b/>
+          <w:bCs/>
+        </w:rPr>
+        <w:t xml:space="preserve">programa de formación de asistentes personales</w:t>
+      </w:r>
+      <w:r>
+        <w:t xml:space="preserve"> </w:t>
+      </w:r>
+      <w:r>
+        <w:t xml:space="preserve">sistematizado a partir de Morpho (§8) — un producto de conocimiento transferible a toda la región;</w:t>
+      </w:r>
+    </w:p>
+    <w:p>
+      <w:pPr>
+        <w:pStyle w:val="Compact"/>
+        <w:numPr>
+          <w:ilvl w:val="0"/>
+          <w:numId w:val="1011"/>
+        </w:numPr>
+      </w:pPr>
+      <w:r>
+        <w:t xml:space="preserve">la</w:t>
+      </w:r>
+      <w:r>
+        <w:t xml:space="preserve"> </w:t>
+      </w:r>
+      <w:r>
+        <w:rPr>
+          <w:b/>
+          <w:bCs/>
+        </w:rPr>
+        <w:t xml:space="preserve">capacitación en Costa Rica</w:t>
+      </w:r>
+      <w:r>
+        <w:t xml:space="preserve"> </w:t>
+      </w:r>
+      <w:r>
+        <w:t xml:space="preserve">(§7) — jornada y consulta entre instituciones de dos países;</w:t>
+      </w:r>
+    </w:p>
+    <w:p>
+      <w:pPr>
+        <w:pStyle w:val="Compact"/>
+        <w:numPr>
+          <w:ilvl w:val="0"/>
+          <w:numId w:val="1011"/>
+        </w:numPr>
+      </w:pPr>
+      <w:r>
+        <w:t xml:space="preserve">la</w:t>
+      </w:r>
+      <w:r>
+        <w:t xml:space="preserve"> </w:t>
+      </w:r>
+      <w:r>
+        <w:rPr>
+          <w:b/>
+          <w:bCs/>
+        </w:rPr>
+        <w:t xml:space="preserve">evaluación con datos</w:t>
+      </w:r>
+      <w:r>
+        <w:t xml:space="preserve"> </w:t>
+      </w:r>
+      <w:r>
+        <w:t xml:space="preserve">de 2028 (§5) — estudio.</w:t>
+      </w:r>
+    </w:p>
+    <w:p>
+      <w:pPr>
+        <w:pStyle w:val="FirstParagraph"/>
+      </w:pPr>
+      <w:r>
+        <w:t xml:space="preserve">Sobre esa base se retomará la conversación con la CAF.</w:t>
+      </w:r>
+    </w:p>
+    <w:p>
+      <w:pPr>
+        <w:pStyle w:val="BodyText"/>
+      </w:pPr>
+      <w:r>
+        <w:rPr>
+          <w:b/>
+          <w:bCs/>
+        </w:rPr>
+        <w:t xml:space="preserve">Camino hacia 2028</w:t>
+      </w:r>
+    </w:p>
+    <w:p>
+      <w:pPr>
+        <w:pStyle w:val="BodyText"/>
+      </w:pPr>
+      <w:r>
+        <w:t xml:space="preserve">Para la presentación conjunta en la Conferencia:</w:t>
+      </w:r>
+      <w:r>
+        <w:t xml:space="preserve"> </w:t>
+      </w:r>
+      <w:r>
+        <w:rPr>
+          <w:b/>
+          <w:bCs/>
+        </w:rPr>
+        <w:t xml:space="preserve">primero se trabaja con la OIT, y en paralelo se escribe a la CAF.</w:t>
+      </w:r>
+    </w:p>
+    <w:p>
+      <w:pPr>
+        <w:pStyle w:val="BodyText"/>
+      </w:pPr>
+      <w:r>
+        <w:rPr>
+          <w:b/>
+          <w:bCs/>
+        </w:rPr>
+        <w:t xml:space="preserve">Fuentes por explorar:</w:t>
+      </w:r>
+      <w:r>
+        <w:t xml:space="preserve"> </w:t>
+      </w:r>
+      <w:r>
+        <w:t xml:space="preserve">CONADIS / FONADIS / Supérate / Ministerio de la Mujer (nacional) · OIT · JICA · CAF · BID · Banco Mundial</w:t>
+      </w:r>
+    </w:p>
+    <w:bookmarkEnd w:id="23"/>
+    <w:bookmarkStart w:id="24" w:name="X1f1df990115bae087baba3e3a7933e834838422"/>
+    <w:p>
+      <w:pPr>
+        <w:pStyle w:val="Heading2"/>
+      </w:pPr>
+      <w:r>
+        <w:t xml:space="preserve">12. Puntos por definir</w:t>
+      </w:r>
+    </w:p>
+    <w:tbl>
+      <w:tblPr>
+        <w:tblStyle w:val="Table"/>
+        <w:tblW w:type="auto" w:w="0"/>
+        <w:tblLook w:firstRow="1" w:lastRow="0" w:firstColumn="0" w:lastColumn="0" w:noHBand="0" w:noVBand="0" w:val="0020"/>
+      </w:tblPr>
+      <w:tblGrid>
+        <w:gridCol w:w="3960"/>
+        <w:gridCol w:w="3960"/>
+      </w:tblGrid>
+      <w:tr>
+        <w:trPr>
+          <w:tblHeader w:val="on"/>
+        </w:trPr>
+        <w:tc>
+          <w:tcPr/>
+          <w:p>
+            <w:pPr>
+              <w:pStyle w:val="Compact"/>
+            </w:pPr>
+          </w:p>
+        </w:tc>
+        <w:tc>
+          <w:tcPr/>
+          <w:p>
+            <w:pPr>
+              <w:pStyle w:val="Compact"/>
+            </w:pPr>
+          </w:p>
+        </w:tc>
+      </w:tr>
+      <w:tr>
+        <w:tc>
+          <w:tcPr/>
+          <w:p>
+            <w:pPr>
+              <w:pStyle w:val="Compact"/>
+            </w:pPr>
+            <w:r>
+              <w:t xml:space="preserve">Personas usuarias</w:t>
+            </w:r>
+          </w:p>
+        </w:tc>
+        <w:tc>
+          <w:tcPr/>
+          <w:p>
+            <w:pPr>
+              <w:pStyle w:val="Compact"/>
+            </w:pPr>
+            <w:r>
+              <w:t xml:space="preserve">número final y criterio de selección territorial</w:t>
+            </w:r>
+          </w:p>
+        </w:tc>
+      </w:tr>
+      <w:tr>
+        <w:tc>
+          <w:tcPr/>
+          <w:p>
+            <w:pPr>
+              <w:pStyle w:val="Compact"/>
+            </w:pPr>
+            <w:r>
+              <w:t xml:space="preserve">Contenido del 2.º trimestre de 2027</w:t>
+            </w:r>
+          </w:p>
+        </w:tc>
+        <w:tc>
+          <w:tcPr/>
+          <w:p>
+            <w:pPr>
+              <w:pStyle w:val="Compact"/>
+            </w:pPr>
+            <w:r>
+              <w:t xml:space="preserve">qué se prepara entre la vuelta de Costa Rica y el arranque</w:t>
+            </w:r>
+          </w:p>
+        </w:tc>
+      </w:tr>
+      <w:tr>
+        <w:tc>
+          <w:tcPr/>
+          <w:p>
+            <w:pPr>
+              <w:pStyle w:val="Compact"/>
+            </w:pPr>
+            <w:r>
+              <w:t xml:space="preserve">Tarifa de asistencia personal</w:t>
+            </w:r>
+          </w:p>
+        </w:tc>
+        <w:tc>
+          <w:tcPr/>
+          <w:p>
+            <w:pPr>
+              <w:pStyle w:val="Compact"/>
+            </w:pPr>
+            <w:r>
               <w:t xml:space="preserve">monto y quién paga qué proporción al inicio</w:t>
+            </w:r>
+          </w:p>
+        </w:tc>
+      </w:tr>
+      <w:tr>
+        <w:tc>
+          <w:tcPr/>
+          <w:p>
+            <w:pPr>
+              <w:pStyle w:val="Compact"/>
+            </w:pPr>
+            <w:r>
+              <w:t xml:space="preserve">Honorarios de Morpho</w:t>
+            </w:r>
+          </w:p>
+        </w:tc>
+        <w:tc>
+          <w:tcPr/>
+          <w:p>
+            <w:pPr>
+              <w:pStyle w:val="Compact"/>
+            </w:pPr>
+            <w:r>
+              <w:t xml:space="preserve">capacitación en Costa Rica y asesoría en línea</w:t>
             </w:r>
           </w:p>
         </w:tc>

</xml_diff>

<commit_message>
RD v2: corrige el mapa de financiamiento (Fondo ODS, no Supérate; alcance real del FONADIS)
- Comunidades de Cuidado se financia con el Fondo Conjunto para los ODS,
  liderado por ONU Mujeres, OIT, UNFPA y PNUD. Supérate ejecuta, no financia.
- FONADIS (Ley 5-13, arts. 136-139): el art. 137 no contempla la prestación de
  servicios de apoyo humano; el art. 139.2 sí lo habilita como receptor de
  cooperación internacional. Queda como punto a consultar con CONADIS.
- Primera pregunta a resolver: si pueden activarse los recursos ya asignados a
  la rama de discapacidad del piloto, en lugar de buscar fondos nuevos.

Co-Authored-By: Claude Opus 5 <noreply@anthropic.com>
</commit_message>
<xml_diff>
--- a/republica-dominicana/propuesta-proyecto-AP/Propuesta-v2-piloto-AP-RD-2027-2030.docx
+++ b/republica-dominicana/propuesta-proyecto-AP/Propuesta-v2-piloto-AP-RD-2027-2030.docx
@@ -2717,13 +2717,10 @@
           <w:b/>
           <w:bCs/>
         </w:rPr>
-        <w:t xml:space="preserve">cuánto de esto puede cubrirse con recursos nacionales</w:t>
-      </w:r>
-      <w:r>
-        <w:t xml:space="preserve"> </w:t>
-      </w:r>
-      <w:r>
-        <w:t xml:space="preserve">— FONADIS (fondo designado a vida independiente), Supérate / Comunidades de Cuidado, Ministerio de la Mujer.</w:t>
+        <w:t xml:space="preserve">cuánto de esto puede cubrirse con recursos ya existentes</w:t>
+      </w:r>
+      <w:r>
+        <w:t xml:space="preserve">.</w:t>
       </w:r>
       <w:r>
         <w:t xml:space="preserve"> </w:t>
@@ -2736,7 +2733,7 @@
         <w:t xml:space="preserve">El presupuesto se presenta completo</w:t>
       </w:r>
       <w:r>
-        <w:t xml:space="preserve">, y la proporción entre aporte nacional y financiamiento externo se define en esa conversación, no antes.</w:t>
+        <w:t xml:space="preserve">, y la proporción se define en esa conversación, no antes.</w:t>
       </w:r>
     </w:p>
     <w:p>
@@ -2748,101 +2745,7 @@
           <w:b/>
           <w:bCs/>
         </w:rPr>
-        <w:t xml:space="preserve">JICA (proyecto previsto desde 2027)</w:t>
-      </w:r>
-    </w:p>
-    <w:p>
-      <w:pPr>
-        <w:pStyle w:val="BodyText"/>
-      </w:pPr>
-      <w:r>
-        <w:t xml:space="preserve">No se trata de que un actor apoye al otro:</w:t>
-      </w:r>
-      <w:r>
-        <w:t xml:space="preserve"> </w:t>
-      </w:r>
-      <w:r>
-        <w:rPr>
-          <w:b/>
-          <w:bCs/>
-        </w:rPr>
-        <w:t xml:space="preserve">son iniciativas de naturaleza distinta y por eso se potencian mutuamente.</w:t>
-      </w:r>
-      <w:r>
-        <w:t xml:space="preserve"> </w:t>
-      </w:r>
-      <w:r>
-        <w:t xml:space="preserve">La intención es que se complementen, y se irá conversando según avance.</w:t>
-      </w:r>
-    </w:p>
-    <w:p>
-      <w:pPr>
-        <w:pStyle w:val="BodyText"/>
-      </w:pPr>
-      <w:r>
-        <w:rPr>
-          <w:b/>
-          <w:bCs/>
-        </w:rPr>
-        <w:t xml:space="preserve">CAF</w:t>
-      </w:r>
-    </w:p>
-    <w:p>
-      <w:pPr>
-        <w:pStyle w:val="BodyText"/>
-      </w:pPr>
-      <w:r>
-        <w:t xml:space="preserve">La CAF financia principalmente a</w:t>
-      </w:r>
-      <w:r>
-        <w:t xml:space="preserve"> </w:t>
-      </w:r>
-      <w:r>
-        <w:rPr>
-          <w:b/>
-          <w:bCs/>
-        </w:rPr>
-        <w:t xml:space="preserve">gobiernos</w:t>
-      </w:r>
-      <w:r>
-        <w:t xml:space="preserve"> </w:t>
-      </w:r>
-      <w:r>
-        <w:t xml:space="preserve">de sus países miembro, mediante créditos y cooperaciones técnicas; con organizaciones de la sociedad civil realiza colaboraciones puntuales, orientadas sobre todo a</w:t>
-      </w:r>
-      <w:r>
-        <w:t xml:space="preserve"> </w:t>
-      </w:r>
-      <w:r>
-        <w:rPr>
-          <w:b/>
-          <w:bCs/>
-        </w:rPr>
-        <w:t xml:space="preserve">estudios, productos de conocimiento, jornadas y consultas</w:t>
-      </w:r>
-      <w:r>
-        <w:t xml:space="preserve">.</w:t>
-      </w:r>
-    </w:p>
-    <w:p>
-      <w:pPr>
-        <w:pStyle w:val="BodyText"/>
-      </w:pPr>
-      <w:r>
-        <w:t xml:space="preserve">Este proyecto encaja con ese marco:</w:t>
-      </w:r>
-      <w:r>
-        <w:t xml:space="preserve"> </w:t>
-      </w:r>
-      <w:r>
-        <w:rPr>
-          <w:b/>
-          <w:bCs/>
-        </w:rPr>
-        <w:t xml:space="preserve">la propuesta la presenta el CONADIS</w:t>
-      </w:r>
-      <w:r>
-        <w:t xml:space="preserve">, y lo que produce es exactamente ese tipo de resultado.</w:t>
+        <w:t xml:space="preserve">Dónde está hoy el dinero de los cuidados en la República Dominicana — y qué hay que verificar</w:t>
       </w:r>
     </w:p>
     <w:p>
@@ -2854,23 +2757,107 @@
         </w:numPr>
       </w:pPr>
       <w:r>
-        <w:t xml:space="preserve">el</w:t>
-      </w:r>
-      <w:r>
-        <w:t xml:space="preserve"> </w:t>
-      </w:r>
-      <w:r>
-        <w:rPr>
-          <w:b/>
-          <w:bCs/>
-        </w:rPr>
-        <w:t xml:space="preserve">programa de formación de asistentes personales</w:t>
-      </w:r>
-      <w:r>
-        <w:t xml:space="preserve"> </w:t>
-      </w:r>
-      <w:r>
-        <w:t xml:space="preserve">sistematizado a partir de Morpho (§8) — un producto de conocimiento transferible a toda la región;</w:t>
+        <w:rPr>
+          <w:b/>
+          <w:bCs/>
+        </w:rPr>
+        <w:t xml:space="preserve">Comunidades de Cuidado</w:t>
+      </w:r>
+      <w:r>
+        <w:t xml:space="preserve"> </w:t>
+      </w:r>
+      <w:r>
+        <w:t xml:space="preserve">—el piloto de la Política Nacional de Cuidados, en cuyo marco se presentó en 2023 el programa de asistencia personal—</w:t>
+      </w:r>
+      <w:r>
+        <w:t xml:space="preserve"> </w:t>
+      </w:r>
+      <w:r>
+        <w:rPr>
+          <w:b/>
+          <w:bCs/>
+        </w:rPr>
+        <w:t xml:space="preserve">se financia con el Fondo Conjunto para los ODS de las Naciones Unidas</w:t>
+      </w:r>
+      <w:r>
+        <w:t xml:space="preserve">, recibido por primera vez por el país en 2022. Lo lideran</w:t>
+      </w:r>
+      <w:r>
+        <w:t xml:space="preserve"> </w:t>
+      </w:r>
+      <w:r>
+        <w:rPr>
+          <w:b/>
+          <w:bCs/>
+        </w:rPr>
+        <w:t xml:space="preserve">ONU Mujeres, la OIT, el UNFPA y el PNUD</w:t>
+      </w:r>
+      <w:r>
+        <w:t xml:space="preserve">, articulando a once instituciones públicas, entre ellas el CONADIS.</w:t>
+      </w:r>
+      <w:r>
+        <w:t xml:space="preserve"> </w:t>
+      </w:r>
+      <w:r>
+        <w:rPr>
+          <w:b/>
+          <w:bCs/>
+        </w:rPr>
+        <w:t xml:space="preserve">Supérate</w:t>
+      </w:r>
+      <w:r>
+        <w:t xml:space="preserve"> </w:t>
+      </w:r>
+      <w:r>
+        <w:t xml:space="preserve">conduce la ejecución en el terreno desde 2021, pero</w:t>
+      </w:r>
+      <w:r>
+        <w:t xml:space="preserve"> </w:t>
+      </w:r>
+      <w:r>
+        <w:rPr>
+          <w:b/>
+          <w:bCs/>
+        </w:rPr>
+        <w:t xml:space="preserve">no es el origen de los fondos</w:t>
+      </w:r>
+      <w:r>
+        <w:t xml:space="preserve">.</w:t>
+      </w:r>
+      <w:r>
+        <w:t xml:space="preserve"> </w:t>
+      </w:r>
+      <w:r>
+        <w:t xml:space="preserve">→</w:t>
+      </w:r>
+      <w:r>
+        <w:t xml:space="preserve"> </w:t>
+      </w:r>
+      <w:r>
+        <w:rPr>
+          <w:b/>
+          <w:bCs/>
+        </w:rPr>
+        <w:t xml:space="preserve">La rama de discapacidad de ese piloto es precisamente la que quedó detenida.</w:t>
+      </w:r>
+      <w:r>
+        <w:t xml:space="preserve"> </w:t>
+      </w:r>
+      <w:r>
+        <w:t xml:space="preserve">La primera pregunta a resolver con las contrapartes es si</w:t>
+      </w:r>
+      <w:r>
+        <w:t xml:space="preserve"> </w:t>
+      </w:r>
+      <w:r>
+        <w:rPr>
+          <w:b/>
+          <w:bCs/>
+        </w:rPr>
+        <w:t xml:space="preserve">los recursos ya asignados a esa rama pueden activarse</w:t>
+      </w:r>
+      <w:r>
+        <w:t xml:space="preserve">, en lugar de buscar financiamiento nuevo para lo mismo.</w:t>
       </w:r>
     </w:p>
     <w:p>
@@ -2882,23 +2869,116 @@
         </w:numPr>
       </w:pPr>
       <w:r>
-        <w:t xml:space="preserve">la</w:t>
-      </w:r>
-      <w:r>
-        <w:t xml:space="preserve"> </w:t>
-      </w:r>
-      <w:r>
-        <w:rPr>
-          <w:b/>
-          <w:bCs/>
-        </w:rPr>
-        <w:t xml:space="preserve">capacitación en Costa Rica</w:t>
-      </w:r>
-      <w:r>
-        <w:t xml:space="preserve"> </w:t>
-      </w:r>
-      <w:r>
-        <w:t xml:space="preserve">(§7) — jornada y consulta entre instituciones de dos países;</w:t>
+        <w:rPr>
+          <w:b/>
+          <w:bCs/>
+        </w:rPr>
+        <w:t xml:space="preserve">FONADIS</w:t>
+      </w:r>
+      <w:r>
+        <w:t xml:space="preserve"> </w:t>
+      </w:r>
+      <w:r>
+        <w:t xml:space="preserve">— Fondo Nacional para la Discapacidad, creado por los</w:t>
+      </w:r>
+      <w:r>
+        <w:t xml:space="preserve"> </w:t>
+      </w:r>
+      <w:r>
+        <w:rPr>
+          <w:b/>
+          <w:bCs/>
+        </w:rPr>
+        <w:t xml:space="preserve">artículos 136 a 139 de la Ley 5-13</w:t>
+      </w:r>
+      <w:r>
+        <w:t xml:space="preserve"> </w:t>
+      </w:r>
+      <w:r>
+        <w:t xml:space="preserve">y reglamentado por el Directorio Nacional del CONADIS. Conviene precisar su alcance:</w:t>
+      </w:r>
+      <w:r>
+        <w:t xml:space="preserve"> </w:t>
+      </w:r>
+      <w:r>
+        <w:rPr>
+          <w:b/>
+          <w:bCs/>
+        </w:rPr>
+        <w:t xml:space="preserve">el artículo 137 enumera seis objetivos —crédito productivo, becas, dispositivos de apoyo y ayudas humanitarias, equipos tecnológicos, promoción de derechos y fortalecimiento de las organizaciones— y no menciona la prestación de servicios de apoyo humano.</w:t>
+      </w:r>
+      <w:r>
+        <w:t xml:space="preserve"> </w:t>
+      </w:r>
+      <w:r>
+        <w:t xml:space="preserve">(La Ley 5-13 tampoco emplea la expresión «asistencia personal».)</w:t>
+      </w:r>
+      <w:r>
+        <w:t xml:space="preserve"> </w:t>
+      </w:r>
+      <w:r>
+        <w:t xml:space="preserve">→ Habría que consultar con el CONADIS</w:t>
+      </w:r>
+      <w:r>
+        <w:t xml:space="preserve"> </w:t>
+      </w:r>
+      <w:r>
+        <w:rPr>
+          <w:b/>
+          <w:bCs/>
+        </w:rPr>
+        <w:t xml:space="preserve">si el FONADIS puede cubrir el pago de asistencia personal, o si haría falta una vía distinta.</w:t>
+      </w:r>
+      <w:r>
+        <w:t xml:space="preserve"> </w:t>
+      </w:r>
+      <w:r>
+        <w:t xml:space="preserve">En cambio, el</w:t>
+      </w:r>
+      <w:r>
+        <w:t xml:space="preserve"> </w:t>
+      </w:r>
+      <w:r>
+        <w:rPr>
+          <w:b/>
+          <w:bCs/>
+        </w:rPr>
+        <w:t xml:space="preserve">artículo 139.2</w:t>
+      </w:r>
+      <w:r>
+        <w:t xml:space="preserve"> </w:t>
+      </w:r>
+      <w:r>
+        <w:t xml:space="preserve">sí prevé expresamente que el fondo se nutra de</w:t>
+      </w:r>
+      <w:r>
+        <w:t xml:space="preserve"> </w:t>
+      </w:r>
+      <w:r>
+        <w:rPr>
+          <w:b/>
+          <w:bCs/>
+        </w:rPr>
+        <w:t xml:space="preserve">donaciones y aportes de la cooperación nacional e internacional</w:t>
+      </w:r>
+      <w:r>
+        <w:t xml:space="preserve">: por ahí el FONADIS puede funcionar como</w:t>
+      </w:r>
+      <w:r>
+        <w:t xml:space="preserve"> </w:t>
+      </w:r>
+      <w:r>
+        <w:rPr>
+          <w:b/>
+          <w:bCs/>
+        </w:rPr>
+        <w:t xml:space="preserve">receptor</w:t>
+      </w:r>
+      <w:r>
+        <w:t xml:space="preserve"> </w:t>
+      </w:r>
+      <w:r>
+        <w:t xml:space="preserve">de financiamiento externo.</w:t>
       </w:r>
     </w:p>
     <w:p>
@@ -2907,6 +2987,250 @@
         <w:numPr>
           <w:ilvl w:val="0"/>
           <w:numId w:val="1011"/>
+        </w:numPr>
+      </w:pPr>
+      <w:r>
+        <w:rPr>
+          <w:b/>
+          <w:bCs/>
+        </w:rPr>
+        <w:t xml:space="preserve">Ministerio de la Mujer</w:t>
+      </w:r>
+      <w:r>
+        <w:t xml:space="preserve"> </w:t>
+      </w:r>
+      <w:r>
+        <w:t xml:space="preserve">— impulsa la</w:t>
+      </w:r>
+      <w:r>
+        <w:t xml:space="preserve"> </w:t>
+      </w:r>
+      <w:r>
+        <w:rPr>
+          <w:b/>
+          <w:bCs/>
+        </w:rPr>
+        <w:t xml:space="preserve">Ley del Sistema Nacional de Cuidados</w:t>
+      </w:r>
+      <w:r>
+        <w:t xml:space="preserve">, con apoyo de ONU Mujeres. Es la contraparte política del proyecto (§3).</w:t>
+      </w:r>
+    </w:p>
+    <w:p>
+      <w:pPr>
+        <w:pStyle w:val="BlockText"/>
+      </w:pPr>
+      <w:r>
+        <w:rPr>
+          <w:b/>
+          <w:bCs/>
+        </w:rPr>
+        <w:t xml:space="preserve">Nota sobre ONU Mujeres:</w:t>
+      </w:r>
+      <w:r>
+        <w:t xml:space="preserve"> </w:t>
+      </w:r>
+      <w:r>
+        <w:t xml:space="preserve">es la entidad líder de</w:t>
+      </w:r>
+      <w:r>
+        <w:t xml:space="preserve"> </w:t>
+      </w:r>
+      <w:r>
+        <w:rPr>
+          <w:i/>
+          <w:iCs/>
+        </w:rPr>
+        <w:t xml:space="preserve">Comunidades de Cuidado</w:t>
+      </w:r>
+      <w:r>
+        <w:t xml:space="preserve"> </w:t>
+      </w:r>
+      <w:r>
+        <w:t xml:space="preserve">y acompaña al Ministerio de la Mujer en la ley del sistema de cuidados.</w:t>
+      </w:r>
+      <w:r>
+        <w:t xml:space="preserve"> </w:t>
+      </w:r>
+      <w:r>
+        <w:rPr>
+          <w:b/>
+          <w:bCs/>
+        </w:rPr>
+        <w:t xml:space="preserve">Está, por tanto, en los dos extremos de este proyecto</w:t>
+      </w:r>
+      <w:r>
+        <w:t xml:space="preserve">: el marco de género en el que se inscribe y el mecanismo que financia el piloto donde la asistencia personal quedó pendiente.</w:t>
+      </w:r>
+    </w:p>
+    <w:p>
+      <w:pPr>
+        <w:pStyle w:val="FirstParagraph"/>
+      </w:pPr>
+      <w:r>
+        <w:rPr>
+          <w:b/>
+          <w:bCs/>
+        </w:rPr>
+        <w:t xml:space="preserve">JICA (proyecto previsto desde 2027)</w:t>
+      </w:r>
+    </w:p>
+    <w:p>
+      <w:pPr>
+        <w:pStyle w:val="BodyText"/>
+      </w:pPr>
+      <w:r>
+        <w:t xml:space="preserve">No se trata de que un actor apoye al otro:</w:t>
+      </w:r>
+      <w:r>
+        <w:t xml:space="preserve"> </w:t>
+      </w:r>
+      <w:r>
+        <w:rPr>
+          <w:b/>
+          <w:bCs/>
+        </w:rPr>
+        <w:t xml:space="preserve">son iniciativas de naturaleza distinta y por eso se potencian mutuamente.</w:t>
+      </w:r>
+      <w:r>
+        <w:t xml:space="preserve"> </w:t>
+      </w:r>
+      <w:r>
+        <w:t xml:space="preserve">La intención es que se complementen, y se irá conversando según avance.</w:t>
+      </w:r>
+    </w:p>
+    <w:p>
+      <w:pPr>
+        <w:pStyle w:val="BodyText"/>
+      </w:pPr>
+      <w:r>
+        <w:rPr>
+          <w:b/>
+          <w:bCs/>
+        </w:rPr>
+        <w:t xml:space="preserve">CAF</w:t>
+      </w:r>
+    </w:p>
+    <w:p>
+      <w:pPr>
+        <w:pStyle w:val="BodyText"/>
+      </w:pPr>
+      <w:r>
+        <w:t xml:space="preserve">La CAF financia principalmente a</w:t>
+      </w:r>
+      <w:r>
+        <w:t xml:space="preserve"> </w:t>
+      </w:r>
+      <w:r>
+        <w:rPr>
+          <w:b/>
+          <w:bCs/>
+        </w:rPr>
+        <w:t xml:space="preserve">gobiernos</w:t>
+      </w:r>
+      <w:r>
+        <w:t xml:space="preserve"> </w:t>
+      </w:r>
+      <w:r>
+        <w:t xml:space="preserve">de sus países miembro, mediante créditos y cooperaciones técnicas; con organizaciones de la sociedad civil realiza colaboraciones puntuales, orientadas sobre todo a</w:t>
+      </w:r>
+      <w:r>
+        <w:t xml:space="preserve"> </w:t>
+      </w:r>
+      <w:r>
+        <w:rPr>
+          <w:b/>
+          <w:bCs/>
+        </w:rPr>
+        <w:t xml:space="preserve">estudios, productos de conocimiento, jornadas y consultas</w:t>
+      </w:r>
+      <w:r>
+        <w:t xml:space="preserve">.</w:t>
+      </w:r>
+    </w:p>
+    <w:p>
+      <w:pPr>
+        <w:pStyle w:val="BodyText"/>
+      </w:pPr>
+      <w:r>
+        <w:t xml:space="preserve">Este proyecto encaja con ese marco:</w:t>
+      </w:r>
+      <w:r>
+        <w:t xml:space="preserve"> </w:t>
+      </w:r>
+      <w:r>
+        <w:rPr>
+          <w:b/>
+          <w:bCs/>
+        </w:rPr>
+        <w:t xml:space="preserve">la propuesta la presenta el CONADIS</w:t>
+      </w:r>
+      <w:r>
+        <w:t xml:space="preserve">, y lo que produce es exactamente ese tipo de resultado.</w:t>
+      </w:r>
+    </w:p>
+    <w:p>
+      <w:pPr>
+        <w:pStyle w:val="Compact"/>
+        <w:numPr>
+          <w:ilvl w:val="0"/>
+          <w:numId w:val="1012"/>
+        </w:numPr>
+      </w:pPr>
+      <w:r>
+        <w:t xml:space="preserve">el</w:t>
+      </w:r>
+      <w:r>
+        <w:t xml:space="preserve"> </w:t>
+      </w:r>
+      <w:r>
+        <w:rPr>
+          <w:b/>
+          <w:bCs/>
+        </w:rPr>
+        <w:t xml:space="preserve">programa de formación de asistentes personales</w:t>
+      </w:r>
+      <w:r>
+        <w:t xml:space="preserve"> </w:t>
+      </w:r>
+      <w:r>
+        <w:t xml:space="preserve">sistematizado a partir de Morpho (§8) — un producto de conocimiento transferible a toda la región;</w:t>
+      </w:r>
+    </w:p>
+    <w:p>
+      <w:pPr>
+        <w:pStyle w:val="Compact"/>
+        <w:numPr>
+          <w:ilvl w:val="0"/>
+          <w:numId w:val="1012"/>
+        </w:numPr>
+      </w:pPr>
+      <w:r>
+        <w:t xml:space="preserve">la</w:t>
+      </w:r>
+      <w:r>
+        <w:t xml:space="preserve"> </w:t>
+      </w:r>
+      <w:r>
+        <w:rPr>
+          <w:b/>
+          <w:bCs/>
+        </w:rPr>
+        <w:t xml:space="preserve">capacitación en Costa Rica</w:t>
+      </w:r>
+      <w:r>
+        <w:t xml:space="preserve"> </w:t>
+      </w:r>
+      <w:r>
+        <w:t xml:space="preserve">(§7) — jornada y consulta entre instituciones de dos países;</w:t>
+      </w:r>
+    </w:p>
+    <w:p>
+      <w:pPr>
+        <w:pStyle w:val="Compact"/>
+        <w:numPr>
+          <w:ilvl w:val="0"/>
+          <w:numId w:val="1012"/>
         </w:numPr>
       </w:pPr>
       <w:r>
@@ -3225,6 +3549,50 @@
           </w:p>
         </w:tc>
       </w:tr>
+      <w:tr>
+        <w:tc>
+          <w:tcPr/>
+          <w:p>
+            <w:pPr>
+              <w:pStyle w:val="Compact"/>
+            </w:pPr>
+            <w:r>
+              <w:rPr>
+                <w:b/>
+                <w:bCs/>
+              </w:rPr>
+              <w:t xml:space="preserve">Origen del pago de AP</w:t>
+            </w:r>
+          </w:p>
+        </w:tc>
+        <w:tc>
+          <w:tcPr/>
+          <w:p>
+            <w:pPr>
+              <w:pStyle w:val="Compact"/>
+            </w:pPr>
+            <w:r>
+              <w:t xml:space="preserve">si los recursos de la rama de discapacidad de</w:t>
+            </w:r>
+            <w:r>
+              <w:t xml:space="preserve"> </w:t>
+            </w:r>
+            <w:r>
+              <w:rPr>
+                <w:i/>
+                <w:iCs/>
+              </w:rPr>
+              <w:t xml:space="preserve">Comunidades de Cuidado</w:t>
+            </w:r>
+            <w:r>
+              <w:t xml:space="preserve"> </w:t>
+            </w:r>
+            <w:r>
+              <w:t xml:space="preserve">pueden activarse; si el FONADIS puede cubrir servicios de apoyo humano (art. 137 no lo contempla)</w:t>
+            </w:r>
+          </w:p>
+        </w:tc>
+      </w:tr>
     </w:tbl>
     <w:p>
       <w:r>
@@ -3248,7 +3616,7 @@
         <w:pStyle w:val="Compact"/>
         <w:numPr>
           <w:ilvl w:val="0"/>
-          <w:numId w:val="1012"/>
+          <w:numId w:val="1013"/>
         </w:numPr>
       </w:pPr>
       <w:r>
@@ -3273,7 +3641,7 @@
         <w:pStyle w:val="Compact"/>
         <w:numPr>
           <w:ilvl w:val="0"/>
-          <w:numId w:val="1012"/>
+          <w:numId w:val="1013"/>
         </w:numPr>
       </w:pPr>
       <w:r>
@@ -3301,7 +3669,7 @@
         <w:pStyle w:val="Compact"/>
         <w:numPr>
           <w:ilvl w:val="0"/>
-          <w:numId w:val="1012"/>
+          <w:numId w:val="1013"/>
         </w:numPr>
       </w:pPr>
       <w:r>
@@ -3320,7 +3688,7 @@
         <w:pStyle w:val="Compact"/>
         <w:numPr>
           <w:ilvl w:val="0"/>
-          <w:numId w:val="1012"/>
+          <w:numId w:val="1013"/>
         </w:numPr>
       </w:pPr>
       <w:r>
@@ -3714,6 +4082,9 @@
     <w:abstractNumId w:val="991"/>
   </w:num>
   <w:num w:numId="1012">
+    <w:abstractNumId w:val="991"/>
+  </w:num>
+  <w:num w:numId="1013">
     <w:abstractNumId w:val="99411"/>
     <w:lvlOverride w:ilvl="0">
       <w:startOverride w:val="1"/>

</xml_diff>

<commit_message>
RD v2: el pago de AP se cubre con recursos nacionales; afuera se busca lo demás
El Estado dominicano ya paga por el cuidado de personas con discapacidad: la
partida y el mecanismo existen. Lo que se propone no es un pago nuevo sino
otra forma de aplicar el que ya opera — que el apoyo lo preste alguien elegido
y dirigido por la propia persona. El financiamiento externo queda para
capacitación, sistema, asesoría, evaluación y operación.

Co-Authored-By: Claude Opus 5 <noreply@anthropic.com>
</commit_message>
<xml_diff>
--- a/republica-dominicana/propuesta-proyecto-AP/Propuesta-v2-piloto-AP-RD-2027-2030.docx
+++ b/republica-dominicana/propuesta-proyecto-AP/Propuesta-v2-piloto-AP-RD-2027-2030.docx
@@ -2211,7 +2211,7 @@
           <w:b/>
           <w:bCs/>
         </w:rPr>
-        <w:t xml:space="preserve">La mayor parte del presupuesto es el pago de la asistencia personal. [x — tarifa y monto por acordar]</w:t>
+        <w:t xml:space="preserve">El pago de la asistencia personal se cubre con recursos nacionales. Lo que se busca afuera es otra cosa.</w:t>
       </w:r>
     </w:p>
     <w:p>
@@ -2219,23 +2219,93 @@
         <w:pStyle w:val="BodyText"/>
       </w:pPr>
       <w:r>
-        <w:t xml:space="preserve">El criterio de diseño es uno:</w:t>
-      </w:r>
-      <w:r>
-        <w:t xml:space="preserve"> </w:t>
-      </w:r>
-      <w:r>
-        <w:rPr>
-          <w:b/>
-          <w:bCs/>
-        </w:rPr>
-        <w:t xml:space="preserve">que el dinero empiece a circular en el terreno lo antes posible.</w:t>
-      </w:r>
-      <w:r>
-        <w:t xml:space="preserve"> </w:t>
-      </w:r>
-      <w:r>
-        <w:t xml:space="preserve">No esperar a que el sistema nacional esté listo — pagar y echar a andar, y que la experiencia sirva después para que el Estado lo asuma.</w:t>
+        <w:t xml:space="preserve">Esa es la diferencia con un proyecto que hubiera que financiar entero desde fuera, y descansa en un hecho:</w:t>
+      </w:r>
+      <w:r>
+        <w:t xml:space="preserve"> </w:t>
+      </w:r>
+      <w:r>
+        <w:rPr>
+          <w:b/>
+          <w:bCs/>
+        </w:rPr>
+        <w:t xml:space="preserve">en la República Dominicana ya se está pagando por el cuidado de personas con discapacidad.</w:t>
+      </w:r>
+      <w:r>
+        <w:t xml:space="preserve"> </w:t>
+      </w:r>
+      <w:r>
+        <w:t xml:space="preserve">El Estado tiene la partida y el mecanismo para transferir; lo que está por definirse es</w:t>
+      </w:r>
+      <w:r>
+        <w:t xml:space="preserve"> </w:t>
+      </w:r>
+      <w:r>
+        <w:rPr>
+          <w:b/>
+          <w:bCs/>
+        </w:rPr>
+        <w:t xml:space="preserve">a quién se le paga y quién decide</w:t>
+      </w:r>
+      <w:r>
+        <w:t xml:space="preserve">.</w:t>
+      </w:r>
+    </w:p>
+    <w:p>
+      <w:pPr>
+        <w:pStyle w:val="BlockText"/>
+      </w:pPr>
+      <w:r>
+        <w:rPr>
+          <w:b/>
+          <w:bCs/>
+        </w:rPr>
+        <w:t xml:space="preserve">Lo que proponemos no es crear un pago nuevo, sino ensayar otra forma de aplicar el que ya existe:</w:t>
+      </w:r>
+      <w:r>
+        <w:t xml:space="preserve"> </w:t>
+      </w:r>
+      <w:r>
+        <w:t xml:space="preserve">que en un grupo acotado de personas usuarias, el apoyo lo preste alguien</w:t>
+      </w:r>
+      <w:r>
+        <w:t xml:space="preserve"> </w:t>
+      </w:r>
+      <w:r>
+        <w:rPr>
+          <w:b/>
+          <w:bCs/>
+        </w:rPr>
+        <w:t xml:space="preserve">elegido y dirigido por la propia persona con discapacidad</w:t>
+      </w:r>
+      <w:r>
+        <w:t xml:space="preserve">, con las condiciones laborales que corresponden.</w:t>
+      </w:r>
+    </w:p>
+    <w:p>
+      <w:pPr>
+        <w:pStyle w:val="BlockText"/>
+      </w:pPr>
+      <w:r>
+        <w:t xml:space="preserve">No es una petición de más presupuesto. Es una pregunta de diseño.</w:t>
+      </w:r>
+    </w:p>
+    <w:p>
+      <w:pPr>
+        <w:pStyle w:val="FirstParagraph"/>
+      </w:pPr>
+      <w:r>
+        <w:rPr>
+          <w:b/>
+          <w:bCs/>
+        </w:rPr>
+        <w:t xml:space="preserve">Con qué recursos nacionales, exactamente: [x — a definir con las contrapartes].</w:t>
+      </w:r>
+      <w:r>
+        <w:t xml:space="preserve"> </w:t>
+      </w:r>
+      <w:r>
+        <w:t xml:space="preserve">Las vías a explorar son las transferencias que ya operan en el ámbito del cuidado y la discapacidad, y el FONADIS (§11).</w:t>
       </w:r>
     </w:p>
     <w:p>
@@ -2243,70 +2313,11 @@
         <w:pStyle w:val="BodyText"/>
       </w:pPr>
       <w:r>
-        <w:t xml:space="preserve">Es el camino que siguió Morpho: en 2013, antes de la Ley 9379, sostenía la vida independiente de 6 personas usuarias con unos 10 asistentes personales — 919 horas en agosto de ese año, con</w:t>
-      </w:r>
-      <w:r>
-        <w:t xml:space="preserve"> </w:t>
-      </w:r>
-      <w:r>
-        <w:rPr>
-          <w:b/>
-          <w:bCs/>
-        </w:rPr>
-        <w:t xml:space="preserve">22% aportado por el Estado y 78% por el proyecto</w:t>
-      </w:r>
-      <w:r>
-        <w:t xml:space="preserve">. Tras la entrada en vigor de la ley en 2019,</w:t>
-      </w:r>
-      <w:r>
-        <w:t xml:space="preserve"> </w:t>
-      </w:r>
-      <w:r>
-        <w:rPr>
-          <w:b/>
-          <w:bCs/>
-        </w:rPr>
-        <w:t xml:space="preserve">el Estado asumió prácticamente el 100% y la carga del proyecto bajó a cero.</w:t>
-      </w:r>
-    </w:p>
-    <w:p>
-      <w:pPr>
-        <w:pStyle w:val="BodyText"/>
-      </w:pPr>
-      <w:r>
-        <w:rPr>
-          <w:b/>
-          <w:bCs/>
-        </w:rPr>
-        <w:t xml:space="preserve">Para que el centro se sostenga</w:t>
-      </w:r>
-      <w:r>
-        <w:t xml:space="preserve">, hace falta además el planteamiento trabajado con la OIT:</w:t>
-      </w:r>
-      <w:r>
-        <w:t xml:space="preserve"> </w:t>
-      </w:r>
-      <w:r>
-        <w:rPr>
-          <w:b/>
-          <w:bCs/>
-        </w:rPr>
-        <w:t xml:space="preserve">el centro como lugar de trabajo para personas con discapacidad</w:t>
-      </w:r>
-      <w:r>
-        <w:t xml:space="preserve">.</w:t>
-      </w:r>
-    </w:p>
-    <w:p>
-      <w:pPr>
-        <w:pStyle w:val="BodyText"/>
-      </w:pPr>
-      <w:r>
-        <w:rPr>
-          <w:b/>
-          <w:bCs/>
-        </w:rPr>
-        <w:t xml:space="preserve">Partidas</w:t>
+        <w:rPr>
+          <w:b/>
+          <w:bCs/>
+        </w:rPr>
+        <w:t xml:space="preserve">Lo que sí requiere financiamiento externo</w:t>
       </w:r>
     </w:p>
     <w:tbl>
@@ -2352,7 +2363,7 @@
                 <w:b/>
                 <w:bCs/>
               </w:rPr>
-              <w:t xml:space="preserve">Pago de asistencia personal</w:t>
+              <w:t xml:space="preserve">Capacitación en Costa Rica</w:t>
             </w:r>
           </w:p>
         </w:tc>
@@ -2363,7 +2374,7 @@
               <w:pStyle w:val="Compact"/>
             </w:pPr>
             <w:r>
-              <w:t xml:space="preserve">la partida mayoritaria</w:t>
+              <w:t xml:space="preserve">honorarios de Morpho · viajes y estadía de unas 10 personas · consejería de pares · visitas al CONAPDIS</w:t>
             </w:r>
             <w:r>
               <w:t xml:space="preserve"> </w:t>
@@ -2390,7 +2401,7 @@
                 <w:b/>
                 <w:bCs/>
               </w:rPr>
-              <w:t xml:space="preserve">Capacitación en Costa Rica</w:t>
+              <w:t xml:space="preserve">Sistema de coordinación</w:t>
             </w:r>
           </w:p>
         </w:tc>
@@ -2401,17 +2412,17 @@
               <w:pStyle w:val="Compact"/>
             </w:pPr>
             <w:r>
+              <w:t xml:space="preserve">costo de uso</w:t>
+            </w:r>
+            <w:r>
+              <w:t xml:space="preserve"> </w:t>
+            </w:r>
+            <w:r>
               <w:rPr>
                 <w:b/>
                 <w:bCs/>
               </w:rPr>
-              <w:t xml:space="preserve">honorarios de Morpho por la capacitación [x]</w:t>
-            </w:r>
-            <w:r>
-              <w:t xml:space="preserve"> </w:t>
-            </w:r>
-            <w:r>
-              <w:t xml:space="preserve">· viajes y estadía de unas 10 personas · consejería de pares · visitas al CONAPDIS</w:t>
+              <w:t xml:space="preserve">[x]</w:t>
             </w:r>
           </w:p>
         </w:tc>
@@ -2428,7 +2439,7 @@
                 <w:b/>
                 <w:bCs/>
               </w:rPr>
-              <w:t xml:space="preserve">Sistema de coordinación</w:t>
+              <w:t xml:space="preserve">Asesoría en línea de Morpho</w:t>
             </w:r>
           </w:p>
         </w:tc>
@@ -2439,7 +2450,7 @@
               <w:pStyle w:val="Compact"/>
             </w:pPr>
             <w:r>
-              <w:t xml:space="preserve">costo de uso</w:t>
+              <w:t xml:space="preserve">seguimiento periódico</w:t>
             </w:r>
             <w:r>
               <w:t xml:space="preserve"> </w:t>
@@ -2466,7 +2477,7 @@
                 <w:b/>
                 <w:bCs/>
               </w:rPr>
-              <w:t xml:space="preserve">Asesoría en línea de Morpho</w:t>
+              <w:t xml:space="preserve">Visita de evaluación desde Costa Rica (2028)</w:t>
             </w:r>
           </w:p>
         </w:tc>
@@ -2477,7 +2488,7 @@
               <w:pStyle w:val="Compact"/>
             </w:pPr>
             <w:r>
-              <w:t xml:space="preserve">seguimiento periódico</w:t>
+              <w:t xml:space="preserve">viajes y estadía</w:t>
             </w:r>
             <w:r>
               <w:t xml:space="preserve"> </w:t>
@@ -2504,7 +2515,7 @@
                 <w:b/>
                 <w:bCs/>
               </w:rPr>
-              <w:t xml:space="preserve">Visita de evaluación desde Costa Rica (2028)</w:t>
+              <w:t xml:space="preserve">Evaluación, datos y presentación en 2028</w:t>
             </w:r>
           </w:p>
         </w:tc>
@@ -2514,12 +2525,6 @@
             <w:pPr>
               <w:pStyle w:val="Compact"/>
             </w:pPr>
-            <w:r>
-              <w:t xml:space="preserve">viajes y estadía</w:t>
-            </w:r>
-            <w:r>
-              <w:t xml:space="preserve"> </w:t>
-            </w:r>
             <w:r>
               <w:rPr>
                 <w:b/>
@@ -2604,10 +2609,61 @@
       </w:r>
     </w:p>
     <w:p>
-      <w:r>
-        <w:pict>
-          <v:rect style="width:0;height:1.5pt" o:hralign="center" o:hrstd="t" o:hr="t"/>
-        </w:pict>
+      <w:pPr>
+        <w:pStyle w:val="BodyText"/>
+      </w:pPr>
+      <w:r>
+        <w:rPr>
+          <w:b/>
+          <w:bCs/>
+        </w:rPr>
+        <w:t xml:space="preserve">El antecedente costarricense</w:t>
+      </w:r>
+    </w:p>
+    <w:p>
+      <w:pPr>
+        <w:pStyle w:val="BodyText"/>
+      </w:pPr>
+      <w:r>
+        <w:t xml:space="preserve">Morpho empezó al revés, y aun así funcionó: en 2013, antes de la Ley 9379, sostenía la vida independiente de 6 personas usuarias con unos 10 asistentes personales —919 horas en agosto de ese año— con</w:t>
+      </w:r>
+      <w:r>
+        <w:t xml:space="preserve"> </w:t>
+      </w:r>
+      <w:r>
+        <w:rPr>
+          <w:b/>
+          <w:bCs/>
+        </w:rPr>
+        <w:t xml:space="preserve">22% aportado por el Estado y 78% por el proyecto</w:t>
+      </w:r>
+      <w:r>
+        <w:t xml:space="preserve">. Tras la entrada en vigor de la ley en 2019,</w:t>
+      </w:r>
+      <w:r>
+        <w:t xml:space="preserve"> </w:t>
+      </w:r>
+      <w:r>
+        <w:rPr>
+          <w:b/>
+          <w:bCs/>
+        </w:rPr>
+        <w:t xml:space="preserve">el Estado asumió prácticamente el 100%.</w:t>
+      </w:r>
+    </w:p>
+    <w:p>
+      <w:pPr>
+        <w:pStyle w:val="BodyText"/>
+      </w:pPr>
+      <w:r>
+        <w:rPr>
+          <w:b/>
+          <w:bCs/>
+        </w:rPr>
+        <w:t xml:space="preserve">La República Dominicana parte de una posición mejor que aquella</w:t>
+      </w:r>
+      <w:r>
+        <w:t xml:space="preserve">: el pago estatal no hay que construirlo desde cero.</w:t>
       </w:r>
     </w:p>
     <w:bookmarkEnd w:id="22"/>
@@ -2717,10 +2773,13 @@
           <w:b/>
           <w:bCs/>
         </w:rPr>
-        <w:t xml:space="preserve">cuánto de esto puede cubrirse con recursos ya existentes</w:t>
-      </w:r>
-      <w:r>
-        <w:t xml:space="preserve">.</w:t>
+        <w:t xml:space="preserve">qué vía nacional cubre el pago de la asistencia personal</w:t>
+      </w:r>
+      <w:r>
+        <w:t xml:space="preserve"> </w:t>
+      </w:r>
+      <w:r>
+        <w:t xml:space="preserve">(§10) y cómo se financia el resto.</w:t>
       </w:r>
       <w:r>
         <w:t xml:space="preserve"> </w:t>
@@ -2733,7 +2792,7 @@
         <w:t xml:space="preserve">El presupuesto se presenta completo</w:t>
       </w:r>
       <w:r>
-        <w:t xml:space="preserve">, y la proporción se define en esa conversación, no antes.</w:t>
+        <w:t xml:space="preserve">, y la distribución se define en esa conversación, no antes.</w:t>
       </w:r>
     </w:p>
     <w:p>

</xml_diff>

<commit_message>
RD v2: la capacitación JICA-Mainstream como buena práctica reconocida por el ACNUDH (A/HRC/55/34, párr. 55)
Co-Authored-By: Claude Opus 5 <noreply@anthropic.com>
</commit_message>
<xml_diff>
--- a/republica-dominicana/propuesta-proyecto-AP/Propuesta-v2-piloto-AP-RD-2027-2030.docx
+++ b/republica-dominicana/propuesta-proyecto-AP/Propuesta-v2-piloto-AP-RD-2027-2030.docx
@@ -2,7 +2,7 @@
 <file path=word/document.xml><?xml version="1.0" encoding="utf-8"?>
 <w:document xmlns:w="http://schemas.openxmlformats.org/wordprocessingml/2006/main" xmlns:m="http://schemas.openxmlformats.org/officeDocument/2006/math" xmlns:r="http://schemas.openxmlformats.org/officeDocument/2006/relationships" xmlns:o="urn:schemas-microsoft-com:office:office" xmlns:v="urn:schemas-microsoft-com:vml" xmlns:w10="urn:schemas-microsoft-com:office:word" xmlns:a="http://schemas.openxmlformats.org/drawingml/2006/main" xmlns:pic="http://schemas.openxmlformats.org/drawingml/2006/picture" xmlns:wp="http://schemas.openxmlformats.org/drawingml/2006/wordprocessingDrawing">
   <w:body>
-    <w:bookmarkStart w:id="26" w:name="X49d69b69a2f4792f422d0ff754340b711f90e52"/>
+    <w:bookmarkStart w:id="28" w:name="X49d69b69a2f4792f422d0ff754340b711f90e52"/>
     <w:p>
       <w:pPr>
         <w:pStyle w:val="Heading1"/>
@@ -88,7 +88,7 @@
         </w:pict>
       </w:r>
     </w:p>
-    <w:bookmarkStart w:id="13" w:name="Xf34131f22388d6093dd5914cd6a0098b9e28a72"/>
+    <w:bookmarkStart w:id="15" w:name="Xf34131f22388d6093dd5914cd6a0098b9e28a72"/>
     <w:p>
       <w:pPr>
         <w:pStyle w:val="Heading2"/>
@@ -337,6 +337,136 @@
     </w:p>
     <w:p>
       <w:pPr>
+        <w:pStyle w:val="BlockText"/>
+        <w:numPr>
+          <w:ilvl w:val="0"/>
+          <w:numId w:val="1000"/>
+        </w:numPr>
+      </w:pPr>
+      <w:r>
+        <w:t xml:space="preserve">Esa capacitación —la que impulsan la</w:t>
+      </w:r>
+      <w:r>
+        <w:t xml:space="preserve"> </w:t>
+      </w:r>
+      <w:r>
+        <w:rPr>
+          <w:b/>
+          <w:bCs/>
+        </w:rPr>
+        <w:t xml:space="preserve">Asociación Mainstream</w:t>
+      </w:r>
+      <w:r>
+        <w:t xml:space="preserve"> </w:t>
+      </w:r>
+      <w:r>
+        <w:t xml:space="preserve">(centro de vida independiente del Japón) y la</w:t>
+      </w:r>
+      <w:r>
+        <w:t xml:space="preserve"> </w:t>
+      </w:r>
+      <w:r>
+        <w:rPr>
+          <w:b/>
+          <w:bCs/>
+        </w:rPr>
+        <w:t xml:space="preserve">JICA</w:t>
+      </w:r>
+      <w:r>
+        <w:t xml:space="preserve">— está reconocida como</w:t>
+      </w:r>
+      <w:r>
+        <w:t xml:space="preserve"> </w:t>
+      </w:r>
+      <w:r>
+        <w:rPr>
+          <w:b/>
+          <w:bCs/>
+        </w:rPr>
+        <w:t xml:space="preserve">buena práctica por la Oficina del Alto Comisionado de las Naciones Unidas para los Derechos Humanos</w:t>
+      </w:r>
+      <w:r>
+        <w:t xml:space="preserve">, en su informe</w:t>
+      </w:r>
+      <w:r>
+        <w:t xml:space="preserve"> </w:t>
+      </w:r>
+      <w:r>
+        <w:rPr>
+          <w:i/>
+          <w:iCs/>
+        </w:rPr>
+        <w:t xml:space="preserve">Buenas prácticas de los sistemas de apoyo para la inclusión de las personas con discapacidad en la comunidad</w:t>
+      </w:r>
+      <w:r>
+        <w:t xml:space="preserve"> </w:t>
+      </w:r>
+      <w:r>
+        <w:t xml:space="preserve">(</w:t>
+      </w:r>
+      <w:r>
+        <w:rPr>
+          <w:b/>
+          <w:bCs/>
+        </w:rPr>
+        <w:t xml:space="preserve">A/HRC/55/34</w:t>
+      </w:r>
+      <w:r>
+        <w:t xml:space="preserve">, párr. 55): los centros de vida independiente dirigidos por las personas formadas «crean activamente conciencia […] al tiempo que ofrecen capacitación en asistencia personal». (</w:t>
+      </w:r>
+      <w:hyperlink r:id="rId13">
+        <w:r>
+          <w:rPr>
+            <w:rStyle w:val="Hyperlink"/>
+          </w:rPr>
+          <w:t xml:space="preserve">texto en español</w:t>
+        </w:r>
+      </w:hyperlink>
+      <w:r>
+        <w:t xml:space="preserve"> </w:t>
+      </w:r>
+      <w:r>
+        <w:t xml:space="preserve">·</w:t>
+      </w:r>
+      <w:r>
+        <w:t xml:space="preserve"> </w:t>
+      </w:r>
+      <w:hyperlink r:id="rId14">
+        <w:r>
+          <w:rPr>
+            <w:rStyle w:val="Hyperlink"/>
+          </w:rPr>
+          <w:t xml:space="preserve">ficha del ACNUDH</w:t>
+        </w:r>
+      </w:hyperlink>
+      <w:r>
+        <w:t xml:space="preserve">)</w:t>
+      </w:r>
+    </w:p>
+    <w:p>
+      <w:pPr>
+        <w:pStyle w:val="BlockText"/>
+        <w:numPr>
+          <w:ilvl w:val="0"/>
+          <w:numId w:val="1000"/>
+        </w:numPr>
+      </w:pPr>
+      <w:r>
+        <w:t xml:space="preserve">La ruta que propone este proyecto —formarse en un centro de vida independiente y volver a poner en marcha el servicio en el propio país— es exactamente la que el ACNUDH señala.</w:t>
+      </w:r>
+      <w:r>
+        <w:t xml:space="preserve"> </w:t>
+      </w:r>
+      <w:r>
+        <w:rPr>
+          <w:b/>
+          <w:bCs/>
+        </w:rPr>
+        <w:t xml:space="preserve">Costa Rica es el eslabón latinoamericano de esa misma cadena.</w:t>
+      </w:r>
+    </w:p>
+    <w:p>
+      <w:pPr>
         <w:numPr>
           <w:ilvl w:val="0"/>
           <w:numId w:val="1001"/>
@@ -418,8 +548,8 @@
         </w:pict>
       </w:r>
     </w:p>
-    <w:bookmarkEnd w:id="13"/>
-    <w:bookmarkStart w:id="14" w:name="X0e652f04fa4ff486c4b70e217741b0037f5beed"/>
+    <w:bookmarkEnd w:id="15"/>
+    <w:bookmarkStart w:id="16" w:name="X0e652f04fa4ff486c4b70e217741b0037f5beed"/>
     <w:p>
       <w:pPr>
         <w:pStyle w:val="Heading2"/>
@@ -588,8 +718,8 @@
         </w:pict>
       </w:r>
     </w:p>
-    <w:bookmarkEnd w:id="14"/>
-    <w:bookmarkStart w:id="15" w:name="X38b24701393d04290d1a6e1293836c96040893c"/>
+    <w:bookmarkEnd w:id="16"/>
+    <w:bookmarkStart w:id="17" w:name="X38b24701393d04290d1a6e1293836c96040893c"/>
     <w:p>
       <w:pPr>
         <w:pStyle w:val="Heading2"/>
@@ -810,8 +940,8 @@
         </w:pict>
       </w:r>
     </w:p>
-    <w:bookmarkEnd w:id="15"/>
-    <w:bookmarkStart w:id="16" w:name="X7cb408607628cb2420dd10343dd5eaf527b38ff"/>
+    <w:bookmarkEnd w:id="17"/>
+    <w:bookmarkStart w:id="18" w:name="X7cb408607628cb2420dd10343dd5eaf527b38ff"/>
     <w:p>
       <w:pPr>
         <w:pStyle w:val="Heading2"/>
@@ -931,8 +1061,8 @@
         </w:pict>
       </w:r>
     </w:p>
-    <w:bookmarkEnd w:id="16"/>
-    <w:bookmarkStart w:id="17" w:name="X8e2fc4bb390eeda68e22252144d9044bcdfe4e2"/>
+    <w:bookmarkEnd w:id="18"/>
+    <w:bookmarkStart w:id="19" w:name="X8e2fc4bb390eeda68e22252144d9044bcdfe4e2"/>
     <w:p>
       <w:pPr>
         <w:pStyle w:val="Heading2"/>
@@ -1394,8 +1524,8 @@
         </w:pict>
       </w:r>
     </w:p>
-    <w:bookmarkEnd w:id="17"/>
-    <w:bookmarkStart w:id="18" w:name="Xc95e791bdaf904c07c11b681b7057bc02ebf13f"/>
+    <w:bookmarkEnd w:id="19"/>
+    <w:bookmarkStart w:id="20" w:name="Xc95e791bdaf904c07c11b681b7057bc02ebf13f"/>
     <w:p>
       <w:pPr>
         <w:pStyle w:val="Heading2"/>
@@ -1612,8 +1742,8 @@
         </w:pict>
       </w:r>
     </w:p>
-    <w:bookmarkEnd w:id="18"/>
-    <w:bookmarkStart w:id="19" w:name="X36cc086c8b2aab8c110e89926ddf57fb857eff4"/>
+    <w:bookmarkEnd w:id="20"/>
+    <w:bookmarkStart w:id="21" w:name="X36cc086c8b2aab8c110e89926ddf57fb857eff4"/>
     <w:p>
       <w:pPr>
         <w:pStyle w:val="Heading2"/>
@@ -1877,8 +2007,8 @@
         </w:pict>
       </w:r>
     </w:p>
-    <w:bookmarkEnd w:id="19"/>
-    <w:bookmarkStart w:id="20" w:name="X98b4899c1985497138b84a377d48cbecf0a84ee"/>
+    <w:bookmarkEnd w:id="21"/>
+    <w:bookmarkStart w:id="22" w:name="X98b4899c1985497138b84a377d48cbecf0a84ee"/>
     <w:p>
       <w:pPr>
         <w:pStyle w:val="Heading2"/>
@@ -1932,8 +2062,8 @@
         </w:pict>
       </w:r>
     </w:p>
-    <w:bookmarkEnd w:id="20"/>
-    <w:bookmarkStart w:id="21" w:name="Xef732971e381e0846133eb8f2d28db8d757f22c"/>
+    <w:bookmarkEnd w:id="22"/>
+    <w:bookmarkStart w:id="23" w:name="Xef732971e381e0846133eb8f2d28db8d757f22c"/>
     <w:p>
       <w:pPr>
         <w:pStyle w:val="Heading2"/>
@@ -2192,8 +2322,8 @@
         <w:t xml:space="preserve">Costo de uso: [x — por confirmar con Morpho]</w:t>
       </w:r>
     </w:p>
-    <w:bookmarkEnd w:id="21"/>
-    <w:bookmarkStart w:id="22" w:name="Xe9ed06b37cd8a4e7b1e8dfb60083bf04edc4964"/>
+    <w:bookmarkEnd w:id="23"/>
+    <w:bookmarkStart w:id="24" w:name="Xe9ed06b37cd8a4e7b1e8dfb60083bf04edc4964"/>
     <w:p>
       <w:pPr>
         <w:pStyle w:val="Heading2"/>
@@ -2666,8 +2796,8 @@
         <w:t xml:space="preserve">: el pago estatal no hay que construirlo desde cero.</w:t>
       </w:r>
     </w:p>
-    <w:bookmarkEnd w:id="22"/>
-    <w:bookmarkStart w:id="23" w:name="Xe76011752e37cf528c9d59fbd93aa710a8e7fed"/>
+    <w:bookmarkEnd w:id="24"/>
+    <w:bookmarkStart w:id="25" w:name="Xe76011752e37cf528c9d59fbd93aa710a8e7fed"/>
     <w:p>
       <w:pPr>
         <w:pStyle w:val="Heading2"/>
@@ -3368,8 +3498,8 @@
         <w:t xml:space="preserve">CONADIS / FONADIS / Supérate / Ministerio de la Mujer (nacional) · OIT · JICA · CAF · BID · Banco Mundial</w:t>
       </w:r>
     </w:p>
-    <w:bookmarkEnd w:id="23"/>
-    <w:bookmarkStart w:id="24" w:name="X1f1df990115bae087baba3e3a7933e834838422"/>
+    <w:bookmarkEnd w:id="25"/>
+    <w:bookmarkStart w:id="26" w:name="X1f1df990115bae087baba3e3a7933e834838422"/>
     <w:p>
       <w:pPr>
         <w:pStyle w:val="Heading2"/>
@@ -3660,8 +3790,8 @@
         </w:pict>
       </w:r>
     </w:p>
-    <w:bookmarkEnd w:id="24"/>
-    <w:bookmarkStart w:id="25" w:name="X69bc83733ec6dbcf87719dcf1ab89ce6770c9cc"/>
+    <w:bookmarkEnd w:id="26"/>
+    <w:bookmarkStart w:id="27" w:name="X69bc83733ec6dbcf87719dcf1ab89ce6770c9cc"/>
     <w:p>
       <w:pPr>
         <w:pStyle w:val="Heading2"/>
@@ -3777,8 +3907,8 @@
         <w:t xml:space="preserve">Borrador de trabajo de RELAVIN — septiembre de 2026.</w:t>
       </w:r>
     </w:p>
-    <w:bookmarkEnd w:id="25"/>
-    <w:bookmarkEnd w:id="26"/>
+    <w:bookmarkEnd w:id="27"/>
+    <w:bookmarkEnd w:id="28"/>
     <w:sectPr>
       <w:footnotePr>
         <w:numRestart w:val="eachSect"/>

</xml_diff>